<commit_message>
Updated after Tony's comments
Former-commit-id: ca23a3769e88f6c6a14104da61a67e2403d1c09b
</commit_message>
<xml_diff>
--- a/examples/tutorial_communication/tutorial_communication.docx
+++ b/examples/tutorial_communication/tutorial_communication.docx
@@ -340,7 +340,21 @@
           <w:rFonts w:asciiTheme="minorHAnsi" w:hAnsiTheme="minorHAnsi" w:cstheme="minorHAnsi"/>
           <w:lang w:val="en-GB"/>
         </w:rPr>
-        <w:t>Short Online Private Course (SPOC)</w:t>
+        <w:t xml:space="preserve">Short Private </w:t>
+      </w:r>
+      <w:r>
+        <w:rPr>
+          <w:rFonts w:asciiTheme="minorHAnsi" w:hAnsiTheme="minorHAnsi" w:cstheme="minorHAnsi"/>
+          <w:lang w:val="en-GB"/>
+        </w:rPr>
+        <w:t xml:space="preserve">Online </w:t>
+      </w:r>
+      <w:r>
+        <w:rPr>
+          <w:rFonts w:asciiTheme="minorHAnsi" w:hAnsiTheme="minorHAnsi" w:cstheme="minorHAnsi"/>
+          <w:lang w:val="en-GB"/>
+        </w:rPr>
+        <w:t>Course (SPOC)</w:t>
       </w:r>
       <w:r>
         <w:rPr>
@@ -685,6 +699,7 @@
         </w:rPr>
         <w:t xml:space="preserve">spatial </w:t>
       </w:r>
+      <w:proofErr w:type="spellStart"/>
       <w:r>
         <w:rPr>
           <w:rFonts w:asciiTheme="minorHAnsi" w:hAnsiTheme="minorHAnsi" w:cstheme="minorHAnsi"/>
@@ -699,6 +714,7 @@
         </w:rPr>
         <w:t>gridding</w:t>
       </w:r>
+      <w:proofErr w:type="spellEnd"/>
       <w:r>
         <w:rPr>
           <w:rFonts w:asciiTheme="minorHAnsi" w:hAnsiTheme="minorHAnsi" w:cstheme="minorHAnsi"/>
@@ -2803,7 +2819,7 @@
           <w:rFonts w:asciiTheme="minorHAnsi" w:hAnsiTheme="minorHAnsi" w:cstheme="minorHAnsi"/>
           <w:lang w:val="en-GB"/>
         </w:rPr>
-        <w:t xml:space="preserve">on 4 processes each, </w:t>
+        <w:t xml:space="preserve">on 4 processes each </w:t>
       </w:r>
       <w:r>
         <w:rPr>
@@ -2824,7 +2840,21 @@
           <w:rFonts w:asciiTheme="minorHAnsi" w:hAnsiTheme="minorHAnsi" w:cstheme="minorHAnsi"/>
           <w:lang w:val="en-GB"/>
         </w:rPr>
-        <w:t xml:space="preserve"> hour</w:t>
+        <w:t xml:space="preserve"> </w:t>
+      </w:r>
+      <w:r>
+        <w:rPr>
+          <w:rFonts w:asciiTheme="minorHAnsi" w:hAnsiTheme="minorHAnsi" w:cstheme="minorHAnsi"/>
+          <w:lang w:val="en-GB"/>
+        </w:rPr>
+        <w:t xml:space="preserve">model </w:t>
+      </w:r>
+      <w:r>
+        <w:rPr>
+          <w:rFonts w:asciiTheme="minorHAnsi" w:hAnsiTheme="minorHAnsi" w:cstheme="minorHAnsi"/>
+          <w:lang w:val="en-GB"/>
+        </w:rPr>
+        <w:t>hour</w:t>
       </w:r>
       <w:r>
         <w:rPr>
@@ -6954,6 +6984,7 @@
     <w:lsdException w:name="HTML Sample" w:semiHidden="1" w:unhideWhenUsed="1"/>
     <w:lsdException w:name="HTML Typewriter" w:semiHidden="1" w:unhideWhenUsed="1"/>
     <w:lsdException w:name="HTML Variable" w:semiHidden="1" w:unhideWhenUsed="1"/>
+    <w:lsdException w:name="Normal Table" w:semiHidden="1" w:unhideWhenUsed="1"/>
     <w:lsdException w:name="annotation subject" w:semiHidden="1" w:unhideWhenUsed="1"/>
     <w:lsdException w:name="No List" w:semiHidden="1" w:unhideWhenUsed="1"/>
     <w:lsdException w:name="Outline List 1" w:semiHidden="1" w:unhideWhenUsed="1"/>
@@ -7000,8 +7031,10 @@
     <w:lsdException w:name="Table Subtle 2" w:semiHidden="1" w:unhideWhenUsed="1"/>
     <w:lsdException w:name="Table Web 1" w:semiHidden="1" w:unhideWhenUsed="1"/>
     <w:lsdException w:name="Table Web 2" w:semiHidden="1" w:unhideWhenUsed="1"/>
+    <w:lsdException w:name="Table Web 3" w:semiHidden="1" w:unhideWhenUsed="1"/>
     <w:lsdException w:name="Balloon Text" w:semiHidden="1" w:unhideWhenUsed="1"/>
     <w:lsdException w:name="Table Grid" w:uiPriority="39"/>
+    <w:lsdException w:name="Table Theme" w:semiHidden="1" w:unhideWhenUsed="1"/>
     <w:lsdException w:name="Placeholder Text" w:semiHidden="1"/>
     <w:lsdException w:name="No Spacing" w:uiPriority="1" w:qFormat="1"/>
     <w:lsdException w:name="Light Shading" w:uiPriority="60"/>

</xml_diff>

<commit_message>
Adaptation to new compiling and run environment
Former-commit-id: 17e8aa98590f9c914661d29bf6447244456cbf0d
</commit_message>
<xml_diff>
--- a/examples/tutorial_communication/tutorial_communication.docx
+++ b/examples/tutorial_communication/tutorial_communication.docx
@@ -1,6 +1,6 @@
 
 <file path=word/document.xml><?xml version="1.0" encoding="utf-8"?>
-<w:document xmlns:wpc="http://schemas.microsoft.com/office/word/2010/wordprocessingCanvas" xmlns:cx="http://schemas.microsoft.com/office/drawing/2014/chartex" xmlns:cx1="http://schemas.microsoft.com/office/drawing/2015/9/8/chartex" xmlns:cx2="http://schemas.microsoft.com/office/drawing/2015/10/21/chartex" xmlns:cx3="http://schemas.microsoft.com/office/drawing/2016/5/9/chartex" xmlns:cx4="http://schemas.microsoft.com/office/drawing/2016/5/10/chartex" xmlns:cx5="http://schemas.microsoft.com/office/drawing/2016/5/11/chartex" xmlns:cx6="http://schemas.microsoft.com/office/drawing/2016/5/12/chartex" xmlns:cx7="http://schemas.microsoft.com/office/drawing/2016/5/13/chartex" xmlns:cx8="http://schemas.microsoft.com/office/drawing/2016/5/14/chartex" xmlns:mc="http://schemas.openxmlformats.org/markup-compatibility/2006" xmlns:aink="http://schemas.microsoft.com/office/drawing/2016/ink" xmlns:am3d="http://schemas.microsoft.com/office/drawing/2017/model3d" xmlns:o="urn:schemas-microsoft-com:office:office" xmlns:r="http://schemas.openxmlformats.org/officeDocument/2006/relationships" xmlns:m="http://schemas.openxmlformats.org/officeDocument/2006/math" xmlns:v="urn:schemas-microsoft-com:vml" xmlns:wp14="http://schemas.microsoft.com/office/word/2010/wordprocessingDrawing" xmlns:wp="http://schemas.openxmlformats.org/drawingml/2006/wordprocessingDrawing" xmlns:w10="urn:schemas-microsoft-com:office:word" xmlns:w="http://schemas.openxmlformats.org/wordprocessingml/2006/main" xmlns:w14="http://schemas.microsoft.com/office/word/2010/wordml" xmlns:w15="http://schemas.microsoft.com/office/word/2012/wordml" xmlns:w16cex="http://schemas.microsoft.com/office/word/2018/wordml/cex" xmlns:w16cid="http://schemas.microsoft.com/office/word/2016/wordml/cid" xmlns:w16="http://schemas.microsoft.com/office/word/2018/wordml" xmlns:w16sdtdh="http://schemas.microsoft.com/office/word/2020/wordml/sdtdatahash" xmlns:w16se="http://schemas.microsoft.com/office/word/2015/wordml/symex" xmlns:wpg="http://schemas.microsoft.com/office/word/2010/wordprocessingGroup" xmlns:wpi="http://schemas.microsoft.com/office/word/2010/wordprocessingInk" xmlns:wne="http://schemas.microsoft.com/office/word/2006/wordml" xmlns:wps="http://schemas.microsoft.com/office/word/2010/wordprocessingShape" mc:Ignorable="w14 w15 w16se w16cid w16 w16cex w16sdtdh wp14">
+<w:document xmlns:wpc="http://schemas.microsoft.com/office/word/2010/wordprocessingCanvas" xmlns:cx="http://schemas.microsoft.com/office/drawing/2014/chartex" xmlns:cx1="http://schemas.microsoft.com/office/drawing/2015/9/8/chartex" xmlns:cx2="http://schemas.microsoft.com/office/drawing/2015/10/21/chartex" xmlns:cx3="http://schemas.microsoft.com/office/drawing/2016/5/9/chartex" xmlns:cx4="http://schemas.microsoft.com/office/drawing/2016/5/10/chartex" xmlns:cx5="http://schemas.microsoft.com/office/drawing/2016/5/11/chartex" xmlns:cx6="http://schemas.microsoft.com/office/drawing/2016/5/12/chartex" xmlns:cx7="http://schemas.microsoft.com/office/drawing/2016/5/13/chartex" xmlns:cx8="http://schemas.microsoft.com/office/drawing/2016/5/14/chartex" xmlns:mc="http://schemas.openxmlformats.org/markup-compatibility/2006" xmlns:aink="http://schemas.microsoft.com/office/drawing/2016/ink" xmlns:am3d="http://schemas.microsoft.com/office/drawing/2017/model3d" xmlns:o="urn:schemas-microsoft-com:office:office" xmlns:oel="http://schemas.microsoft.com/office/2019/extlst" xmlns:r="http://schemas.openxmlformats.org/officeDocument/2006/relationships" xmlns:m="http://schemas.openxmlformats.org/officeDocument/2006/math" xmlns:v="urn:schemas-microsoft-com:vml" xmlns:wp14="http://schemas.microsoft.com/office/word/2010/wordprocessingDrawing" xmlns:wp="http://schemas.openxmlformats.org/drawingml/2006/wordprocessingDrawing" xmlns:w10="urn:schemas-microsoft-com:office:word" xmlns:w="http://schemas.openxmlformats.org/wordprocessingml/2006/main" xmlns:w14="http://schemas.microsoft.com/office/word/2010/wordml" xmlns:w15="http://schemas.microsoft.com/office/word/2012/wordml" xmlns:w16cex="http://schemas.microsoft.com/office/word/2018/wordml/cex" xmlns:w16cid="http://schemas.microsoft.com/office/word/2016/wordml/cid" xmlns:w16="http://schemas.microsoft.com/office/word/2018/wordml" xmlns:w16sdtdh="http://schemas.microsoft.com/office/word/2020/wordml/sdtdatahash" xmlns:w16se="http://schemas.microsoft.com/office/word/2015/wordml/symex" xmlns:wpg="http://schemas.microsoft.com/office/word/2010/wordprocessingGroup" xmlns:wpi="http://schemas.microsoft.com/office/word/2010/wordprocessingInk" xmlns:wne="http://schemas.microsoft.com/office/word/2006/wordml" xmlns:wps="http://schemas.microsoft.com/office/word/2010/wordprocessingShape" mc:Ignorable="w14 w15 w16se w16cid w16 w16cex w16sdtdh wp14">
   <w:body>
     <w:p>
       <w:pPr>
@@ -96,29 +96,12 @@
         <w:spacing w:before="120" w:beforeAutospacing="0" w:after="0" w:afterAutospacing="0"/>
         <w:jc w:val="center"/>
         <w:rPr>
-          <w:rFonts w:asciiTheme="minorHAnsi" w:hAnsiTheme="minorHAnsi" w:cstheme="minorHAnsi"/>
-          <w:sz w:val="28"/>
-          <w:lang w:val="en-GB"/>
-        </w:rPr>
-      </w:pPr>
-      <w:proofErr w:type="spellStart"/>
-      <w:r>
-        <w:rPr>
-          <w:rFonts w:asciiTheme="minorHAnsi" w:hAnsiTheme="minorHAnsi" w:cstheme="minorHAnsi"/>
-          <w:sz w:val="28"/>
-          <w:lang w:val="en-GB"/>
-        </w:rPr>
-        <w:t>tutorial_communication</w:t>
-      </w:r>
-      <w:proofErr w:type="spellEnd"/>
-      <w:r>
-        <w:rPr>
-          <w:rFonts w:asciiTheme="minorHAnsi" w:hAnsiTheme="minorHAnsi" w:cstheme="minorHAnsi"/>
-          <w:sz w:val="28"/>
-          <w:lang w:val="en-GB"/>
-        </w:rPr>
-        <w:t xml:space="preserve">, </w:t>
-      </w:r>
+          <w:rFonts w:ascii="Times" w:hAnsi="Times"/>
+          <w:sz w:val="22"/>
+          <w:szCs w:val="22"/>
+          <w:lang w:val="en-GB"/>
+        </w:rPr>
+      </w:pPr>
     </w:p>
     <w:p>
       <w:pPr>
@@ -131,13 +114,23 @@
           <w:lang w:val="en-GB"/>
         </w:rPr>
       </w:pPr>
+      <w:proofErr w:type="spellStart"/>
       <w:r>
         <w:rPr>
           <w:rFonts w:asciiTheme="minorHAnsi" w:hAnsiTheme="minorHAnsi" w:cstheme="minorHAnsi"/>
           <w:sz w:val="28"/>
           <w:lang w:val="en-GB"/>
         </w:rPr>
-        <w:t>a tutorial on how to instrument a code with OASIS3-MCT API calls</w:t>
+        <w:t>tutorial_communication</w:t>
+      </w:r>
+      <w:proofErr w:type="spellEnd"/>
+      <w:r>
+        <w:rPr>
+          <w:rFonts w:asciiTheme="minorHAnsi" w:hAnsiTheme="minorHAnsi" w:cstheme="minorHAnsi"/>
+          <w:sz w:val="28"/>
+          <w:lang w:val="en-GB"/>
+        </w:rPr>
+        <w:t xml:space="preserve">, </w:t>
       </w:r>
     </w:p>
     <w:p>
@@ -147,27 +140,50 @@
         <w:jc w:val="center"/>
         <w:rPr>
           <w:rFonts w:asciiTheme="minorHAnsi" w:hAnsiTheme="minorHAnsi" w:cstheme="minorHAnsi"/>
-          <w:lang w:val="en-GB"/>
-        </w:rPr>
-      </w:pPr>
-      <w:r>
-        <w:rPr>
-          <w:rFonts w:asciiTheme="minorHAnsi" w:hAnsiTheme="minorHAnsi" w:cstheme="minorHAnsi"/>
-          <w:lang w:val="en-GB"/>
-        </w:rPr>
-        <w:t>September 2021</w:t>
+          <w:sz w:val="28"/>
+          <w:lang w:val="en-GB"/>
+        </w:rPr>
+      </w:pPr>
+      <w:r>
+        <w:rPr>
+          <w:rFonts w:asciiTheme="minorHAnsi" w:hAnsiTheme="minorHAnsi" w:cstheme="minorHAnsi"/>
+          <w:sz w:val="28"/>
+          <w:lang w:val="en-GB"/>
+        </w:rPr>
+        <w:t>a tutorial on how to instrument a code with OASIS3-MCT API calls</w:t>
       </w:r>
     </w:p>
     <w:p>
       <w:pPr>
         <w:pStyle w:val="NormalWeb"/>
         <w:spacing w:before="120" w:beforeAutospacing="0" w:after="0" w:afterAutospacing="0"/>
-        <w:rPr>
-          <w:rFonts w:asciiTheme="minorHAnsi" w:hAnsiTheme="minorHAnsi" w:cstheme="minorHAnsi"/>
-          <w:u w:val="single"/>
-          <w:lang w:val="en-GB"/>
-        </w:rPr>
-      </w:pPr>
+        <w:jc w:val="center"/>
+        <w:rPr>
+          <w:rFonts w:asciiTheme="minorHAnsi" w:hAnsiTheme="minorHAnsi" w:cstheme="minorHAnsi"/>
+          <w:lang w:val="en-GB"/>
+        </w:rPr>
+      </w:pPr>
+      <w:r>
+        <w:rPr>
+          <w:rFonts w:asciiTheme="minorHAnsi" w:hAnsiTheme="minorHAnsi" w:cstheme="minorHAnsi"/>
+          <w:lang w:val="en-GB"/>
+        </w:rPr>
+        <w:t>August</w:t>
+      </w:r>
+      <w:r>
+        <w:rPr>
+          <w:rFonts w:asciiTheme="minorHAnsi" w:hAnsiTheme="minorHAnsi" w:cstheme="minorHAnsi"/>
+          <w:lang w:val="en-GB"/>
+        </w:rPr>
+        <w:t xml:space="preserve"> 202</w:t>
+      </w:r>
+      <w:r>
+        <w:rPr>
+          <w:rFonts w:asciiTheme="minorHAnsi" w:hAnsiTheme="minorHAnsi" w:cstheme="minorHAnsi"/>
+          <w:lang w:val="en-GB"/>
+        </w:rPr>
+        <w:t>3</w:t>
+      </w:r>
     </w:p>
     <w:p>
       <w:pPr>
@@ -179,14 +195,6 @@
           <w:lang w:val="en-GB"/>
         </w:rPr>
       </w:pPr>
-      <w:r>
-        <w:rPr>
-          <w:rFonts w:asciiTheme="minorHAnsi" w:hAnsiTheme="minorHAnsi" w:cstheme="minorHAnsi"/>
-          <w:u w:val="single"/>
-          <w:lang w:val="en-GB"/>
-        </w:rPr>
-        <w:t>Introduction</w:t>
-      </w:r>
     </w:p>
     <w:p>
       <w:pPr>
@@ -194,15 +202,73 @@
         <w:spacing w:before="120" w:beforeAutospacing="0" w:after="0" w:afterAutospacing="0"/>
         <w:rPr>
           <w:rFonts w:asciiTheme="minorHAnsi" w:hAnsiTheme="minorHAnsi" w:cstheme="minorHAnsi"/>
-          <w:lang w:val="en-GB"/>
-        </w:rPr>
-      </w:pPr>
-      <w:r>
-        <w:rPr>
-          <w:rFonts w:asciiTheme="minorHAnsi" w:hAnsiTheme="minorHAnsi" w:cstheme="minorHAnsi"/>
-          <w:lang w:val="en-GB"/>
-        </w:rPr>
-        <w:t xml:space="preserve">This directory contains the files of a tutorial to learn how to instrument a code with calls to the OASIS3-MCT library so to couple it with other components. </w:t>
+          <w:u w:val="single"/>
+          <w:lang w:val="en-GB"/>
+        </w:rPr>
+      </w:pPr>
+    </w:p>
+    <w:p>
+      <w:pPr>
+        <w:pStyle w:val="NormalWeb"/>
+        <w:spacing w:before="120" w:beforeAutospacing="0" w:after="0" w:afterAutospacing="0"/>
+        <w:rPr>
+          <w:rFonts w:asciiTheme="minorHAnsi" w:hAnsiTheme="minorHAnsi" w:cstheme="minorHAnsi"/>
+          <w:u w:val="single"/>
+          <w:lang w:val="en-GB"/>
+        </w:rPr>
+      </w:pPr>
+      <w:r>
+        <w:rPr>
+          <w:rFonts w:asciiTheme="minorHAnsi" w:hAnsiTheme="minorHAnsi" w:cstheme="minorHAnsi"/>
+          <w:u w:val="single"/>
+          <w:lang w:val="en-GB"/>
+        </w:rPr>
+        <w:t>Introduction</w:t>
+      </w:r>
+    </w:p>
+    <w:p>
+      <w:pPr>
+        <w:pStyle w:val="NormalWeb"/>
+        <w:spacing w:before="120" w:beforeAutospacing="0" w:after="0" w:afterAutospacing="0"/>
+        <w:rPr>
+          <w:rFonts w:asciiTheme="minorHAnsi" w:hAnsiTheme="minorHAnsi" w:cstheme="minorHAnsi"/>
+          <w:lang w:val="en-GB"/>
+        </w:rPr>
+      </w:pPr>
+      <w:r>
+        <w:rPr>
+          <w:rFonts w:asciiTheme="minorHAnsi" w:hAnsiTheme="minorHAnsi" w:cstheme="minorHAnsi"/>
+          <w:lang w:val="en-GB"/>
+        </w:rPr>
+        <w:t xml:space="preserve">This directory contains the files of a tutorial </w:t>
+      </w:r>
+      <w:r>
+        <w:rPr>
+          <w:rFonts w:asciiTheme="minorHAnsi" w:hAnsiTheme="minorHAnsi" w:cstheme="minorHAnsi"/>
+          <w:lang w:val="en-GB"/>
+        </w:rPr>
+        <w:t>on</w:t>
+      </w:r>
+      <w:r>
+        <w:rPr>
+          <w:rFonts w:asciiTheme="minorHAnsi" w:hAnsiTheme="minorHAnsi" w:cstheme="minorHAnsi"/>
+          <w:lang w:val="en-GB"/>
+        </w:rPr>
+        <w:t xml:space="preserve"> how to instrument a code with calls to the OASIS3-MCT library </w:t>
+      </w:r>
+      <w:r>
+        <w:rPr>
+          <w:rFonts w:asciiTheme="minorHAnsi" w:hAnsiTheme="minorHAnsi" w:cstheme="minorHAnsi"/>
+          <w:lang w:val="en-GB"/>
+        </w:rPr>
+        <w:t>in order</w:t>
+      </w:r>
+      <w:r>
+        <w:rPr>
+          <w:rFonts w:asciiTheme="minorHAnsi" w:hAnsiTheme="minorHAnsi" w:cstheme="minorHAnsi"/>
+          <w:lang w:val="en-GB"/>
+        </w:rPr>
+        <w:t xml:space="preserve"> to couple it with other components. </w:t>
       </w:r>
       <w:r>
         <w:rPr>
@@ -253,21 +319,84 @@
           <w:rFonts w:asciiTheme="minorHAnsi" w:hAnsiTheme="minorHAnsi" w:cstheme="minorHAnsi"/>
           <w:lang w:val="en-GB"/>
         </w:rPr>
-        <w:t xml:space="preserve"> into which </w:t>
-      </w:r>
-      <w:r>
-        <w:rPr>
-          <w:rFonts w:asciiTheme="minorHAnsi" w:hAnsiTheme="minorHAnsi" w:cstheme="minorHAnsi"/>
-          <w:lang w:val="en-GB"/>
-        </w:rPr>
-        <w:t>you are</w:t>
-      </w:r>
-      <w:r>
-        <w:rPr>
-          <w:rFonts w:asciiTheme="minorHAnsi" w:hAnsiTheme="minorHAnsi" w:cstheme="minorHAnsi"/>
-          <w:lang w:val="en-GB"/>
-        </w:rPr>
-        <w:t xml:space="preserve"> invited to implement the calls to OASIS3-MCT </w:t>
+        <w:t xml:space="preserve"> which </w:t>
+      </w:r>
+      <w:r>
+        <w:rPr>
+          <w:rFonts w:asciiTheme="minorHAnsi" w:hAnsiTheme="minorHAnsi" w:cstheme="minorHAnsi"/>
+          <w:lang w:val="en-GB"/>
+        </w:rPr>
+        <w:t xml:space="preserve">give </w:t>
+      </w:r>
+      <w:r>
+        <w:rPr>
+          <w:rFonts w:asciiTheme="minorHAnsi" w:hAnsiTheme="minorHAnsi" w:cstheme="minorHAnsi"/>
+          <w:lang w:val="en-GB"/>
+        </w:rPr>
+        <w:t xml:space="preserve">you </w:t>
+      </w:r>
+      <w:r>
+        <w:rPr>
+          <w:rFonts w:asciiTheme="minorHAnsi" w:hAnsiTheme="minorHAnsi" w:cstheme="minorHAnsi"/>
+          <w:lang w:val="en-GB"/>
+        </w:rPr>
+        <w:t xml:space="preserve">a practical </w:t>
+      </w:r>
+      <w:r>
+        <w:rPr>
+          <w:rFonts w:asciiTheme="minorHAnsi" w:hAnsiTheme="minorHAnsi" w:cstheme="minorHAnsi"/>
+          <w:lang w:val="en-GB"/>
+        </w:rPr>
+        <w:t>example</w:t>
+      </w:r>
+      <w:r>
+        <w:rPr>
+          <w:rFonts w:asciiTheme="minorHAnsi" w:hAnsiTheme="minorHAnsi" w:cstheme="minorHAnsi"/>
+          <w:lang w:val="en-GB"/>
+        </w:rPr>
+        <w:t xml:space="preserve"> o</w:t>
+      </w:r>
+      <w:r>
+        <w:rPr>
+          <w:rFonts w:asciiTheme="minorHAnsi" w:hAnsiTheme="minorHAnsi" w:cstheme="minorHAnsi"/>
+          <w:lang w:val="en-GB"/>
+        </w:rPr>
+        <w:t>n the</w:t>
+      </w:r>
+      <w:r>
+        <w:rPr>
+          <w:rFonts w:asciiTheme="minorHAnsi" w:hAnsiTheme="minorHAnsi" w:cstheme="minorHAnsi"/>
+          <w:lang w:val="en-GB"/>
+        </w:rPr>
+        <w:t xml:space="preserve"> us</w:t>
+      </w:r>
+      <w:r>
+        <w:rPr>
+          <w:rFonts w:asciiTheme="minorHAnsi" w:hAnsiTheme="minorHAnsi" w:cstheme="minorHAnsi"/>
+          <w:lang w:val="en-GB"/>
+        </w:rPr>
+        <w:t>e</w:t>
+      </w:r>
+      <w:r>
+        <w:rPr>
+          <w:rFonts w:asciiTheme="minorHAnsi" w:hAnsiTheme="minorHAnsi" w:cstheme="minorHAnsi"/>
+          <w:lang w:val="en-GB"/>
+        </w:rPr>
+        <w:t xml:space="preserve"> </w:t>
+      </w:r>
+      <w:r>
+        <w:rPr>
+          <w:rFonts w:asciiTheme="minorHAnsi" w:hAnsiTheme="minorHAnsi" w:cstheme="minorHAnsi"/>
+          <w:lang w:val="en-GB"/>
+        </w:rPr>
+        <w:t xml:space="preserve">of </w:t>
+      </w:r>
+      <w:r>
+        <w:rPr>
+          <w:rFonts w:asciiTheme="minorHAnsi" w:hAnsiTheme="minorHAnsi" w:cstheme="minorHAnsi"/>
+          <w:lang w:val="en-GB"/>
+        </w:rPr>
+        <w:t xml:space="preserve">the OASIS3-MCT </w:t>
       </w:r>
       <w:r>
         <w:rPr>
@@ -281,21 +410,14 @@
           <w:rFonts w:asciiTheme="minorHAnsi" w:hAnsiTheme="minorHAnsi" w:cstheme="minorHAnsi"/>
           <w:lang w:val="en-GB"/>
         </w:rPr>
-        <w:t>routines. Toy models are skeleton programs that do not contain any real physics or dynamics but that can reproduce real exchanges of coupling fields. Instrumenting those toy models</w:t>
-      </w:r>
-      <w:r>
-        <w:rPr>
-          <w:rFonts w:asciiTheme="minorHAnsi" w:hAnsiTheme="minorHAnsi" w:cstheme="minorHAnsi"/>
-          <w:lang w:val="en-GB"/>
-        </w:rPr>
-        <w:t xml:space="preserve"> </w:t>
-      </w:r>
-      <w:r>
-        <w:rPr>
-          <w:rFonts w:asciiTheme="minorHAnsi" w:hAnsiTheme="minorHAnsi" w:cstheme="minorHAnsi"/>
-          <w:lang w:val="en-GB"/>
-        </w:rPr>
-        <w:t>gives a practical experience of using the OASIS3-MCT library.</w:t>
+        <w:t>routines</w:t>
+      </w:r>
+      <w:r>
+        <w:rPr>
+          <w:rFonts w:asciiTheme="minorHAnsi" w:hAnsiTheme="minorHAnsi" w:cstheme="minorHAnsi"/>
+          <w:lang w:val="en-GB"/>
+        </w:rPr>
+        <w:t>. Toy models are skeleton programs that do not contain any real physics or dynamics but that can reproduce real exchanges of coupling fields.</w:t>
       </w:r>
     </w:p>
     <w:p>
@@ -790,7 +912,8 @@
           <w:u w:val="single"/>
           <w:lang w:val="en-GB"/>
         </w:rPr>
-        <w:t>The toy coupled model</w:t>
+        <w:lastRenderedPageBreak/>
+        <w:t xml:space="preserve">The </w:t>
       </w:r>
       <w:r>
         <w:rPr>
@@ -798,7 +921,41 @@
           <w:u w:val="single"/>
           <w:lang w:val="en-GB"/>
         </w:rPr>
-        <w:t xml:space="preserve"> to implement</w:t>
+        <w:t xml:space="preserve">coupling exchanges implemented in </w:t>
+      </w:r>
+      <w:proofErr w:type="spellStart"/>
+      <w:r>
+        <w:rPr>
+          <w:rFonts w:asciiTheme="minorHAnsi" w:hAnsiTheme="minorHAnsi" w:cstheme="minorHAnsi"/>
+          <w:u w:val="single"/>
+          <w:lang w:val="en-GB"/>
+        </w:rPr>
+        <w:t>tutorial_communication</w:t>
+      </w:r>
+      <w:proofErr w:type="spellEnd"/>
+      <w:r>
+        <w:rPr>
+          <w:rFonts w:asciiTheme="minorHAnsi" w:hAnsiTheme="minorHAnsi" w:cstheme="minorHAnsi"/>
+          <w:u w:val="single"/>
+          <w:lang w:val="en-GB"/>
+        </w:rPr>
+        <w:t xml:space="preserve"> </w:t>
+      </w:r>
+      <w:r>
+        <w:rPr>
+          <w:rFonts w:asciiTheme="minorHAnsi" w:hAnsiTheme="minorHAnsi" w:cstheme="minorHAnsi"/>
+          <w:u w:val="single"/>
+          <w:lang w:val="en-GB"/>
+        </w:rPr>
+        <w:t>coupled model</w:t>
+      </w:r>
+      <w:r>
+        <w:rPr>
+          <w:rFonts w:asciiTheme="minorHAnsi" w:hAnsiTheme="minorHAnsi" w:cstheme="minorHAnsi"/>
+          <w:u w:val="single"/>
+          <w:lang w:val="en-GB"/>
+        </w:rPr>
+        <w:t xml:space="preserve"> </w:t>
       </w:r>
     </w:p>
     <w:p>
@@ -815,7 +972,6 @@
           <w:rFonts w:asciiTheme="minorHAnsi" w:hAnsiTheme="minorHAnsi" w:cstheme="minorHAnsi"/>
           <w:lang w:val="en-GB"/>
         </w:rPr>
-        <w:lastRenderedPageBreak/>
         <w:t>T</w:t>
       </w:r>
       <w:r>
@@ -823,56 +979,28 @@
           <w:rFonts w:asciiTheme="minorHAnsi" w:hAnsiTheme="minorHAnsi" w:cstheme="minorHAnsi"/>
           <w:lang w:val="en-GB"/>
         </w:rPr>
-        <w:t xml:space="preserve">he objective </w:t>
-      </w:r>
-      <w:r>
-        <w:rPr>
-          <w:rFonts w:asciiTheme="minorHAnsi" w:hAnsiTheme="minorHAnsi" w:cstheme="minorHAnsi"/>
-          <w:lang w:val="en-GB"/>
-        </w:rPr>
-        <w:t xml:space="preserve">of the tutorial </w:t>
-      </w:r>
-      <w:r>
-        <w:rPr>
-          <w:rFonts w:asciiTheme="minorHAnsi" w:hAnsiTheme="minorHAnsi" w:cstheme="minorHAnsi"/>
-          <w:lang w:val="en-GB"/>
-        </w:rPr>
-        <w:t>is</w:t>
-      </w:r>
-      <w:r>
-        <w:rPr>
-          <w:rFonts w:asciiTheme="minorHAnsi" w:hAnsiTheme="minorHAnsi" w:cstheme="minorHAnsi"/>
-          <w:lang w:val="en-GB"/>
-        </w:rPr>
-        <w:t xml:space="preserve"> to instrument the</w:t>
-      </w:r>
-      <w:r>
-        <w:rPr>
-          <w:rFonts w:asciiTheme="minorHAnsi" w:hAnsiTheme="minorHAnsi" w:cstheme="minorHAnsi"/>
-          <w:lang w:val="en-GB"/>
-        </w:rPr>
-        <w:t xml:space="preserve"> </w:t>
-      </w:r>
-      <w:r>
-        <w:rPr>
-          <w:rFonts w:asciiTheme="minorHAnsi" w:hAnsiTheme="minorHAnsi" w:cstheme="minorHAnsi"/>
-          <w:lang w:val="en-GB"/>
-        </w:rPr>
-        <w:t>codes</w:t>
-      </w:r>
-      <w:r>
-        <w:rPr>
-          <w:rFonts w:asciiTheme="minorHAnsi" w:hAnsiTheme="minorHAnsi" w:cstheme="minorHAnsi"/>
-          <w:lang w:val="en-GB"/>
-        </w:rPr>
-        <w:t xml:space="preserve"> of</w:t>
-      </w:r>
-      <w:r>
-        <w:rPr>
-          <w:rFonts w:asciiTheme="minorHAnsi" w:hAnsiTheme="minorHAnsi" w:cstheme="minorHAnsi"/>
-          <w:lang w:val="en-GB"/>
-        </w:rPr>
-        <w:t xml:space="preserve"> </w:t>
+        <w:t xml:space="preserve">he </w:t>
+      </w:r>
+      <w:r>
+        <w:rPr>
+          <w:rFonts w:asciiTheme="minorHAnsi" w:hAnsiTheme="minorHAnsi" w:cstheme="minorHAnsi"/>
+          <w:lang w:val="en-GB"/>
+        </w:rPr>
+        <w:t xml:space="preserve">tutorial </w:t>
+      </w:r>
+      <w:r>
+        <w:rPr>
+          <w:rFonts w:asciiTheme="minorHAnsi" w:hAnsiTheme="minorHAnsi" w:cstheme="minorHAnsi"/>
+          <w:lang w:val="en-GB"/>
+        </w:rPr>
+        <w:t xml:space="preserve">implement </w:t>
+      </w:r>
+      <w:r>
+        <w:rPr>
+          <w:rFonts w:asciiTheme="minorHAnsi" w:hAnsiTheme="minorHAnsi" w:cstheme="minorHAnsi"/>
+          <w:lang w:val="en-GB"/>
+        </w:rPr>
+        <w:t xml:space="preserve">basic coupling exchanges between </w:t>
       </w:r>
       <w:r>
         <w:rPr>
@@ -886,7 +1014,7 @@
           <w:rFonts w:asciiTheme="minorHAnsi" w:hAnsiTheme="minorHAnsi" w:cstheme="minorHAnsi"/>
           <w:lang w:val="en-GB"/>
         </w:rPr>
-        <w:t>toy models provided (</w:t>
+        <w:t xml:space="preserve">toy models </w:t>
       </w:r>
       <w:proofErr w:type="gramStart"/>
       <w:r>
@@ -923,48 +1051,6 @@
           <w:rFonts w:asciiTheme="minorHAnsi" w:hAnsiTheme="minorHAnsi" w:cstheme="minorHAnsi"/>
           <w:lang w:val="en-GB"/>
         </w:rPr>
-        <w:t xml:space="preserve">) to </w:t>
-      </w:r>
-      <w:r>
-        <w:rPr>
-          <w:rFonts w:asciiTheme="minorHAnsi" w:hAnsiTheme="minorHAnsi" w:cstheme="minorHAnsi"/>
-          <w:lang w:val="en-GB"/>
-        </w:rPr>
-        <w:t>implement</w:t>
-      </w:r>
-      <w:r>
-        <w:rPr>
-          <w:rFonts w:asciiTheme="minorHAnsi" w:hAnsiTheme="minorHAnsi" w:cstheme="minorHAnsi"/>
-          <w:lang w:val="en-GB"/>
-        </w:rPr>
-        <w:t xml:space="preserve"> </w:t>
-      </w:r>
-      <w:r>
-        <w:rPr>
-          <w:rFonts w:asciiTheme="minorHAnsi" w:hAnsiTheme="minorHAnsi" w:cstheme="minorHAnsi"/>
-          <w:lang w:val="en-GB"/>
-        </w:rPr>
-        <w:t>basic</w:t>
-      </w:r>
-      <w:r>
-        <w:rPr>
-          <w:rFonts w:asciiTheme="minorHAnsi" w:hAnsiTheme="minorHAnsi" w:cstheme="minorHAnsi"/>
-          <w:lang w:val="en-GB"/>
-        </w:rPr>
-        <w:t xml:space="preserve"> coupling exchanges</w:t>
-      </w:r>
-      <w:r>
-        <w:rPr>
-          <w:rFonts w:asciiTheme="minorHAnsi" w:hAnsiTheme="minorHAnsi" w:cstheme="minorHAnsi"/>
-          <w:lang w:val="en-GB"/>
-        </w:rPr>
-        <w:t xml:space="preserve"> between those toy models</w:t>
-      </w:r>
-      <w:r>
-        <w:rPr>
-          <w:rFonts w:asciiTheme="minorHAnsi" w:hAnsiTheme="minorHAnsi" w:cstheme="minorHAnsi"/>
-          <w:lang w:val="en-GB"/>
-        </w:rPr>
         <w:t xml:space="preserve">. </w:t>
       </w:r>
       <w:r>
@@ -1002,21 +1088,7 @@
           <w:rFonts w:asciiTheme="minorHAnsi" w:hAnsiTheme="minorHAnsi" w:cstheme="minorHAnsi"/>
           <w:lang w:val="en-GB"/>
         </w:rPr>
-        <w:t xml:space="preserve"> run for 4 hours (14400 seconds)</w:t>
-      </w:r>
-      <w:r>
-        <w:rPr>
-          <w:rFonts w:asciiTheme="minorHAnsi" w:hAnsiTheme="minorHAnsi" w:cstheme="minorHAnsi"/>
-          <w:lang w:val="en-GB"/>
-        </w:rPr>
-        <w:t xml:space="preserve"> without exchanging any coupling field</w:t>
-      </w:r>
-      <w:r>
-        <w:rPr>
-          <w:rFonts w:asciiTheme="minorHAnsi" w:hAnsiTheme="minorHAnsi" w:cstheme="minorHAnsi"/>
-          <w:lang w:val="en-GB"/>
-        </w:rPr>
-        <w:t xml:space="preserve">; </w:t>
+        <w:t xml:space="preserve"> run for 4 hours (14400 seconds); </w:t>
       </w:r>
       <w:r>
         <w:rPr>
@@ -1098,7 +1170,21 @@
           <w:rFonts w:asciiTheme="minorHAnsi" w:hAnsiTheme="minorHAnsi" w:cstheme="minorHAnsi"/>
           <w:lang w:val="en-GB"/>
         </w:rPr>
-        <w:t xml:space="preserve"> is parallel so each ocean process </w:t>
+        <w:t xml:space="preserve"> </w:t>
+      </w:r>
+      <w:r>
+        <w:rPr>
+          <w:rFonts w:asciiTheme="minorHAnsi" w:hAnsiTheme="minorHAnsi" w:cstheme="minorHAnsi"/>
+          <w:lang w:val="en-GB"/>
+        </w:rPr>
+        <w:t xml:space="preserve">can be </w:t>
+      </w:r>
+      <w:r>
+        <w:rPr>
+          <w:rFonts w:asciiTheme="minorHAnsi" w:hAnsiTheme="minorHAnsi" w:cstheme="minorHAnsi"/>
+          <w:lang w:val="en-GB"/>
+        </w:rPr>
+        <w:t xml:space="preserve">parallel so each ocean process </w:t>
       </w:r>
       <w:r>
         <w:rPr>
@@ -1177,7 +1263,21 @@
           <w:rFonts w:asciiTheme="minorHAnsi" w:hAnsiTheme="minorHAnsi" w:cstheme="minorHAnsi"/>
           <w:lang w:val="en-GB"/>
         </w:rPr>
-        <w:t xml:space="preserve"> coupling field to send and </w:t>
+        <w:t xml:space="preserve"> coupling field to send</w:t>
+      </w:r>
+      <w:r>
+        <w:rPr>
+          <w:rFonts w:asciiTheme="minorHAnsi" w:hAnsiTheme="minorHAnsi" w:cstheme="minorHAnsi"/>
+          <w:lang w:val="en-GB"/>
+        </w:rPr>
+        <w:t>,</w:t>
+      </w:r>
+      <w:r>
+        <w:rPr>
+          <w:rFonts w:asciiTheme="minorHAnsi" w:hAnsiTheme="minorHAnsi" w:cstheme="minorHAnsi"/>
+          <w:lang w:val="en-GB"/>
+        </w:rPr>
+        <w:t xml:space="preserve"> and </w:t>
       </w:r>
       <w:proofErr w:type="spellStart"/>
       <w:r>
@@ -1195,6 +1295,13 @@
         <w:t>_ocean</w:t>
       </w:r>
       <w:proofErr w:type="spellEnd"/>
+      <w:r>
+        <w:rPr>
+          <w:rFonts w:ascii="Courier New" w:eastAsiaTheme="minorHAnsi" w:hAnsi="Courier New" w:cs="Courier New"/>
+          <w:lang w:val="en-GB"/>
+        </w:rPr>
+        <w:t>,</w:t>
+      </w:r>
       <w:r>
         <w:rPr>
           <w:rFonts w:asciiTheme="minorHAnsi" w:hAnsiTheme="minorHAnsi" w:cstheme="minorHAnsi"/>
@@ -1921,7 +2028,21 @@
           <w:rFonts w:asciiTheme="minorHAnsi" w:hAnsiTheme="minorHAnsi" w:cstheme="minorHAnsi"/>
           <w:lang w:val="en-GB"/>
         </w:rPr>
-        <w:t xml:space="preserve">The coupling exchanges to implement are illustrated here. The </w:t>
+        <w:t>The coupling exchanges implement</w:t>
+      </w:r>
+      <w:r>
+        <w:rPr>
+          <w:rFonts w:asciiTheme="minorHAnsi" w:hAnsiTheme="minorHAnsi" w:cstheme="minorHAnsi"/>
+          <w:lang w:val="en-GB"/>
+        </w:rPr>
+        <w:t>ed</w:t>
+      </w:r>
+      <w:r>
+        <w:rPr>
+          <w:rFonts w:asciiTheme="minorHAnsi" w:hAnsiTheme="minorHAnsi" w:cstheme="minorHAnsi"/>
+          <w:lang w:val="en-GB"/>
+        </w:rPr>
+        <w:t xml:space="preserve"> are illustrated here. The </w:t>
       </w:r>
       <w:r>
         <w:rPr>
@@ -2278,35 +2399,7 @@
           <w:u w:val="single"/>
           <w:lang w:val="en-GB"/>
         </w:rPr>
-        <w:t xml:space="preserve">Compiling and running </w:t>
-      </w:r>
-      <w:r>
-        <w:rPr>
-          <w:u w:val="single"/>
-          <w:lang w:val="en-GB"/>
-        </w:rPr>
-        <w:t>“</w:t>
-      </w:r>
-      <w:r>
-        <w:rPr>
-          <w:u w:val="single"/>
-          <w:lang w:val="en-GB"/>
-        </w:rPr>
-        <w:t>empty</w:t>
-      </w:r>
-      <w:r>
-        <w:rPr>
-          <w:u w:val="single"/>
-          <w:lang w:val="en-GB"/>
-        </w:rPr>
-        <w:t>”</w:t>
-      </w:r>
-      <w:r>
-        <w:rPr>
-          <w:u w:val="single"/>
-          <w:lang w:val="en-GB"/>
-        </w:rPr>
-        <w:t xml:space="preserve"> tutorial toy model</w:t>
+        <w:t>Compiling and running tutorial toy model</w:t>
       </w:r>
       <w:r>
         <w:rPr>
@@ -2318,1063 +2411,1229 @@
     </w:p>
     <w:p>
       <w:pPr>
+        <w:spacing w:before="120"/>
+        <w:jc w:val="both"/>
+        <w:rPr>
+          <w:lang w:val="en-GB"/>
+        </w:rPr>
+      </w:pPr>
+      <w:r>
+        <w:rPr>
+          <w:lang w:val="en-GB"/>
+        </w:rPr>
+        <w:t xml:space="preserve">Following the rules of OASIS3-MCT compiling </w:t>
+      </w:r>
+      <w:r>
+        <w:rPr>
+          <w:lang w:val="en-GB"/>
+        </w:rPr>
+        <w:t xml:space="preserve">and run </w:t>
+      </w:r>
+      <w:r>
+        <w:rPr>
+          <w:lang w:val="en-GB"/>
+        </w:rPr>
+        <w:t>environment effective since December 2022,</w:t>
+      </w:r>
+      <w:r>
+        <w:rPr>
+          <w:lang w:val="en-GB"/>
+        </w:rPr>
+        <w:t xml:space="preserve"> </w:t>
+      </w:r>
+      <w:r>
+        <w:rPr>
+          <w:lang w:val="en-GB"/>
+        </w:rPr>
+        <w:t>two environment variables</w:t>
+      </w:r>
+      <w:r>
+        <w:rPr>
+          <w:lang w:val="en-US"/>
+        </w:rPr>
+        <w:t xml:space="preserve"> </w:t>
+      </w:r>
+      <w:r>
+        <w:rPr>
+          <w:rFonts w:ascii="Courier New" w:hAnsi="Courier New" w:cs="Courier New"/>
+          <w:lang w:val="en-GB"/>
+        </w:rPr>
+        <w:t>$OASIS_COUPLE</w:t>
+      </w:r>
+      <w:r>
+        <w:rPr>
+          <w:lang w:val="en-GB"/>
+        </w:rPr>
+        <w:t xml:space="preserve"> and </w:t>
+      </w:r>
+      <w:r>
+        <w:rPr>
+          <w:rFonts w:ascii="Courier New" w:hAnsi="Courier New" w:cs="Courier New"/>
+          <w:lang w:val="en-GB"/>
+        </w:rPr>
+        <w:t>$OASIS_ENV</w:t>
+      </w:r>
+      <w:r>
+        <w:rPr>
+          <w:lang w:val="en-GB"/>
+        </w:rPr>
+        <w:t xml:space="preserve"> </w:t>
+      </w:r>
+      <w:r>
+        <w:rPr>
+          <w:lang w:val="en-GB"/>
+        </w:rPr>
+        <w:t xml:space="preserve">must be defined. </w:t>
+      </w:r>
+      <w:r>
+        <w:rPr>
+          <w:rFonts w:ascii="Courier New" w:hAnsi="Courier New" w:cs="Courier New"/>
+          <w:lang w:val="en-GB"/>
+        </w:rPr>
+        <w:t>$OASIS_COUPLE</w:t>
+      </w:r>
+      <w:r>
+        <w:rPr>
+          <w:lang w:val="en-GB"/>
+        </w:rPr>
+        <w:t xml:space="preserve"> gives the path</w:t>
+      </w:r>
+      <w:r>
+        <w:rPr>
+          <w:lang w:val="en-GB"/>
+        </w:rPr>
+        <w:t xml:space="preserve"> of the sources of the coupler (/</w:t>
+      </w:r>
+      <w:r>
+        <w:rPr>
+          <w:rFonts w:ascii="Courier New" w:hAnsi="Courier New" w:cs="Courier New"/>
+          <w:lang w:val="en-GB"/>
+        </w:rPr>
+        <w:t>lib, /util, /examples</w:t>
+      </w:r>
+      <w:r>
+        <w:rPr>
+          <w:lang w:val="en-GB"/>
+        </w:rPr>
+        <w:t>, etc. directories)</w:t>
+      </w:r>
+      <w:r>
+        <w:rPr>
+          <w:lang w:val="en-GB"/>
+        </w:rPr>
+        <w:t xml:space="preserve">. </w:t>
+      </w:r>
+      <w:r>
+        <w:rPr>
+          <w:rFonts w:ascii="Courier New" w:hAnsi="Courier New" w:cs="Courier New"/>
+          <w:lang w:val="en-GB"/>
+        </w:rPr>
+        <w:t>$OASIS_ENV</w:t>
+      </w:r>
+      <w:r>
+        <w:rPr>
+          <w:lang w:val="en-GB"/>
+        </w:rPr>
+        <w:t xml:space="preserve"> </w:t>
+      </w:r>
+      <w:r>
+        <w:rPr>
+          <w:lang w:val="en-GB"/>
+        </w:rPr>
+        <w:t xml:space="preserve">gives the extension of the header </w:t>
+      </w:r>
+      <w:proofErr w:type="gramStart"/>
+      <w:r>
+        <w:rPr>
+          <w:rFonts w:ascii="Courier New" w:hAnsi="Courier New" w:cs="Courier New"/>
+          <w:lang w:val="en-GB"/>
+        </w:rPr>
+        <w:t>make.$</w:t>
+      </w:r>
+      <w:proofErr w:type="gramEnd"/>
+      <w:r>
+        <w:rPr>
+          <w:rFonts w:ascii="Courier New" w:hAnsi="Courier New" w:cs="Courier New"/>
+          <w:lang w:val="en-GB"/>
+        </w:rPr>
+        <w:t>{OASIS_ENV}</w:t>
+      </w:r>
+      <w:r>
+        <w:rPr>
+          <w:lang w:val="en-GB"/>
+        </w:rPr>
+        <w:t xml:space="preserve"> from directory </w:t>
+      </w:r>
+      <w:r>
+        <w:rPr>
+          <w:rFonts w:ascii="Courier New" w:hAnsi="Courier New" w:cs="Courier New"/>
+          <w:lang w:val="en-GB"/>
+        </w:rPr>
+        <w:t>${OASIS_COUPLE}</w:t>
+      </w:r>
+      <w:r>
+        <w:rPr>
+          <w:rFonts w:ascii="Courier New" w:hAnsi="Courier New" w:cs="Courier New"/>
+          <w:lang w:val="en-GB"/>
+        </w:rPr>
+        <w:t>/util/</w:t>
+      </w:r>
+      <w:proofErr w:type="spellStart"/>
+      <w:r>
+        <w:rPr>
+          <w:rFonts w:ascii="Courier New" w:hAnsi="Courier New" w:cs="Courier New"/>
+          <w:lang w:val="en-GB"/>
+        </w:rPr>
+        <w:t>make_dir</w:t>
+      </w:r>
+      <w:proofErr w:type="spellEnd"/>
+      <w:r>
+        <w:rPr>
+          <w:rFonts w:ascii="Courier New" w:hAnsi="Courier New" w:cs="Courier New"/>
+          <w:lang w:val="en-GB"/>
+        </w:rPr>
+        <w:t xml:space="preserve"> </w:t>
+      </w:r>
+      <w:r>
+        <w:rPr>
+          <w:lang w:val="en-GB"/>
+        </w:rPr>
+        <w:t>to u</w:t>
+      </w:r>
+      <w:r>
+        <w:rPr>
+          <w:lang w:val="en-GB"/>
+        </w:rPr>
+        <w:t xml:space="preserve">se. </w:t>
+      </w:r>
+    </w:p>
+    <w:p>
+      <w:pPr>
+        <w:spacing w:before="120"/>
+        <w:jc w:val="both"/>
+        <w:rPr>
+          <w:lang w:val="en-GB"/>
+        </w:rPr>
+      </w:pPr>
+      <w:r>
+        <w:rPr>
+          <w:lang w:val="en-GB"/>
+        </w:rPr>
+        <w:t>Typing “./</w:t>
+      </w:r>
+      <w:r>
+        <w:rPr>
+          <w:rFonts w:ascii="Courier New" w:hAnsi="Courier New" w:cs="Courier New"/>
+          <w:lang w:val="en-GB"/>
+        </w:rPr>
+        <w:t>oasis_test_build.sh</w:t>
+      </w:r>
+      <w:r>
+        <w:rPr>
+          <w:lang w:val="en-GB"/>
+        </w:rPr>
+        <w:t>” compile</w:t>
+      </w:r>
+      <w:r>
+        <w:rPr>
+          <w:lang w:val="en-GB"/>
+        </w:rPr>
+        <w:t>s</w:t>
+      </w:r>
+      <w:r>
+        <w:rPr>
+          <w:lang w:val="en-GB"/>
+        </w:rPr>
+        <w:t xml:space="preserve"> </w:t>
+      </w:r>
+      <w:r>
+        <w:rPr>
+          <w:lang w:val="en-GB"/>
+        </w:rPr>
+        <w:t xml:space="preserve">OASIS3-MCT itself and </w:t>
+      </w:r>
+      <w:r>
+        <w:rPr>
+          <w:lang w:val="en-GB"/>
+        </w:rPr>
+        <w:t xml:space="preserve">executables </w:t>
+      </w:r>
+      <w:proofErr w:type="spellStart"/>
+      <w:r>
+        <w:rPr>
+          <w:rFonts w:ascii="Courier New" w:hAnsi="Courier New" w:cs="Courier New"/>
+          <w:lang w:val="en-GB"/>
+        </w:rPr>
+        <w:t>atmos</w:t>
+      </w:r>
+      <w:proofErr w:type="spellEnd"/>
+      <w:r>
+        <w:rPr>
+          <w:rFonts w:ascii="Courier New" w:hAnsi="Courier New" w:cs="Courier New"/>
+          <w:lang w:val="en-GB"/>
+        </w:rPr>
+        <w:t xml:space="preserve"> </w:t>
+      </w:r>
+      <w:r>
+        <w:rPr>
+          <w:lang w:val="en-GB"/>
+        </w:rPr>
+        <w:t>and</w:t>
+      </w:r>
+      <w:r>
+        <w:rPr>
+          <w:rFonts w:ascii="Courier New" w:hAnsi="Courier New" w:cs="Courier New"/>
+          <w:lang w:val="en-GB"/>
+        </w:rPr>
+        <w:t xml:space="preserve"> ocean</w:t>
+      </w:r>
+      <w:r>
+        <w:rPr>
+          <w:lang w:val="en-GB"/>
+        </w:rPr>
+        <w:t xml:space="preserve">. </w:t>
+      </w:r>
+      <w:r>
+        <w:rPr>
+          <w:rFonts w:cstheme="minorHAnsi"/>
+          <w:lang w:val="en-GB"/>
+        </w:rPr>
+        <w:t>This script invokes the</w:t>
+      </w:r>
+      <w:r>
+        <w:rPr>
+          <w:rFonts w:cstheme="minorHAnsi"/>
+          <w:lang w:val="en-GB"/>
+        </w:rPr>
+        <w:t xml:space="preserve"> </w:t>
+      </w:r>
+      <w:proofErr w:type="spellStart"/>
+      <w:r>
+        <w:rPr>
+          <w:rFonts w:ascii="Courier New" w:hAnsi="Courier New" w:cs="Courier New"/>
+          <w:lang w:val="en-GB"/>
+        </w:rPr>
+        <w:t>Makefile</w:t>
+      </w:r>
+      <w:proofErr w:type="spellEnd"/>
+      <w:r>
+        <w:rPr>
+          <w:rFonts w:cstheme="minorHAnsi"/>
+          <w:lang w:val="en-GB"/>
+        </w:rPr>
+        <w:t xml:space="preserve"> </w:t>
+      </w:r>
+      <w:r>
+        <w:rPr>
+          <w:rFonts w:cstheme="minorHAnsi"/>
+          <w:lang w:val="en-GB"/>
+        </w:rPr>
+        <w:t>in</w:t>
+      </w:r>
+      <w:r>
+        <w:rPr>
+          <w:rFonts w:cstheme="minorHAnsi"/>
+          <w:lang w:val="en-GB"/>
+        </w:rPr>
+        <w:t xml:space="preserve"> the tutorial </w:t>
+      </w:r>
+      <w:r>
+        <w:rPr>
+          <w:rFonts w:cstheme="minorHAnsi"/>
+          <w:lang w:val="en-GB"/>
+        </w:rPr>
+        <w:t>directory</w:t>
+      </w:r>
+      <w:r>
+        <w:rPr>
+          <w:rFonts w:cstheme="minorHAnsi"/>
+          <w:lang w:val="en-GB"/>
+        </w:rPr>
+        <w:t xml:space="preserve"> (with “</w:t>
+      </w:r>
+      <w:r>
+        <w:rPr>
+          <w:rFonts w:ascii="Courier New" w:hAnsi="Courier New" w:cs="Courier New"/>
+          <w:lang w:val="en-GB"/>
+        </w:rPr>
+        <w:t>make</w:t>
+      </w:r>
+      <w:r>
+        <w:rPr>
+          <w:rFonts w:cstheme="minorHAnsi"/>
+          <w:lang w:val="en-GB"/>
+        </w:rPr>
+        <w:t xml:space="preserve">”), which </w:t>
+      </w:r>
+      <w:r>
+        <w:rPr>
+          <w:rFonts w:cstheme="minorHAnsi"/>
+          <w:lang w:val="en-GB"/>
+        </w:rPr>
+        <w:t xml:space="preserve">automatically </w:t>
+      </w:r>
+      <w:r>
+        <w:rPr>
+          <w:rFonts w:cstheme="minorHAnsi"/>
+          <w:lang w:val="en-GB"/>
+        </w:rPr>
+        <w:t>uses</w:t>
+      </w:r>
+      <w:r>
+        <w:rPr>
+          <w:rFonts w:cstheme="minorHAnsi"/>
+          <w:lang w:val="en-GB"/>
+        </w:rPr>
+        <w:t xml:space="preserve"> </w:t>
+      </w:r>
+      <w:r>
+        <w:rPr>
+          <w:rFonts w:cstheme="minorHAnsi"/>
+          <w:lang w:val="en-GB"/>
+        </w:rPr>
+        <w:t>the</w:t>
+      </w:r>
+      <w:r>
+        <w:rPr>
+          <w:rFonts w:cstheme="minorHAnsi"/>
+          <w:lang w:val="en-GB"/>
+        </w:rPr>
+        <w:t xml:space="preserve"> OASIS3-MCT header </w:t>
+      </w:r>
+      <w:proofErr w:type="gramStart"/>
+      <w:r>
+        <w:rPr>
+          <w:rFonts w:ascii="Courier New" w:hAnsi="Courier New" w:cs="Courier New"/>
+          <w:lang w:val="en-GB"/>
+        </w:rPr>
+        <w:t>make.$</w:t>
+      </w:r>
+      <w:proofErr w:type="gramEnd"/>
+      <w:r>
+        <w:rPr>
+          <w:rFonts w:ascii="Courier New" w:hAnsi="Courier New" w:cs="Courier New"/>
+          <w:lang w:val="en-GB"/>
+        </w:rPr>
+        <w:t>{OASIS_ENV}</w:t>
+      </w:r>
+      <w:r>
+        <w:rPr>
+          <w:rFonts w:cstheme="minorHAnsi"/>
+          <w:lang w:val="en-GB"/>
+        </w:rPr>
+        <w:t xml:space="preserve">, via the inclusion of </w:t>
+      </w:r>
+      <w:r>
+        <w:rPr>
+          <w:rFonts w:ascii="Courier New" w:hAnsi="Courier New" w:cs="Courier New"/>
+          <w:lang w:val="en-GB"/>
+        </w:rPr>
+        <w:t>$(OASIS_COUPLE)/util/</w:t>
+      </w:r>
+      <w:proofErr w:type="spellStart"/>
+      <w:r>
+        <w:rPr>
+          <w:rFonts w:ascii="Courier New" w:hAnsi="Courier New" w:cs="Courier New"/>
+          <w:lang w:val="en-GB"/>
+        </w:rPr>
+        <w:t>make_dir</w:t>
+      </w:r>
+      <w:proofErr w:type="spellEnd"/>
+      <w:r>
+        <w:rPr>
+          <w:rFonts w:ascii="Courier New" w:hAnsi="Courier New" w:cs="Courier New"/>
+          <w:lang w:val="en-GB"/>
+        </w:rPr>
+        <w:t>/make.inc</w:t>
+      </w:r>
+      <w:r>
+        <w:rPr>
+          <w:rFonts w:cstheme="minorHAnsi"/>
+          <w:lang w:val="en-GB"/>
+        </w:rPr>
+        <w:t xml:space="preserve"> </w:t>
+      </w:r>
+      <w:r>
+        <w:rPr>
+          <w:rFonts w:cstheme="minorHAnsi"/>
+          <w:lang w:val="en-GB"/>
+        </w:rPr>
+        <w:t xml:space="preserve">– see the first line in the </w:t>
+      </w:r>
+      <w:proofErr w:type="spellStart"/>
+      <w:r>
+        <w:rPr>
+          <w:rFonts w:ascii="Courier New" w:hAnsi="Courier New" w:cs="Courier New"/>
+          <w:lang w:val="en-GB"/>
+        </w:rPr>
+        <w:t>Makefile</w:t>
+      </w:r>
+      <w:proofErr w:type="spellEnd"/>
+      <w:r>
+        <w:rPr>
+          <w:rFonts w:cstheme="minorHAnsi"/>
+          <w:lang w:val="en-GB"/>
+        </w:rPr>
+        <w:t xml:space="preserve">. </w:t>
+      </w:r>
+    </w:p>
+    <w:p>
+      <w:pPr>
         <w:pStyle w:val="NormalWeb"/>
         <w:spacing w:before="120" w:beforeAutospacing="0" w:after="0" w:afterAutospacing="0"/>
         <w:rPr>
-          <w:rFonts w:asciiTheme="minorHAnsi" w:hAnsiTheme="minorHAnsi" w:cstheme="minorHAnsi"/>
-          <w:lang w:val="en-GB"/>
-        </w:rPr>
-      </w:pPr>
-      <w:r>
-        <w:rPr>
-          <w:rFonts w:asciiTheme="minorHAnsi" w:hAnsiTheme="minorHAnsi" w:cstheme="minorHAnsi"/>
-          <w:lang w:val="en-GB"/>
-        </w:rPr>
-        <w:t>To compile the t</w:t>
-      </w:r>
-      <w:r>
-        <w:rPr>
-          <w:rFonts w:asciiTheme="minorHAnsi" w:hAnsiTheme="minorHAnsi" w:cstheme="minorHAnsi"/>
-          <w:lang w:val="en-GB"/>
-        </w:rPr>
-        <w:t>oy</w:t>
-      </w:r>
-      <w:r>
-        <w:rPr>
-          <w:rFonts w:asciiTheme="minorHAnsi" w:hAnsiTheme="minorHAnsi" w:cstheme="minorHAnsi"/>
-          <w:lang w:val="en-GB"/>
-        </w:rPr>
-        <w:t xml:space="preserve"> model</w:t>
-      </w:r>
-      <w:r>
-        <w:rPr>
-          <w:rFonts w:asciiTheme="minorHAnsi" w:hAnsiTheme="minorHAnsi" w:cstheme="minorHAnsi"/>
-          <w:lang w:val="en-GB"/>
-        </w:rPr>
-        <w:t xml:space="preserve"> components</w:t>
-      </w:r>
-      <w:r>
-        <w:rPr>
-          <w:rFonts w:asciiTheme="minorHAnsi" w:hAnsiTheme="minorHAnsi" w:cstheme="minorHAnsi"/>
-          <w:lang w:val="en-GB"/>
-        </w:rPr>
-        <w:t xml:space="preserve">, you first have to compile OASIS3-MCT on your computing platform (see section </w:t>
-      </w:r>
-      <w:r>
-        <w:rPr>
-          <w:rFonts w:asciiTheme="minorHAnsi" w:hAnsiTheme="minorHAnsi" w:cstheme="minorHAnsi"/>
-          <w:lang w:val="en-GB"/>
-        </w:rPr>
-        <w:t xml:space="preserve">6 of the User Guide). Then to compile the toy model components, simply </w:t>
-      </w:r>
-      <w:r>
-        <w:rPr>
-          <w:rFonts w:asciiTheme="minorHAnsi" w:hAnsiTheme="minorHAnsi" w:cstheme="minorHAnsi"/>
-          <w:lang w:val="en-GB"/>
-        </w:rPr>
-        <w:t>t</w:t>
-      </w:r>
-      <w:r>
-        <w:rPr>
-          <w:rFonts w:asciiTheme="minorHAnsi" w:hAnsiTheme="minorHAnsi" w:cstheme="minorHAnsi"/>
-          <w:lang w:val="en-GB"/>
-        </w:rPr>
-        <w:t>ype</w:t>
-      </w:r>
-      <w:r>
-        <w:rPr>
-          <w:rFonts w:asciiTheme="minorHAnsi" w:hAnsiTheme="minorHAnsi" w:cstheme="minorHAnsi"/>
-          <w:lang w:val="en-GB"/>
-        </w:rPr>
-        <w:t>, i</w:t>
-      </w:r>
-      <w:r>
-        <w:rPr>
-          <w:rFonts w:asciiTheme="minorHAnsi" w:hAnsiTheme="minorHAnsi" w:cstheme="minorHAnsi"/>
-          <w:lang w:val="en-GB"/>
-        </w:rPr>
-        <w:t xml:space="preserve">n the </w:t>
-      </w:r>
-      <w:proofErr w:type="spellStart"/>
-      <w:r>
-        <w:rPr>
-          <w:rFonts w:asciiTheme="minorHAnsi" w:hAnsiTheme="minorHAnsi" w:cstheme="minorHAnsi"/>
-          <w:lang w:val="en-GB"/>
-        </w:rPr>
-        <w:t>tutorial_communication</w:t>
-      </w:r>
-      <w:proofErr w:type="spellEnd"/>
-      <w:r>
-        <w:rPr>
-          <w:rFonts w:asciiTheme="minorHAnsi" w:hAnsiTheme="minorHAnsi" w:cstheme="minorHAnsi"/>
-          <w:lang w:val="en-GB"/>
-        </w:rPr>
-        <w:t xml:space="preserve"> directory</w:t>
-      </w:r>
-      <w:r>
-        <w:rPr>
-          <w:rFonts w:asciiTheme="minorHAnsi" w:hAnsiTheme="minorHAnsi" w:cstheme="minorHAnsi"/>
-          <w:lang w:val="en-GB"/>
-        </w:rPr>
-        <w:t>:</w:t>
-      </w:r>
-      <w:r>
-        <w:rPr>
-          <w:rFonts w:asciiTheme="minorHAnsi" w:hAnsiTheme="minorHAnsi" w:cstheme="minorHAnsi"/>
+          <w:rFonts w:asciiTheme="minorHAnsi" w:eastAsiaTheme="minorHAnsi" w:hAnsiTheme="minorHAnsi" w:cstheme="minorBidi"/>
+          <w:lang w:val="en-GB"/>
+        </w:rPr>
+      </w:pPr>
+      <w:r>
+        <w:rPr>
+          <w:rFonts w:asciiTheme="minorHAnsi" w:eastAsiaTheme="minorHAnsi" w:hAnsiTheme="minorHAnsi" w:cstheme="minorBidi"/>
+          <w:lang w:val="en-GB"/>
+        </w:rPr>
+        <w:t xml:space="preserve">Then the local script </w:t>
+      </w:r>
+      <w:r>
+        <w:rPr>
+          <w:rFonts w:ascii="Courier New" w:eastAsiaTheme="minorHAnsi" w:hAnsi="Courier New" w:cs="Courier New"/>
+          <w:lang w:val="en-GB"/>
+        </w:rPr>
+        <w:t>oasis_test_run.sh</w:t>
+      </w:r>
+      <w:r>
+        <w:rPr>
+          <w:rFonts w:asciiTheme="minorHAnsi" w:eastAsiaTheme="minorHAnsi" w:hAnsiTheme="minorHAnsi" w:cstheme="minorBidi"/>
+          <w:lang w:val="en-GB"/>
+        </w:rPr>
+        <w:t xml:space="preserve"> can</w:t>
+      </w:r>
+      <w:r>
+        <w:rPr>
+          <w:rFonts w:asciiTheme="minorHAnsi" w:eastAsiaTheme="minorHAnsi" w:hAnsiTheme="minorHAnsi" w:cstheme="minorBidi"/>
+          <w:lang w:val="en-GB"/>
+        </w:rPr>
+        <w:t xml:space="preserve"> be used to run </w:t>
+      </w:r>
+      <w:r>
+        <w:rPr>
+          <w:rFonts w:asciiTheme="minorHAnsi" w:eastAsiaTheme="minorHAnsi" w:hAnsiTheme="minorHAnsi" w:cstheme="minorBidi"/>
+          <w:lang w:val="en-GB"/>
+        </w:rPr>
+        <w:t>the tutorial coupled model</w:t>
+      </w:r>
+      <w:r>
+        <w:rPr>
+          <w:rFonts w:asciiTheme="minorHAnsi" w:eastAsiaTheme="minorHAnsi" w:hAnsiTheme="minorHAnsi" w:cstheme="minorBidi"/>
+          <w:lang w:val="en-GB"/>
+        </w:rPr>
+        <w:t xml:space="preserve"> with “./</w:t>
+      </w:r>
+      <w:r>
+        <w:rPr>
+          <w:rFonts w:ascii="Courier New" w:hAnsi="Courier New" w:cs="Courier New"/>
+          <w:lang w:val="en-GB"/>
+        </w:rPr>
+        <w:t>oasis_test_</w:t>
+      </w:r>
+      <w:r>
+        <w:rPr>
+          <w:rFonts w:ascii="Courier New" w:hAnsi="Courier New" w:cs="Courier New"/>
+          <w:lang w:val="en-GB"/>
+        </w:rPr>
+        <w:t>run</w:t>
+      </w:r>
+      <w:r>
+        <w:rPr>
+          <w:rFonts w:ascii="Courier New" w:hAnsi="Courier New" w:cs="Courier New"/>
+          <w:lang w:val="en-GB"/>
+        </w:rPr>
+        <w:t>.sh</w:t>
+      </w:r>
+      <w:r>
+        <w:rPr>
+          <w:rFonts w:ascii="Courier New" w:hAnsi="Courier New" w:cs="Courier New"/>
           <w:lang w:val="en-GB"/>
         </w:rPr>
         <w:t xml:space="preserve"> </w:t>
       </w:r>
+      <w:r>
+        <w:rPr>
+          <w:rFonts w:ascii="Courier New" w:hAnsi="Courier New" w:cs="Courier New"/>
+          <w:lang w:val="en-GB"/>
+        </w:rPr>
+        <w:t>param_tutorial_communication_test01</w:t>
+      </w:r>
+      <w:r>
+        <w:rPr>
+          <w:rFonts w:ascii="Courier New" w:hAnsi="Courier New" w:cs="Courier New"/>
+          <w:lang w:val="en-GB"/>
+        </w:rPr>
+        <w:t>”</w:t>
+      </w:r>
+      <w:r>
+        <w:rPr>
+          <w:rFonts w:ascii="Courier New" w:hAnsi="Courier New" w:cs="Courier New"/>
+          <w:lang w:val="en-GB"/>
+        </w:rPr>
+        <w:t xml:space="preserve">, </w:t>
+      </w:r>
+      <w:r>
+        <w:rPr>
+          <w:rFonts w:asciiTheme="minorHAnsi" w:eastAsiaTheme="minorHAnsi" w:hAnsiTheme="minorHAnsi" w:cstheme="minorBidi"/>
+          <w:lang w:val="en-GB"/>
+        </w:rPr>
+        <w:t>where</w:t>
+      </w:r>
+      <w:r>
+        <w:rPr>
+          <w:rFonts w:asciiTheme="minorHAnsi" w:eastAsiaTheme="minorHAnsi" w:hAnsiTheme="minorHAnsi" w:cstheme="minorBidi"/>
+          <w:lang w:val="en-GB"/>
+        </w:rPr>
+        <w:t xml:space="preserve"> the file</w:t>
+      </w:r>
+      <w:r>
+        <w:rPr>
+          <w:rFonts w:ascii="Courier New" w:hAnsi="Courier New" w:cs="Courier New"/>
+          <w:lang w:val="en-GB"/>
+        </w:rPr>
+        <w:t xml:space="preserve"> </w:t>
+      </w:r>
+      <w:r>
+        <w:rPr>
+          <w:rFonts w:ascii="Courier New" w:hAnsi="Courier New" w:cs="Courier New"/>
+          <w:lang w:val="en-GB"/>
+        </w:rPr>
+        <w:t>param_tutorial_communication_test01</w:t>
+      </w:r>
+      <w:r>
+        <w:rPr>
+          <w:rFonts w:ascii="Courier New" w:hAnsi="Courier New" w:cs="Courier New"/>
+          <w:lang w:val="en-GB"/>
+        </w:rPr>
+        <w:t xml:space="preserve"> </w:t>
+      </w:r>
+      <w:r>
+        <w:rPr>
+          <w:rFonts w:asciiTheme="minorHAnsi" w:eastAsiaTheme="minorHAnsi" w:hAnsiTheme="minorHAnsi" w:cstheme="minorBidi"/>
+          <w:lang w:val="en-GB"/>
+        </w:rPr>
+        <w:t>c</w:t>
+      </w:r>
+      <w:r>
+        <w:rPr>
+          <w:rFonts w:asciiTheme="minorHAnsi" w:eastAsiaTheme="minorHAnsi" w:hAnsiTheme="minorHAnsi" w:cstheme="minorBidi"/>
+          <w:lang w:val="en-GB"/>
+        </w:rPr>
+        <w:t>onfigur</w:t>
+      </w:r>
+      <w:r>
+        <w:rPr>
+          <w:rFonts w:asciiTheme="minorHAnsi" w:eastAsiaTheme="minorHAnsi" w:hAnsiTheme="minorHAnsi" w:cstheme="minorBidi"/>
+          <w:lang w:val="en-GB"/>
+        </w:rPr>
+        <w:t>es</w:t>
+      </w:r>
+      <w:r>
+        <w:rPr>
+          <w:rFonts w:asciiTheme="minorHAnsi" w:eastAsiaTheme="minorHAnsi" w:hAnsiTheme="minorHAnsi" w:cstheme="minorBidi"/>
+          <w:lang w:val="en-GB"/>
+        </w:rPr>
+        <w:t xml:space="preserve"> the test </w:t>
+      </w:r>
+      <w:proofErr w:type="gramStart"/>
+      <w:r>
+        <w:rPr>
+          <w:rFonts w:asciiTheme="minorHAnsi" w:eastAsiaTheme="minorHAnsi" w:hAnsiTheme="minorHAnsi" w:cstheme="minorBidi"/>
+          <w:lang w:val="en-GB"/>
+        </w:rPr>
+        <w:t>specifying :</w:t>
+      </w:r>
+      <w:proofErr w:type="gramEnd"/>
     </w:p>
     <w:p>
       <w:pPr>
-        <w:ind w:left="360" w:firstLine="348"/>
-        <w:jc w:val="both"/>
-        <w:rPr>
-          <w:lang w:val="en-US"/>
-        </w:rPr>
-      </w:pPr>
-      <w:r>
-        <w:rPr>
-          <w:rFonts w:ascii="Courier New" w:hAnsi="Courier New" w:cs="Courier New"/>
-          <w:lang w:val="en-GB"/>
-        </w:rPr>
-        <w:t>&gt; make clean; make</w:t>
+        <w:pStyle w:val="ListParagraph"/>
+        <w:numPr>
+          <w:ilvl w:val="0"/>
+          <w:numId w:val="26"/>
+        </w:numPr>
+        <w:rPr>
+          <w:rFonts w:ascii="Calibri" w:eastAsia="Calibri" w:hAnsi="Calibri" w:cs="Calibri"/>
+          <w:lang w:val="en-US"/>
+        </w:rPr>
+      </w:pPr>
+      <w:r>
+        <w:rPr>
+          <w:rFonts w:ascii="Calibri" w:eastAsia="Calibri" w:hAnsi="Calibri" w:cs="Calibri"/>
+          <w:lang w:val="en-US"/>
+        </w:rPr>
+        <w:t>the name of the executables</w:t>
+      </w:r>
+      <w:r>
+        <w:rPr>
+          <w:rFonts w:ascii="Calibri" w:eastAsia="Calibri" w:hAnsi="Calibri" w:cs="Calibri"/>
+          <w:lang w:val="en-US"/>
+        </w:rPr>
+        <w:t xml:space="preserve"> </w:t>
+      </w:r>
+      <w:r>
+        <w:rPr>
+          <w:rFonts w:ascii="Courier New" w:eastAsia="Times New Roman" w:hAnsi="Courier New" w:cs="Courier New"/>
+          <w:lang w:val="en-GB"/>
+        </w:rPr>
+        <w:t>USER_EXE1</w:t>
+      </w:r>
+      <w:r>
+        <w:rPr>
+          <w:rFonts w:ascii="Calibri" w:eastAsia="Calibri" w:hAnsi="Calibri" w:cs="Calibri"/>
+          <w:lang w:val="en-US"/>
+        </w:rPr>
+        <w:t xml:space="preserve"> and </w:t>
+      </w:r>
+      <w:r>
+        <w:rPr>
+          <w:rFonts w:ascii="Courier New" w:eastAsia="Times New Roman" w:hAnsi="Courier New" w:cs="Courier New"/>
+          <w:lang w:val="en-GB"/>
+        </w:rPr>
+        <w:t>USER_EXE2</w:t>
+      </w:r>
+      <w:r>
+        <w:rPr>
+          <w:rFonts w:ascii="Calibri" w:eastAsia="Calibri" w:hAnsi="Calibri" w:cs="Calibri"/>
+          <w:lang w:val="en-US"/>
+        </w:rPr>
+        <w:t xml:space="preserve">, </w:t>
       </w:r>
     </w:p>
     <w:p>
       <w:pPr>
-        <w:pStyle w:val="NormalWeb"/>
-        <w:spacing w:before="120" w:beforeAutospacing="0" w:after="0" w:afterAutospacing="0"/>
-        <w:rPr>
-          <w:lang w:val="en-GB"/>
-        </w:rPr>
-      </w:pPr>
-      <w:r>
-        <w:rPr>
-          <w:rFonts w:asciiTheme="minorHAnsi" w:hAnsiTheme="minorHAnsi" w:cstheme="minorHAnsi"/>
-          <w:lang w:val="en-GB"/>
-        </w:rPr>
-        <w:t>N</w:t>
-      </w:r>
-      <w:r>
-        <w:rPr>
-          <w:rFonts w:asciiTheme="minorHAnsi" w:hAnsiTheme="minorHAnsi" w:cstheme="minorHAnsi"/>
-          <w:lang w:val="en-GB"/>
-        </w:rPr>
-        <w:t xml:space="preserve">ote that the </w:t>
-      </w:r>
-      <w:proofErr w:type="spellStart"/>
-      <w:r>
-        <w:rPr>
-          <w:rFonts w:asciiTheme="minorHAnsi" w:hAnsiTheme="minorHAnsi" w:cstheme="minorHAnsi"/>
-          <w:lang w:val="en-GB"/>
-        </w:rPr>
-        <w:t>Makefile</w:t>
-      </w:r>
-      <w:proofErr w:type="spellEnd"/>
-      <w:r>
-        <w:rPr>
-          <w:rFonts w:asciiTheme="minorHAnsi" w:hAnsiTheme="minorHAnsi" w:cstheme="minorHAnsi"/>
-          <w:lang w:val="en-GB"/>
-        </w:rPr>
-        <w:t xml:space="preserve"> in this directory automatically includes your OASIS3-MCT header </w:t>
-      </w:r>
-      <w:proofErr w:type="spellStart"/>
-      <w:r>
-        <w:rPr>
-          <w:rFonts w:asciiTheme="minorHAnsi" w:hAnsiTheme="minorHAnsi" w:cstheme="minorHAnsi"/>
-          <w:lang w:val="en-GB"/>
-        </w:rPr>
-        <w:t>makefile</w:t>
-      </w:r>
-      <w:proofErr w:type="spellEnd"/>
-      <w:r>
-        <w:rPr>
-          <w:rFonts w:asciiTheme="minorHAnsi" w:hAnsiTheme="minorHAnsi" w:cstheme="minorHAnsi"/>
-          <w:lang w:val="en-GB"/>
-        </w:rPr>
-        <w:t xml:space="preserve"> – see the first line in the </w:t>
-      </w:r>
-      <w:proofErr w:type="spellStart"/>
-      <w:r>
-        <w:rPr>
-          <w:rFonts w:asciiTheme="minorHAnsi" w:hAnsiTheme="minorHAnsi" w:cstheme="minorHAnsi"/>
-          <w:lang w:val="en-GB"/>
-        </w:rPr>
-        <w:t>Makefile</w:t>
-      </w:r>
-      <w:proofErr w:type="spellEnd"/>
-      <w:r>
-        <w:rPr>
-          <w:rFonts w:asciiTheme="minorHAnsi" w:hAnsiTheme="minorHAnsi" w:cstheme="minorHAnsi"/>
-          <w:lang w:val="en-GB"/>
-        </w:rPr>
-        <w:t xml:space="preserve">. </w:t>
-      </w:r>
-      <w:r>
-        <w:rPr>
-          <w:lang w:val="en-GB"/>
-        </w:rPr>
-        <w:t xml:space="preserve">The executables </w:t>
-      </w:r>
-      <w:proofErr w:type="spellStart"/>
-      <w:r>
-        <w:rPr>
-          <w:rFonts w:ascii="Courier New" w:hAnsi="Courier New" w:cs="Courier New"/>
-          <w:lang w:val="en-GB"/>
-        </w:rPr>
-        <w:t>atmos</w:t>
-      </w:r>
-      <w:proofErr w:type="spellEnd"/>
-      <w:r>
-        <w:rPr>
-          <w:lang w:val="en-GB"/>
+        <w:pStyle w:val="ListParagraph"/>
+        <w:numPr>
+          <w:ilvl w:val="0"/>
+          <w:numId w:val="26"/>
+        </w:numPr>
+        <w:rPr>
+          <w:rFonts w:ascii="Calibri" w:eastAsia="Calibri" w:hAnsi="Calibri" w:cs="Calibri"/>
+          <w:lang w:val="en-US"/>
+        </w:rPr>
+      </w:pPr>
+      <w:r>
+        <w:rPr>
+          <w:rFonts w:ascii="Calibri" w:eastAsia="Calibri" w:hAnsi="Calibri" w:cs="Calibri"/>
+          <w:lang w:val="en-US"/>
+        </w:rPr>
+        <w:t>the number of processors for each model</w:t>
+      </w:r>
+      <w:r>
+        <w:rPr>
+          <w:rFonts w:ascii="Calibri" w:eastAsia="Calibri" w:hAnsi="Calibri" w:cs="Calibri"/>
+          <w:lang w:val="en-US"/>
+        </w:rPr>
+        <w:t xml:space="preserve"> </w:t>
+      </w:r>
+      <w:r>
+        <w:rPr>
+          <w:rFonts w:ascii="Courier New" w:eastAsia="Times New Roman" w:hAnsi="Courier New" w:cs="Courier New"/>
+          <w:lang w:val="en-GB"/>
+        </w:rPr>
+        <w:t>USER_NPEXE1</w:t>
+      </w:r>
+      <w:r>
+        <w:rPr>
+          <w:rFonts w:ascii="Calibri" w:eastAsia="Calibri" w:hAnsi="Calibri" w:cs="Calibri"/>
+          <w:lang w:val="en-US"/>
         </w:rPr>
         <w:t xml:space="preserve"> and </w:t>
       </w:r>
       <w:r>
         <w:rPr>
-          <w:rFonts w:ascii="Courier New" w:hAnsi="Courier New" w:cs="Courier New"/>
-          <w:lang w:val="en-GB"/>
-        </w:rPr>
-        <w:t>ocean</w:t>
-      </w:r>
-      <w:r>
-        <w:rPr>
-          <w:lang w:val="en-GB"/>
-        </w:rPr>
-        <w:t xml:space="preserve"> </w:t>
-      </w:r>
-      <w:r>
-        <w:rPr>
-          <w:lang w:val="en-GB"/>
-        </w:rPr>
-        <w:t>should be</w:t>
-      </w:r>
-      <w:r>
-        <w:rPr>
-          <w:lang w:val="en-GB"/>
-        </w:rPr>
-        <w:t xml:space="preserve"> available in the current directory.</w:t>
+          <w:rFonts w:ascii="Courier New" w:eastAsia="Times New Roman" w:hAnsi="Courier New" w:cs="Courier New"/>
+          <w:lang w:val="en-GB"/>
+        </w:rPr>
+        <w:t>USER_NPEXE2</w:t>
+      </w:r>
+      <w:r>
+        <w:rPr>
+          <w:rFonts w:ascii="Calibri" w:eastAsia="Calibri" w:hAnsi="Calibri" w:cs="Calibri"/>
+          <w:lang w:val="en-US"/>
+        </w:rPr>
+        <w:t xml:space="preserve">, </w:t>
       </w:r>
     </w:p>
     <w:p>
       <w:pPr>
-        <w:pStyle w:val="NormalWeb"/>
-        <w:spacing w:before="120" w:beforeAutospacing="0" w:after="0" w:afterAutospacing="0"/>
-        <w:rPr>
-          <w:rFonts w:asciiTheme="minorHAnsi" w:hAnsiTheme="minorHAnsi" w:cstheme="minorHAnsi"/>
-          <w:lang w:val="en-GB"/>
-        </w:rPr>
-      </w:pPr>
-      <w:r>
-        <w:rPr>
-          <w:rFonts w:asciiTheme="minorHAnsi" w:hAnsiTheme="minorHAnsi" w:cstheme="minorHAnsi"/>
-          <w:lang w:val="en-GB"/>
-        </w:rPr>
-        <w:t>To run the two tutorial component</w:t>
-      </w:r>
-      <w:r>
-        <w:rPr>
-          <w:rFonts w:asciiTheme="minorHAnsi" w:hAnsiTheme="minorHAnsi" w:cstheme="minorHAnsi"/>
-          <w:lang w:val="en-GB"/>
-        </w:rPr>
-        <w:t>s as separate models</w:t>
-      </w:r>
-      <w:r>
-        <w:rPr>
-          <w:rFonts w:asciiTheme="minorHAnsi" w:hAnsiTheme="minorHAnsi" w:cstheme="minorHAnsi"/>
-          <w:lang w:val="en-GB"/>
-        </w:rPr>
-        <w:t>, e</w:t>
-      </w:r>
-      <w:r>
-        <w:rPr>
-          <w:lang w:val="en-GB"/>
-        </w:rPr>
-        <w:t xml:space="preserve">dit the script </w:t>
+        <w:pStyle w:val="ListParagraph"/>
+        <w:numPr>
+          <w:ilvl w:val="0"/>
+          <w:numId w:val="26"/>
+        </w:numPr>
+        <w:rPr>
+          <w:rFonts w:ascii="Calibri" w:eastAsia="Calibri" w:hAnsi="Calibri" w:cs="Calibri"/>
+          <w:lang w:val="en-US"/>
+        </w:rPr>
+      </w:pPr>
+      <w:r>
+        <w:rPr>
+          <w:rFonts w:ascii="Calibri" w:eastAsia="Calibri" w:hAnsi="Calibri" w:cs="Calibri"/>
+          <w:lang w:val="en-US"/>
+        </w:rPr>
+        <w:t xml:space="preserve">the name </w:t>
+      </w:r>
+      <w:r>
+        <w:rPr>
+          <w:rFonts w:ascii="Calibri" w:eastAsia="Calibri" w:hAnsi="Calibri" w:cs="Calibri"/>
+          <w:lang w:val="en-US"/>
+        </w:rPr>
+        <w:t>and directory</w:t>
+      </w:r>
+      <w:r>
+        <w:rPr>
+          <w:rFonts w:ascii="Calibri" w:eastAsia="Calibri" w:hAnsi="Calibri" w:cs="Calibri"/>
+          <w:lang w:val="en-US"/>
+        </w:rPr>
+        <w:t xml:space="preserve"> </w:t>
+      </w:r>
+      <w:r>
+        <w:rPr>
+          <w:rFonts w:ascii="Calibri" w:eastAsia="Calibri" w:hAnsi="Calibri" w:cs="Calibri"/>
+          <w:lang w:val="en-US"/>
+        </w:rPr>
+        <w:t xml:space="preserve">of the </w:t>
       </w:r>
       <w:proofErr w:type="spellStart"/>
       <w:r>
         <w:rPr>
-          <w:rFonts w:ascii="Courier New" w:hAnsi="Courier New" w:cs="Courier New"/>
-          <w:lang w:val="en-GB"/>
-        </w:rPr>
-        <w:t>run_tutorial</w:t>
+          <w:rFonts w:ascii="Calibri" w:eastAsia="Calibri" w:hAnsi="Calibri" w:cs="Calibri"/>
+          <w:lang w:val="en-US"/>
+        </w:rPr>
+        <w:t>namcouple</w:t>
       </w:r>
       <w:proofErr w:type="spellEnd"/>
       <w:r>
         <w:rPr>
-          <w:lang w:val="en-GB"/>
-        </w:rPr>
-        <w:t xml:space="preserve"> </w:t>
-      </w:r>
-      <w:r>
-        <w:rPr>
-          <w:rFonts w:asciiTheme="minorHAnsi" w:hAnsiTheme="minorHAnsi" w:cstheme="minorHAnsi"/>
-          <w:lang w:val="en-GB"/>
-        </w:rPr>
-        <w:t>to adapt it to your platform and execute it</w:t>
+          <w:rFonts w:ascii="Calibri" w:eastAsia="Calibri" w:hAnsi="Calibri" w:cs="Calibri"/>
+          <w:lang w:val="en-US"/>
+        </w:rPr>
+        <w:t xml:space="preserve">, </w:t>
+      </w:r>
+      <w:r>
+        <w:rPr>
+          <w:rFonts w:ascii="Courier New" w:eastAsia="Times New Roman" w:hAnsi="Courier New" w:cs="Courier New"/>
+          <w:lang w:val="en-GB"/>
+        </w:rPr>
+        <w:t>USER_NAMCOUPLE</w:t>
+      </w:r>
+      <w:r>
+        <w:rPr>
+          <w:rFonts w:ascii="Calibri" w:eastAsia="Calibri" w:hAnsi="Calibri" w:cs="Calibri"/>
+          <w:lang w:val="en-US"/>
+        </w:rPr>
+        <w:t xml:space="preserve"> and </w:t>
+      </w:r>
+      <w:r>
+        <w:rPr>
+          <w:rFonts w:ascii="Courier New" w:eastAsia="Times New Roman" w:hAnsi="Courier New" w:cs="Courier New"/>
+          <w:lang w:val="en-GB"/>
+        </w:rPr>
+        <w:t>USER_NAMLOC</w:t>
       </w:r>
     </w:p>
     <w:p>
       <w:pPr>
-        <w:ind w:firstLine="708"/>
-        <w:jc w:val="both"/>
-        <w:rPr>
-          <w:lang w:val="en-US"/>
-        </w:rPr>
-      </w:pPr>
+        <w:pStyle w:val="ListParagraph"/>
+        <w:numPr>
+          <w:ilvl w:val="0"/>
+          <w:numId w:val="26"/>
+        </w:numPr>
+        <w:rPr>
+          <w:rFonts w:ascii="Calibri" w:eastAsia="Calibri" w:hAnsi="Calibri" w:cs="Calibri"/>
+          <w:lang w:val="en-US"/>
+        </w:rPr>
+      </w:pPr>
+      <w:r>
+        <w:rPr>
+          <w:rFonts w:ascii="Calibri" w:eastAsia="Calibri" w:hAnsi="Calibri" w:cs="Calibri"/>
+          <w:lang w:val="en-US"/>
+        </w:rPr>
+        <w:t xml:space="preserve">the name and directory of the </w:t>
+      </w:r>
+      <w:proofErr w:type="spellStart"/>
+      <w:r>
+        <w:rPr>
+          <w:rFonts w:ascii="Calibri" w:eastAsia="Calibri" w:hAnsi="Calibri" w:cs="Calibri"/>
+          <w:lang w:val="en-US"/>
+        </w:rPr>
+        <w:t>Makefile</w:t>
+      </w:r>
+      <w:proofErr w:type="spellEnd"/>
+      <w:r>
+        <w:rPr>
+          <w:rFonts w:ascii="Calibri" w:eastAsia="Calibri" w:hAnsi="Calibri" w:cs="Calibri"/>
+          <w:lang w:val="en-US"/>
+        </w:rPr>
+        <w:t xml:space="preserve">, </w:t>
+      </w:r>
+      <w:r>
+        <w:rPr>
+          <w:rFonts w:ascii="Courier New" w:eastAsia="Times New Roman" w:hAnsi="Courier New" w:cs="Courier New"/>
+          <w:lang w:val="en-GB"/>
+        </w:rPr>
+        <w:t>USER_</w:t>
+      </w:r>
       <w:proofErr w:type="gramStart"/>
       <w:r>
         <w:rPr>
-          <w:rFonts w:ascii="Courier New" w:hAnsi="Courier New" w:cs="Courier New"/>
-          <w:lang w:val="en-GB"/>
-        </w:rPr>
-        <w:t>&gt;./</w:t>
-      </w:r>
-      <w:proofErr w:type="spellStart"/>
+          <w:rFonts w:ascii="Courier New" w:eastAsia="Times New Roman" w:hAnsi="Courier New" w:cs="Courier New"/>
+          <w:lang w:val="en-GB"/>
+        </w:rPr>
+        <w:t>MAKEFILE</w:t>
+      </w:r>
+      <w:r>
+        <w:rPr>
+          <w:rFonts w:ascii="Calibri" w:eastAsia="Calibri" w:hAnsi="Calibri" w:cs="Calibri"/>
+          <w:lang w:val="en-US"/>
+        </w:rPr>
+        <w:t xml:space="preserve"> </w:t>
+      </w:r>
+      <w:r>
+        <w:rPr>
+          <w:rFonts w:ascii="Calibri" w:eastAsia="Calibri" w:hAnsi="Calibri" w:cs="Calibri"/>
+          <w:lang w:val="en-US"/>
+        </w:rPr>
+        <w:t xml:space="preserve"> and</w:t>
+      </w:r>
       <w:proofErr w:type="gramEnd"/>
       <w:r>
         <w:rPr>
-          <w:rFonts w:ascii="Courier New" w:hAnsi="Courier New" w:cs="Courier New"/>
-          <w:lang w:val="en-GB"/>
-        </w:rPr>
-        <w:t>run_tutorial</w:t>
-      </w:r>
-      <w:proofErr w:type="spellEnd"/>
+          <w:rFonts w:ascii="Calibri" w:eastAsia="Calibri" w:hAnsi="Calibri" w:cs="Calibri"/>
+          <w:lang w:val="en-US"/>
+        </w:rPr>
+        <w:t xml:space="preserve"> </w:t>
+      </w:r>
+      <w:r>
+        <w:rPr>
+          <w:rFonts w:ascii="Courier New" w:eastAsia="Times New Roman" w:hAnsi="Courier New" w:cs="Courier New"/>
+          <w:lang w:val="en-GB"/>
+        </w:rPr>
+        <w:t>USER_MAKELOC</w:t>
+      </w:r>
     </w:p>
     <w:p>
       <w:pPr>
-        <w:pStyle w:val="NormalWeb"/>
-        <w:spacing w:before="120" w:beforeAutospacing="0" w:after="0" w:afterAutospacing="0"/>
-        <w:rPr>
-          <w:rFonts w:asciiTheme="minorHAnsi" w:hAnsiTheme="minorHAnsi" w:cstheme="minorHAnsi"/>
-          <w:lang w:val="en-GB"/>
-        </w:rPr>
-      </w:pPr>
-      <w:r>
-        <w:rPr>
-          <w:rFonts w:asciiTheme="minorHAnsi" w:hAnsiTheme="minorHAnsi" w:cstheme="minorHAnsi"/>
-          <w:lang w:val="en-GB"/>
-        </w:rPr>
-        <w:t xml:space="preserve">The results of the component models </w:t>
-      </w:r>
-      <w:r>
-        <w:rPr>
-          <w:rFonts w:asciiTheme="minorHAnsi" w:hAnsiTheme="minorHAnsi" w:cstheme="minorHAnsi"/>
-          <w:lang w:val="en-GB"/>
-        </w:rPr>
-        <w:t>should</w:t>
-      </w:r>
-      <w:r>
-        <w:rPr>
-          <w:rFonts w:asciiTheme="minorHAnsi" w:hAnsiTheme="minorHAnsi" w:cstheme="minorHAnsi"/>
-          <w:lang w:val="en-GB"/>
-        </w:rPr>
-        <w:t xml:space="preserve"> now </w:t>
-      </w:r>
-      <w:r>
-        <w:rPr>
-          <w:rFonts w:asciiTheme="minorHAnsi" w:hAnsiTheme="minorHAnsi" w:cstheme="minorHAnsi"/>
-          <w:lang w:val="en-GB"/>
-        </w:rPr>
-        <w:t xml:space="preserve">be </w:t>
-      </w:r>
-      <w:r>
-        <w:rPr>
-          <w:rFonts w:asciiTheme="minorHAnsi" w:hAnsiTheme="minorHAnsi" w:cstheme="minorHAnsi"/>
-          <w:lang w:val="en-GB"/>
-        </w:rPr>
-        <w:t>in subdirectory $</w:t>
-      </w:r>
-      <w:proofErr w:type="spellStart"/>
-      <w:r>
-        <w:rPr>
-          <w:rFonts w:ascii="Courier New" w:hAnsi="Courier New" w:cs="Courier New"/>
-          <w:lang w:val="en-GB"/>
-        </w:rPr>
-        <w:t>rundir</w:t>
-      </w:r>
-      <w:proofErr w:type="spellEnd"/>
-      <w:r>
-        <w:rPr>
-          <w:rFonts w:ascii="Courier New" w:hAnsi="Courier New" w:cs="Courier New"/>
-          <w:lang w:val="en-GB"/>
+        <w:pStyle w:val="ListParagraph"/>
+        <w:numPr>
+          <w:ilvl w:val="0"/>
+          <w:numId w:val="26"/>
+        </w:numPr>
+        <w:rPr>
+          <w:rFonts w:ascii="Calibri" w:eastAsia="Calibri" w:hAnsi="Calibri" w:cs="Calibri"/>
+          <w:lang w:val="en-US"/>
+        </w:rPr>
+      </w:pPr>
+      <w:r>
+        <w:rPr>
+          <w:rFonts w:ascii="Calibri" w:eastAsia="Calibri" w:hAnsi="Calibri" w:cs="Calibri"/>
+          <w:lang w:val="en-US"/>
+        </w:rPr>
+        <w:t>the remapping file directory</w:t>
+      </w:r>
+      <w:r>
+        <w:rPr>
+          <w:rFonts w:ascii="Calibri" w:eastAsia="Calibri" w:hAnsi="Calibri" w:cs="Calibri"/>
+          <w:lang w:val="en-US"/>
         </w:rPr>
         <w:t xml:space="preserve"> </w:t>
       </w:r>
       <w:r>
         <w:rPr>
-          <w:rFonts w:asciiTheme="minorHAnsi" w:hAnsiTheme="minorHAnsi" w:cstheme="minorHAnsi"/>
-          <w:lang w:val="en-GB"/>
-        </w:rPr>
-        <w:t xml:space="preserve">defined in </w:t>
-      </w:r>
-      <w:proofErr w:type="spellStart"/>
-      <w:r>
-        <w:rPr>
-          <w:rFonts w:ascii="Courier New" w:hAnsi="Courier New" w:cs="Courier New"/>
-          <w:lang w:val="en-GB"/>
-        </w:rPr>
-        <w:t>run_tutorial</w:t>
-      </w:r>
-      <w:proofErr w:type="spellEnd"/>
-      <w:r>
-        <w:rPr>
-          <w:rFonts w:asciiTheme="minorHAnsi" w:hAnsiTheme="minorHAnsi" w:cstheme="minorHAnsi"/>
-          <w:lang w:val="en-GB"/>
-        </w:rPr>
-        <w:t>.</w:t>
-      </w:r>
-      <w:r>
-        <w:rPr>
-          <w:rFonts w:asciiTheme="minorHAnsi" w:hAnsiTheme="minorHAnsi" w:cstheme="minorHAnsi"/>
-          <w:lang w:val="en-GB"/>
-        </w:rPr>
-        <w:t xml:space="preserve"> </w:t>
-      </w:r>
-      <w:r>
-        <w:rPr>
-          <w:rFonts w:asciiTheme="minorHAnsi" w:hAnsiTheme="minorHAnsi" w:cstheme="minorHAnsi"/>
-          <w:lang w:val="en-GB"/>
-        </w:rPr>
-        <w:t xml:space="preserve">In their current form, </w:t>
-      </w:r>
-      <w:proofErr w:type="gramStart"/>
-      <w:r>
-        <w:rPr>
-          <w:rFonts w:ascii="Courier New" w:hAnsi="Courier New" w:cs="Courier New"/>
-          <w:lang w:val="en-GB"/>
-        </w:rPr>
-        <w:t>atmos</w:t>
-      </w:r>
-      <w:r>
-        <w:rPr>
-          <w:rFonts w:ascii="Courier New" w:hAnsi="Courier New" w:cs="Courier New"/>
-          <w:lang w:val="en-GB"/>
-        </w:rPr>
-        <w:t>.F</w:t>
-      </w:r>
-      <w:proofErr w:type="gramEnd"/>
-      <w:r>
-        <w:rPr>
-          <w:rFonts w:ascii="Courier New" w:hAnsi="Courier New" w:cs="Courier New"/>
-          <w:lang w:val="en-GB"/>
-        </w:rPr>
-        <w:t>90</w:t>
-      </w:r>
-      <w:r>
-        <w:rPr>
-          <w:rFonts w:asciiTheme="minorHAnsi" w:hAnsiTheme="minorHAnsi" w:cstheme="minorHAnsi"/>
-          <w:lang w:val="en-GB"/>
-        </w:rPr>
-        <w:t xml:space="preserve"> </w:t>
-      </w:r>
-      <w:r>
-        <w:rPr>
-          <w:rFonts w:asciiTheme="minorHAnsi" w:hAnsiTheme="minorHAnsi" w:cstheme="minorHAnsi"/>
-          <w:lang w:val="en-GB"/>
-        </w:rPr>
-        <w:t xml:space="preserve"> and </w:t>
-      </w:r>
-      <w:r>
-        <w:rPr>
-          <w:rFonts w:ascii="Courier New" w:hAnsi="Courier New" w:cs="Courier New"/>
-          <w:lang w:val="en-GB"/>
-        </w:rPr>
-        <w:t>ocean</w:t>
-      </w:r>
-      <w:r>
-        <w:rPr>
-          <w:rFonts w:ascii="Courier New" w:hAnsi="Courier New" w:cs="Courier New"/>
-          <w:lang w:val="en-GB"/>
-        </w:rPr>
-        <w:t>.F90</w:t>
-      </w:r>
-      <w:r>
-        <w:rPr>
-          <w:rFonts w:asciiTheme="minorHAnsi" w:hAnsiTheme="minorHAnsi" w:cstheme="minorHAnsi"/>
-          <w:lang w:val="en-GB"/>
-        </w:rPr>
-        <w:t xml:space="preserve"> are not interfaced with the OASIS3-MCT library and do not perform any exchanges. They just run</w:t>
-      </w:r>
-      <w:r>
-        <w:rPr>
-          <w:rFonts w:asciiTheme="minorHAnsi" w:hAnsiTheme="minorHAnsi" w:cstheme="minorHAnsi"/>
-          <w:lang w:val="en-GB"/>
-        </w:rPr>
-        <w:t>,</w:t>
-      </w:r>
-      <w:r>
-        <w:rPr>
-          <w:rFonts w:asciiTheme="minorHAnsi" w:hAnsiTheme="minorHAnsi" w:cstheme="minorHAnsi"/>
-          <w:lang w:val="en-GB"/>
-        </w:rPr>
-        <w:t xml:space="preserve"> </w:t>
-      </w:r>
-      <w:r>
-        <w:rPr>
-          <w:rFonts w:asciiTheme="minorHAnsi" w:hAnsiTheme="minorHAnsi" w:cstheme="minorHAnsi"/>
-          <w:lang w:val="en-GB"/>
-        </w:rPr>
-        <w:t xml:space="preserve">on 4 processes each </w:t>
-      </w:r>
-      <w:r>
-        <w:rPr>
-          <w:rFonts w:asciiTheme="minorHAnsi" w:hAnsiTheme="minorHAnsi" w:cstheme="minorHAnsi"/>
-          <w:lang w:val="en-GB"/>
-        </w:rPr>
-        <w:t xml:space="preserve">for </w:t>
-      </w:r>
-      <w:r>
-        <w:rPr>
-          <w:rFonts w:asciiTheme="minorHAnsi" w:hAnsiTheme="minorHAnsi" w:cstheme="minorHAnsi"/>
-          <w:lang w:val="en-GB"/>
-        </w:rPr>
-        <w:t>4</w:t>
-      </w:r>
-      <w:r>
-        <w:rPr>
-          <w:rFonts w:asciiTheme="minorHAnsi" w:hAnsiTheme="minorHAnsi" w:cstheme="minorHAnsi"/>
-          <w:lang w:val="en-GB"/>
-        </w:rPr>
-        <w:t xml:space="preserve"> </w:t>
-      </w:r>
-      <w:r>
-        <w:rPr>
-          <w:rFonts w:asciiTheme="minorHAnsi" w:hAnsiTheme="minorHAnsi" w:cstheme="minorHAnsi"/>
-          <w:lang w:val="en-GB"/>
-        </w:rPr>
-        <w:t xml:space="preserve">model </w:t>
-      </w:r>
-      <w:r>
-        <w:rPr>
-          <w:rFonts w:asciiTheme="minorHAnsi" w:hAnsiTheme="minorHAnsi" w:cstheme="minorHAnsi"/>
-          <w:lang w:val="en-GB"/>
-        </w:rPr>
-        <w:t>hour</w:t>
-      </w:r>
-      <w:r>
-        <w:rPr>
-          <w:rFonts w:asciiTheme="minorHAnsi" w:hAnsiTheme="minorHAnsi" w:cstheme="minorHAnsi"/>
-          <w:lang w:val="en-GB"/>
-        </w:rPr>
-        <w:t>s</w:t>
-      </w:r>
-      <w:r>
-        <w:rPr>
-          <w:rFonts w:asciiTheme="minorHAnsi" w:hAnsiTheme="minorHAnsi" w:cstheme="minorHAnsi"/>
-          <w:lang w:val="en-GB"/>
-        </w:rPr>
-        <w:t xml:space="preserve"> without doing anything specific</w:t>
-      </w:r>
-      <w:r>
-        <w:rPr>
-          <w:rFonts w:asciiTheme="minorHAnsi" w:hAnsiTheme="minorHAnsi" w:cstheme="minorHAnsi"/>
-          <w:lang w:val="en-GB"/>
-        </w:rPr>
-        <w:t>. Have a look at</w:t>
-      </w:r>
-      <w:r>
-        <w:rPr>
-          <w:rFonts w:asciiTheme="minorHAnsi" w:hAnsiTheme="minorHAnsi" w:cstheme="minorHAnsi"/>
-          <w:lang w:val="en-GB"/>
-        </w:rPr>
-        <w:t xml:space="preserve"> the files </w:t>
-      </w:r>
-      <w:r>
-        <w:rPr>
-          <w:rFonts w:ascii="Courier New" w:hAnsi="Courier New" w:cs="Courier New"/>
-          <w:lang w:val="en-GB"/>
-        </w:rPr>
-        <w:t>atmos</w:t>
-      </w:r>
-      <w:r>
-        <w:rPr>
-          <w:rFonts w:ascii="Courier New" w:hAnsi="Courier New" w:cs="Courier New"/>
-          <w:lang w:val="en-GB"/>
-        </w:rPr>
-        <w:t>.out_10</w:t>
-      </w:r>
-      <w:r>
-        <w:rPr>
-          <w:rFonts w:ascii="Courier New" w:hAnsi="Courier New" w:cs="Courier New"/>
-          <w:lang w:val="en-GB"/>
-        </w:rPr>
-        <w:t>?</w:t>
-      </w:r>
-      <w:r>
-        <w:rPr>
-          <w:rFonts w:ascii="Courier New" w:hAnsi="Courier New" w:cs="Courier New"/>
-          <w:lang w:val="en-GB"/>
-        </w:rPr>
-        <w:t xml:space="preserve"> </w:t>
-      </w:r>
-      <w:r>
-        <w:rPr>
-          <w:rFonts w:asciiTheme="minorHAnsi" w:hAnsiTheme="minorHAnsi" w:cstheme="minorHAnsi"/>
-          <w:lang w:val="en-GB"/>
-        </w:rPr>
-        <w:t xml:space="preserve">and </w:t>
-      </w:r>
-      <w:r>
-        <w:rPr>
-          <w:rFonts w:ascii="Courier New" w:hAnsi="Courier New" w:cs="Courier New"/>
-          <w:lang w:val="en-GB"/>
-        </w:rPr>
-        <w:t>ocean</w:t>
-      </w:r>
-      <w:r>
-        <w:rPr>
-          <w:rFonts w:ascii="Courier New" w:hAnsi="Courier New" w:cs="Courier New"/>
-          <w:lang w:val="en-GB"/>
-        </w:rPr>
-        <w:t>.out_10</w:t>
-      </w:r>
-      <w:r>
-        <w:rPr>
-          <w:rFonts w:ascii="Courier New" w:hAnsi="Courier New" w:cs="Courier New"/>
-          <w:lang w:val="en-GB"/>
-        </w:rPr>
-        <w:t>?</w:t>
-      </w:r>
-      <w:r>
-        <w:rPr>
-          <w:rFonts w:ascii="Courier New" w:hAnsi="Courier New" w:cs="Courier New"/>
-          <w:lang w:val="en-GB"/>
-        </w:rPr>
-        <w:t xml:space="preserve"> </w:t>
-      </w:r>
-      <w:r>
-        <w:rPr>
-          <w:rFonts w:ascii="Courier New" w:hAnsi="Courier New" w:cs="Courier New"/>
-          <w:lang w:val="en-GB"/>
-        </w:rPr>
-        <w:t>(</w:t>
-      </w:r>
-      <w:proofErr w:type="gramStart"/>
-      <w:r>
-        <w:rPr>
-          <w:rFonts w:asciiTheme="minorHAnsi" w:hAnsiTheme="minorHAnsi" w:cstheme="minorHAnsi"/>
-          <w:lang w:val="en-GB"/>
-        </w:rPr>
-        <w:t xml:space="preserve">where </w:t>
-      </w:r>
-      <w:r>
-        <w:rPr>
-          <w:rFonts w:ascii="Courier New" w:hAnsi="Courier New" w:cs="Courier New"/>
-          <w:lang w:val="en-GB"/>
-        </w:rPr>
-        <w:t>?</w:t>
-      </w:r>
-      <w:proofErr w:type="gramEnd"/>
-      <w:r>
-        <w:rPr>
-          <w:rFonts w:asciiTheme="minorHAnsi" w:hAnsiTheme="minorHAnsi" w:cstheme="minorHAnsi"/>
-          <w:lang w:val="en-GB"/>
-        </w:rPr>
-        <w:t xml:space="preserve"> goes from 0 to 3, one for each process)</w:t>
-      </w:r>
-      <w:r>
-        <w:rPr>
-          <w:rFonts w:asciiTheme="minorHAnsi" w:hAnsiTheme="minorHAnsi" w:cstheme="minorHAnsi"/>
-          <w:lang w:val="en-GB"/>
-        </w:rPr>
-        <w:t xml:space="preserve">, in </w:t>
-      </w:r>
-      <w:r>
-        <w:rPr>
-          <w:rFonts w:asciiTheme="minorHAnsi" w:hAnsiTheme="minorHAnsi" w:cstheme="minorHAnsi"/>
-          <w:lang w:val="en-GB"/>
-        </w:rPr>
-        <w:t xml:space="preserve">the </w:t>
-      </w:r>
-      <w:r>
-        <w:rPr>
-          <w:rFonts w:ascii="Courier New" w:hAnsi="Courier New" w:cs="Courier New"/>
-          <w:lang w:val="en-GB"/>
-        </w:rPr>
-        <w:t>$</w:t>
-      </w:r>
-      <w:proofErr w:type="spellStart"/>
-      <w:r>
-        <w:rPr>
-          <w:rFonts w:ascii="Courier New" w:hAnsi="Courier New" w:cs="Courier New"/>
-          <w:lang w:val="en-GB"/>
-        </w:rPr>
-        <w:t>rundir</w:t>
-      </w:r>
-      <w:proofErr w:type="spellEnd"/>
-      <w:r>
-        <w:rPr>
-          <w:rFonts w:ascii="Courier New" w:hAnsi="Courier New" w:cs="Courier New"/>
-          <w:lang w:val="en-GB"/>
-        </w:rPr>
-        <w:t xml:space="preserve"> </w:t>
-      </w:r>
-      <w:r>
-        <w:rPr>
-          <w:rFonts w:asciiTheme="minorHAnsi" w:hAnsiTheme="minorHAnsi" w:cstheme="minorHAnsi"/>
-          <w:lang w:val="en-GB"/>
-        </w:rPr>
-        <w:t>subdirectory.</w:t>
+          <w:rFonts w:ascii="Courier New" w:eastAsia="Times New Roman" w:hAnsi="Courier New" w:cs="Courier New"/>
+          <w:lang w:val="en-GB"/>
+        </w:rPr>
+        <w:t>USER_RMPLOC</w:t>
+      </w:r>
+      <w:r>
+        <w:rPr>
+          <w:rFonts w:ascii="Calibri" w:eastAsia="Calibri" w:hAnsi="Calibri" w:cs="Calibri"/>
+          <w:lang w:val="en-US"/>
+        </w:rPr>
+        <w:t xml:space="preserve">, </w:t>
       </w:r>
     </w:p>
     <w:p>
       <w:pPr>
-        <w:spacing w:before="240"/>
-        <w:rPr>
-          <w:u w:val="single"/>
-          <w:lang w:val="en-GB"/>
-        </w:rPr>
-      </w:pPr>
-      <w:r>
-        <w:rPr>
-          <w:u w:val="single"/>
-          <w:lang w:val="en-GB"/>
-        </w:rPr>
-        <w:t>Interfacing the toy model</w:t>
-      </w:r>
-      <w:r>
-        <w:rPr>
-          <w:u w:val="single"/>
-          <w:lang w:val="en-GB"/>
-        </w:rPr>
-        <w:t>s</w:t>
-      </w:r>
-      <w:r>
-        <w:rPr>
-          <w:u w:val="single"/>
-          <w:lang w:val="en-GB"/>
-        </w:rPr>
-        <w:t xml:space="preserve"> with OASIS3-MCT and running it</w:t>
+        <w:pStyle w:val="ListParagraph"/>
+        <w:numPr>
+          <w:ilvl w:val="0"/>
+          <w:numId w:val="26"/>
+        </w:numPr>
+        <w:rPr>
+          <w:rFonts w:ascii="Calibri" w:eastAsia="Calibri" w:hAnsi="Calibri" w:cs="Calibri"/>
+          <w:lang w:val="en-US"/>
+        </w:rPr>
+      </w:pPr>
+      <w:r>
+        <w:rPr>
+          <w:rFonts w:ascii="Calibri" w:eastAsia="Calibri" w:hAnsi="Calibri" w:cs="Calibri"/>
+          <w:lang w:val="en-US"/>
+        </w:rPr>
+        <w:t xml:space="preserve">the </w:t>
+      </w:r>
+      <w:r>
+        <w:rPr>
+          <w:rFonts w:ascii="Calibri" w:eastAsia="Calibri" w:hAnsi="Calibri" w:cs="Calibri"/>
+          <w:lang w:val="en-US"/>
+        </w:rPr>
+        <w:t xml:space="preserve">directory containing OASIS3-MCT auxiliary files </w:t>
+      </w:r>
+      <w:r>
+        <w:rPr>
+          <w:rFonts w:ascii="Courier New" w:eastAsia="Times New Roman" w:hAnsi="Courier New" w:cs="Courier New"/>
+          <w:lang w:val="en-GB"/>
+        </w:rPr>
+        <w:t>grids.nc, areas.nc</w:t>
+      </w:r>
+      <w:r>
+        <w:rPr>
+          <w:rFonts w:ascii="Calibri" w:eastAsia="Calibri" w:hAnsi="Calibri" w:cs="Calibri"/>
+          <w:lang w:val="en-US"/>
+        </w:rPr>
+        <w:t xml:space="preserve"> and </w:t>
+      </w:r>
+      <w:proofErr w:type="gramStart"/>
+      <w:r>
+        <w:rPr>
+          <w:rFonts w:ascii="Courier New" w:eastAsia="Times New Roman" w:hAnsi="Courier New" w:cs="Courier New"/>
+          <w:lang w:val="en-GB"/>
+        </w:rPr>
+        <w:t>masks.nc</w:t>
+      </w:r>
+      <w:r>
+        <w:rPr>
+          <w:rFonts w:ascii="Calibri" w:eastAsia="Calibri" w:hAnsi="Calibri" w:cs="Calibri"/>
+          <w:lang w:val="en-US"/>
+        </w:rPr>
+        <w:t xml:space="preserve"> </w:t>
+      </w:r>
+      <w:r>
+        <w:rPr>
+          <w:rFonts w:ascii="Calibri" w:eastAsia="Calibri" w:hAnsi="Calibri" w:cs="Calibri"/>
+          <w:lang w:val="en-US"/>
+        </w:rPr>
+        <w:t>,</w:t>
+      </w:r>
+      <w:proofErr w:type="gramEnd"/>
+      <w:r>
+        <w:rPr>
+          <w:rFonts w:ascii="Calibri" w:eastAsia="Calibri" w:hAnsi="Calibri" w:cs="Calibri"/>
+          <w:lang w:val="en-US"/>
+        </w:rPr>
+        <w:t xml:space="preserve"> </w:t>
+      </w:r>
+      <w:r>
+        <w:rPr>
+          <w:rFonts w:ascii="Courier New" w:eastAsia="Times New Roman" w:hAnsi="Courier New" w:cs="Courier New"/>
+          <w:lang w:val="en-GB"/>
+        </w:rPr>
+        <w:t>USER_AUXLOC</w:t>
+      </w:r>
+      <w:r>
+        <w:rPr>
+          <w:rFonts w:ascii="Calibri" w:eastAsia="Calibri" w:hAnsi="Calibri" w:cs="Calibri"/>
+          <w:lang w:val="en-US"/>
+        </w:rPr>
+        <w:t xml:space="preserve"> (not defined here as </w:t>
+      </w:r>
+      <w:proofErr w:type="spellStart"/>
+      <w:r>
+        <w:rPr>
+          <w:rFonts w:ascii="Courier New" w:eastAsia="Times New Roman" w:hAnsi="Courier New" w:cs="Courier New"/>
+          <w:lang w:val="en-GB"/>
+        </w:rPr>
+        <w:t>atmos</w:t>
+      </w:r>
+      <w:proofErr w:type="spellEnd"/>
+      <w:r>
+        <w:rPr>
+          <w:rFonts w:ascii="Calibri" w:eastAsia="Calibri" w:hAnsi="Calibri" w:cs="Calibri"/>
+          <w:lang w:val="en-US"/>
+        </w:rPr>
+        <w:t xml:space="preserve"> and </w:t>
+      </w:r>
+      <w:r>
+        <w:rPr>
+          <w:rFonts w:ascii="Courier New" w:eastAsia="Times New Roman" w:hAnsi="Courier New" w:cs="Courier New"/>
+          <w:lang w:val="en-GB"/>
+        </w:rPr>
+        <w:t>ocean</w:t>
+      </w:r>
+      <w:r>
+        <w:rPr>
+          <w:rFonts w:ascii="Calibri" w:eastAsia="Calibri" w:hAnsi="Calibri" w:cs="Calibri"/>
+          <w:lang w:val="en-US"/>
+        </w:rPr>
+        <w:t xml:space="preserve"> create them using </w:t>
+      </w:r>
+      <w:proofErr w:type="spellStart"/>
+      <w:r>
+        <w:rPr>
+          <w:rFonts w:ascii="Courier New" w:eastAsia="Times New Roman" w:hAnsi="Courier New" w:cs="Courier New"/>
+          <w:lang w:val="en-GB"/>
+        </w:rPr>
+        <w:t>oasis_write_grid</w:t>
+      </w:r>
+      <w:proofErr w:type="spellEnd"/>
+      <w:r>
+        <w:rPr>
+          <w:rFonts w:ascii="Courier New" w:eastAsia="Times New Roman" w:hAnsi="Courier New" w:cs="Courier New"/>
+          <w:lang w:val="en-GB"/>
+        </w:rPr>
+        <w:t xml:space="preserve">, </w:t>
+      </w:r>
+      <w:proofErr w:type="spellStart"/>
+      <w:r>
+        <w:rPr>
+          <w:rFonts w:ascii="Courier New" w:eastAsia="Times New Roman" w:hAnsi="Courier New" w:cs="Courier New"/>
+          <w:lang w:val="en-GB"/>
+        </w:rPr>
+        <w:t>oasis_write_corner</w:t>
+      </w:r>
+      <w:proofErr w:type="spellEnd"/>
+      <w:r>
+        <w:rPr>
+          <w:rFonts w:ascii="Courier New" w:eastAsia="Times New Roman" w:hAnsi="Courier New" w:cs="Courier New"/>
+          <w:lang w:val="en-GB"/>
+        </w:rPr>
+        <w:t xml:space="preserve">, </w:t>
+      </w:r>
+      <w:proofErr w:type="spellStart"/>
+      <w:r>
+        <w:rPr>
+          <w:rFonts w:ascii="Courier New" w:eastAsia="Times New Roman" w:hAnsi="Courier New" w:cs="Courier New"/>
+          <w:lang w:val="en-GB"/>
+        </w:rPr>
+        <w:t>oasis_write_mask</w:t>
+      </w:r>
+      <w:proofErr w:type="spellEnd"/>
+      <w:r>
+        <w:rPr>
+          <w:rFonts w:ascii="Menlo" w:hAnsi="Menlo" w:cs="Menlo"/>
+          <w:color w:val="000000"/>
+          <w:sz w:val="30"/>
+          <w:szCs w:val="30"/>
+          <w:lang w:val="en-GB"/>
+        </w:rPr>
+        <w:t xml:space="preserve"> </w:t>
+      </w:r>
+      <w:r>
+        <w:rPr>
+          <w:rFonts w:ascii="Calibri" w:eastAsia="Calibri" w:hAnsi="Calibri" w:cs="Calibri"/>
+          <w:lang w:val="en-US"/>
+        </w:rPr>
+        <w:t>API routines</w:t>
+      </w:r>
+      <w:r>
+        <w:rPr>
+          <w:rFonts w:ascii="Calibri" w:eastAsia="Calibri" w:hAnsi="Calibri" w:cs="Calibri"/>
+          <w:lang w:val="en-US"/>
+        </w:rPr>
+        <w:t>),</w:t>
       </w:r>
     </w:p>
     <w:p>
       <w:pPr>
-        <w:spacing w:before="120"/>
-        <w:jc w:val="both"/>
-        <w:rPr>
-          <w:lang w:val="en-GB"/>
-        </w:rPr>
-      </w:pPr>
-      <w:r>
-        <w:rPr>
-          <w:lang w:val="en-GB"/>
-        </w:rPr>
-        <w:t xml:space="preserve">The tutorial toy model should reproduce the coupling </w:t>
-      </w:r>
-      <w:r>
-        <w:rPr>
-          <w:lang w:val="en-GB"/>
-        </w:rPr>
-        <w:t xml:space="preserve">exchanges </w:t>
-      </w:r>
-      <w:r>
-        <w:rPr>
-          <w:lang w:val="en-GB"/>
-        </w:rPr>
-        <w:t xml:space="preserve">between </w:t>
-      </w:r>
-      <w:proofErr w:type="spellStart"/>
-      <w:r>
+        <w:pStyle w:val="ListParagraph"/>
+        <w:numPr>
+          <w:ilvl w:val="0"/>
+          <w:numId w:val="26"/>
+        </w:numPr>
         <w:rPr>
           <w:rFonts w:ascii="Courier New" w:eastAsia="Times New Roman" w:hAnsi="Courier New" w:cs="Courier New"/>
           <w:lang w:val="en-GB"/>
         </w:rPr>
-        <w:t>atmos</w:t>
-      </w:r>
-      <w:proofErr w:type="spellEnd"/>
-      <w:r>
-        <w:rPr>
-          <w:lang w:val="en-GB"/>
-        </w:rPr>
-        <w:t xml:space="preserve"> and </w:t>
+      </w:pPr>
+      <w:r>
+        <w:rPr>
+          <w:rFonts w:ascii="Calibri" w:eastAsia="Calibri" w:hAnsi="Calibri" w:cs="Calibri"/>
+          <w:lang w:val="en-US"/>
+        </w:rPr>
+        <w:t xml:space="preserve">the </w:t>
+      </w:r>
+      <w:r>
+        <w:rPr>
+          <w:rFonts w:ascii="Calibri" w:eastAsia="Calibri" w:hAnsi="Calibri" w:cs="Calibri"/>
+          <w:lang w:val="en-US"/>
+        </w:rPr>
+        <w:t xml:space="preserve">directory </w:t>
+      </w:r>
+      <w:r>
+        <w:rPr>
+          <w:rFonts w:ascii="Calibri" w:eastAsia="Calibri" w:hAnsi="Calibri" w:cs="Calibri"/>
+          <w:lang w:val="en-US"/>
+        </w:rPr>
+        <w:t xml:space="preserve">containing the coupling </w:t>
+      </w:r>
+      <w:r>
+        <w:rPr>
+          <w:rFonts w:ascii="Calibri" w:eastAsia="Calibri" w:hAnsi="Calibri" w:cs="Calibri"/>
+          <w:lang w:val="en-US"/>
+        </w:rPr>
+        <w:t xml:space="preserve">restart files </w:t>
       </w:r>
       <w:r>
         <w:rPr>
           <w:rFonts w:ascii="Courier New" w:eastAsia="Times New Roman" w:hAnsi="Courier New" w:cs="Courier New"/>
           <w:lang w:val="en-GB"/>
         </w:rPr>
-        <w:t>ocean</w:t>
-      </w:r>
-      <w:r>
-        <w:rPr>
-          <w:lang w:val="en-GB"/>
-        </w:rPr>
-        <w:t xml:space="preserve"> as described above</w:t>
-      </w:r>
-      <w:r>
-        <w:rPr>
-          <w:lang w:val="en-GB"/>
-        </w:rPr>
-        <w:t xml:space="preserve">. </w:t>
-      </w:r>
-      <w:r>
-        <w:rPr>
-          <w:lang w:val="en-US"/>
-        </w:rPr>
-        <w:t xml:space="preserve">To do so, </w:t>
-      </w:r>
-      <w:r>
-        <w:rPr>
-          <w:lang w:val="en-GB"/>
-        </w:rPr>
-        <w:t>m</w:t>
-      </w:r>
-      <w:r>
-        <w:rPr>
-          <w:lang w:val="en-GB"/>
-        </w:rPr>
-        <w:t xml:space="preserve">odify </w:t>
-      </w:r>
-      <w:proofErr w:type="gramStart"/>
+        <w:t>USER_RSTLOC</w:t>
+      </w:r>
       <w:r>
         <w:rPr>
           <w:rFonts w:ascii="Courier New" w:eastAsia="Times New Roman" w:hAnsi="Courier New" w:cs="Courier New"/>
           <w:lang w:val="en-GB"/>
         </w:rPr>
-        <w:t>atmos.F</w:t>
-      </w:r>
-      <w:proofErr w:type="gramEnd"/>
-      <w:r>
-        <w:rPr>
-          <w:rFonts w:ascii="Courier New" w:eastAsia="Times New Roman" w:hAnsi="Courier New" w:cs="Courier New"/>
-          <w:lang w:val="en-GB"/>
-        </w:rPr>
-        <w:t>90</w:t>
-      </w:r>
-      <w:r>
-        <w:rPr>
-          <w:lang w:val="en-GB"/>
-        </w:rPr>
-        <w:t xml:space="preserve"> and </w:t>
-      </w:r>
-      <w:r>
-        <w:rPr>
-          <w:rFonts w:ascii="Courier New" w:eastAsia="Times New Roman" w:hAnsi="Courier New" w:cs="Courier New"/>
-          <w:lang w:val="en-GB"/>
-        </w:rPr>
-        <w:t>ocean.F90</w:t>
-      </w:r>
-      <w:r>
-        <w:rPr>
-          <w:lang w:val="en-GB"/>
-        </w:rPr>
-        <w:t xml:space="preserve"> so to implement the initialisation, definition and declaration calls of OASIS3-MCT library. In the time step of the models, implement the reception of the input coupling fields (</w:t>
-      </w:r>
-      <w:proofErr w:type="spellStart"/>
-      <w:r>
-        <w:rPr>
-          <w:rFonts w:ascii="Courier New" w:eastAsia="Times New Roman" w:hAnsi="Courier New" w:cs="Courier New"/>
-          <w:lang w:val="en-GB"/>
-        </w:rPr>
-        <w:t>oasis_get</w:t>
-      </w:r>
-      <w:proofErr w:type="spellEnd"/>
-      <w:r>
-        <w:rPr>
-          <w:lang w:val="en-GB"/>
-        </w:rPr>
-        <w:t>) at the beginning of the time step and the sending of the output coupling field (</w:t>
-      </w:r>
-      <w:proofErr w:type="spellStart"/>
-      <w:r>
-        <w:rPr>
-          <w:rFonts w:ascii="Courier New" w:eastAsia="Times New Roman" w:hAnsi="Courier New" w:cs="Courier New"/>
-          <w:lang w:val="en-GB"/>
-        </w:rPr>
-        <w:t>oasis_put</w:t>
-      </w:r>
-      <w:proofErr w:type="spellEnd"/>
-      <w:r>
-        <w:rPr>
-          <w:lang w:val="en-GB"/>
-        </w:rPr>
-        <w:t>) at the end of the time step. The lines where to introduce the OASIS3-MCT specific calls are marked with</w:t>
-      </w:r>
-      <w:r>
-        <w:rPr>
-          <w:lang w:val="en-GB"/>
-        </w:rPr>
-        <w:t xml:space="preserve"> a line specifying the call to implement, for example:</w:t>
+        <w:t>,</w:t>
       </w:r>
     </w:p>
     <w:p>
       <w:pPr>
-        <w:spacing w:before="120"/>
-        <w:jc w:val="both"/>
+        <w:pStyle w:val="ListParagraph"/>
+        <w:numPr>
+          <w:ilvl w:val="0"/>
+          <w:numId w:val="26"/>
+        </w:numPr>
+        <w:rPr>
+          <w:rFonts w:ascii="Calibri" w:eastAsia="Calibri" w:hAnsi="Calibri" w:cs="Calibri"/>
+          <w:lang w:val="en-US"/>
+        </w:rPr>
+      </w:pPr>
+      <w:r>
+        <w:rPr>
+          <w:rFonts w:ascii="Calibri" w:eastAsia="Calibri" w:hAnsi="Calibri" w:cs="Calibri"/>
+          <w:lang w:val="en-US"/>
+        </w:rPr>
+        <w:t xml:space="preserve">the </w:t>
+      </w:r>
+      <w:r>
+        <w:rPr>
+          <w:rFonts w:ascii="Calibri" w:eastAsia="Calibri" w:hAnsi="Calibri" w:cs="Calibri"/>
+          <w:lang w:val="en-US"/>
+        </w:rPr>
+        <w:t xml:space="preserve">directory that contains the file defining the model grid </w:t>
+      </w:r>
+      <w:r>
         <w:rPr>
           <w:rFonts w:ascii="Courier New" w:eastAsia="Times New Roman" w:hAnsi="Courier New" w:cs="Courier New"/>
           <w:lang w:val="en-GB"/>
         </w:rPr>
-      </w:pPr>
-      <w:r>
-        <w:rPr>
-          <w:rFonts w:ascii="Courier New" w:eastAsia="Times New Roman" w:hAnsi="Courier New" w:cs="Courier New"/>
-          <w:lang w:val="en-GB"/>
-        </w:rPr>
-        <w:t>!!!!!!!!!!!!!!!OASIS_DEF_PARTITION!!!!!!!!!!!!!!!!!!!</w:t>
-      </w:r>
-    </w:p>
-    <w:p>
-      <w:pPr>
-        <w:pStyle w:val="NormalWeb"/>
-        <w:spacing w:before="120" w:beforeAutospacing="0" w:after="0" w:afterAutospacing="0"/>
-        <w:rPr>
-          <w:rFonts w:asciiTheme="minorHAnsi" w:hAnsiTheme="minorHAnsi" w:cstheme="minorHAnsi"/>
-          <w:lang w:val="en-GB"/>
-        </w:rPr>
-      </w:pPr>
-      <w:r>
-        <w:rPr>
-          <w:rFonts w:asciiTheme="minorHAnsi" w:eastAsiaTheme="minorHAnsi" w:hAnsiTheme="minorHAnsi" w:cstheme="minorBidi"/>
-          <w:lang w:val="en-GB"/>
-        </w:rPr>
-        <w:lastRenderedPageBreak/>
-        <w:t>Once instrumented, r</w:t>
-      </w:r>
-      <w:r>
-        <w:rPr>
-          <w:rFonts w:asciiTheme="minorHAnsi" w:eastAsiaTheme="minorHAnsi" w:hAnsiTheme="minorHAnsi" w:cstheme="minorBidi"/>
-          <w:lang w:val="en-GB"/>
-        </w:rPr>
-        <w:t>ecompile</w:t>
-      </w:r>
-      <w:r>
-        <w:rPr>
-          <w:lang w:val="en-GB"/>
-        </w:rPr>
-        <w:t xml:space="preserve"> </w:t>
-      </w:r>
-      <w:proofErr w:type="gramStart"/>
-      <w:r>
-        <w:rPr>
-          <w:rFonts w:ascii="Courier New" w:hAnsi="Courier New" w:cs="Courier New"/>
-          <w:lang w:val="en-GB"/>
-        </w:rPr>
-        <w:t>atmos.F</w:t>
-      </w:r>
-      <w:proofErr w:type="gramEnd"/>
-      <w:r>
-        <w:rPr>
-          <w:rFonts w:ascii="Courier New" w:hAnsi="Courier New" w:cs="Courier New"/>
-          <w:lang w:val="en-GB"/>
-        </w:rPr>
-        <w:t>90</w:t>
-      </w:r>
-      <w:r>
-        <w:rPr>
-          <w:lang w:val="en-GB"/>
-        </w:rPr>
-        <w:t xml:space="preserve"> </w:t>
-      </w:r>
-      <w:r>
-        <w:rPr>
-          <w:lang w:val="en-GB"/>
-        </w:rPr>
-        <w:t xml:space="preserve">and </w:t>
-      </w:r>
-      <w:r>
-        <w:rPr>
-          <w:rFonts w:ascii="Courier New" w:hAnsi="Courier New" w:cs="Courier New"/>
-          <w:lang w:val="en-GB"/>
-        </w:rPr>
-        <w:t>ocean.F90</w:t>
-      </w:r>
-      <w:r>
-        <w:rPr>
-          <w:lang w:val="en-GB"/>
-        </w:rPr>
-        <w:t xml:space="preserve"> . </w:t>
-      </w:r>
-      <w:r>
-        <w:rPr>
-          <w:rFonts w:asciiTheme="minorHAnsi" w:hAnsiTheme="minorHAnsi" w:cstheme="minorHAnsi"/>
-          <w:lang w:val="en-GB"/>
-        </w:rPr>
-        <w:t>To run the two tutorial component</w:t>
-      </w:r>
-      <w:r>
-        <w:rPr>
-          <w:rFonts w:asciiTheme="minorHAnsi" w:hAnsiTheme="minorHAnsi" w:cstheme="minorHAnsi"/>
-          <w:lang w:val="en-GB"/>
-        </w:rPr>
-        <w:t xml:space="preserve">s as a </w:t>
-      </w:r>
-      <w:proofErr w:type="gramStart"/>
-      <w:r>
-        <w:rPr>
-          <w:rFonts w:asciiTheme="minorHAnsi" w:hAnsiTheme="minorHAnsi" w:cstheme="minorHAnsi"/>
-          <w:lang w:val="en-GB"/>
-        </w:rPr>
-        <w:t>coupled models</w:t>
-      </w:r>
-      <w:proofErr w:type="gramEnd"/>
-      <w:r>
-        <w:rPr>
-          <w:rFonts w:asciiTheme="minorHAnsi" w:hAnsiTheme="minorHAnsi" w:cstheme="minorHAnsi"/>
-          <w:lang w:val="en-GB"/>
-        </w:rPr>
-        <w:t>, e</w:t>
-      </w:r>
-      <w:r>
-        <w:rPr>
-          <w:lang w:val="en-GB"/>
-        </w:rPr>
-        <w:t xml:space="preserve">dit the script </w:t>
-      </w:r>
-      <w:proofErr w:type="spellStart"/>
-      <w:r>
-        <w:rPr>
-          <w:rFonts w:ascii="Courier New" w:hAnsi="Courier New" w:cs="Courier New"/>
-          <w:lang w:val="en-GB"/>
-        </w:rPr>
-        <w:t>run_tutorial_oa</w:t>
-      </w:r>
-      <w:proofErr w:type="spellEnd"/>
-      <w:r>
-        <w:rPr>
-          <w:lang w:val="en-GB"/>
-        </w:rPr>
-        <w:t xml:space="preserve"> </w:t>
-      </w:r>
-      <w:r>
-        <w:rPr>
-          <w:rFonts w:asciiTheme="minorHAnsi" w:hAnsiTheme="minorHAnsi" w:cstheme="minorHAnsi"/>
-          <w:lang w:val="en-GB"/>
-        </w:rPr>
-        <w:t>to adapt it to your platform and execute it</w:t>
-      </w:r>
-    </w:p>
-    <w:p>
-      <w:pPr>
-        <w:ind w:firstLine="708"/>
-        <w:jc w:val="both"/>
-        <w:rPr>
-          <w:lang w:val="en-US"/>
-        </w:rPr>
-      </w:pPr>
-      <w:proofErr w:type="gramStart"/>
-      <w:r>
-        <w:rPr>
-          <w:rFonts w:ascii="Courier New" w:hAnsi="Courier New" w:cs="Courier New"/>
-          <w:lang w:val="en-GB"/>
-        </w:rPr>
-        <w:t>&gt;./</w:t>
-      </w:r>
-      <w:proofErr w:type="spellStart"/>
-      <w:proofErr w:type="gramEnd"/>
-      <w:r>
-        <w:rPr>
-          <w:rFonts w:ascii="Courier New" w:hAnsi="Courier New" w:cs="Courier New"/>
-          <w:lang w:val="en-GB"/>
-        </w:rPr>
-        <w:t>run_tutorial_oa</w:t>
-      </w:r>
-      <w:proofErr w:type="spellEnd"/>
+        <w:t>USER_MESHLOC</w:t>
+      </w:r>
+      <w:r>
+        <w:rPr>
+          <w:rFonts w:ascii="Calibri" w:eastAsia="Calibri" w:hAnsi="Calibri" w:cs="Calibri"/>
+          <w:lang w:val="en-US"/>
+        </w:rPr>
+        <w:t xml:space="preserve">. </w:t>
+      </w:r>
     </w:p>
     <w:p>
       <w:pPr>
@@ -3389,7 +3648,7 @@
         <w:rPr>
           <w:lang w:val="en-GB"/>
         </w:rPr>
-        <w:t xml:space="preserve">Note that </w:t>
+        <w:t xml:space="preserve">Note that the </w:t>
       </w:r>
       <w:proofErr w:type="spellStart"/>
       <w:r>
@@ -3397,20 +3656,54 @@
           <w:rFonts w:ascii="Courier New" w:hAnsi="Courier New" w:cs="Courier New"/>
           <w:lang w:val="en-GB"/>
         </w:rPr>
-        <w:t>run_tutorial_oa</w:t>
+        <w:t>namcouple</w:t>
       </w:r>
       <w:proofErr w:type="spellEnd"/>
       <w:r>
         <w:rPr>
           <w:lang w:val="en-GB"/>
         </w:rPr>
-        <w:t xml:space="preserve"> copies the </w:t>
-      </w:r>
-      <w:r>
-        <w:rPr>
-          <w:lang w:val="en-GB"/>
-        </w:rPr>
-        <w:t xml:space="preserve">configuration file </w:t>
+        <w:t xml:space="preserve"> </w:t>
+      </w:r>
+      <w:r>
+        <w:rPr>
+          <w:lang w:val="en-GB"/>
+        </w:rPr>
+        <w:t>file</w:t>
+      </w:r>
+      <w:r>
+        <w:rPr>
+          <w:lang w:val="en-GB"/>
+        </w:rPr>
+        <w:t xml:space="preserve"> from</w:t>
+      </w:r>
+      <w:r>
+        <w:rPr>
+          <w:rFonts w:ascii="Courier New" w:hAnsi="Courier New" w:cs="Courier New"/>
+          <w:lang w:val="en-GB"/>
+        </w:rPr>
+        <w:t xml:space="preserve"> $</w:t>
+      </w:r>
+      <w:r>
+        <w:rPr>
+          <w:rFonts w:ascii="Courier New" w:hAnsi="Courier New" w:cs="Courier New"/>
+          <w:lang w:val="en-GB"/>
+        </w:rPr>
+        <w:t>USER_</w:t>
+      </w:r>
+      <w:r>
+        <w:rPr>
+          <w:rFonts w:ascii="Courier New" w:hAnsi="Courier New" w:cs="Courier New"/>
+          <w:lang w:val="en-GB"/>
+        </w:rPr>
+        <w:t>NAMLOC</w:t>
+      </w:r>
+      <w:r>
+        <w:rPr>
+          <w:rFonts w:ascii="Courier New" w:hAnsi="Courier New" w:cs="Courier New"/>
+          <w:lang w:val="en-GB"/>
+        </w:rPr>
+        <w:t>=</w:t>
       </w:r>
       <w:proofErr w:type="spellStart"/>
       <w:r>
@@ -3418,13 +3711,7 @@
           <w:rFonts w:ascii="Courier New" w:hAnsi="Courier New" w:cs="Courier New"/>
           <w:lang w:val="en-GB"/>
         </w:rPr>
-        <w:t>namcouple</w:t>
-      </w:r>
-      <w:r>
-        <w:rPr>
-          <w:lang w:val="en-GB"/>
-        </w:rPr>
-        <w:t>_LAG</w:t>
+        <w:t>data_tutorial</w:t>
       </w:r>
       <w:proofErr w:type="spellEnd"/>
       <w:r>
@@ -3437,100 +3724,7 @@
         <w:rPr>
           <w:lang w:val="en-GB"/>
         </w:rPr>
-        <w:t xml:space="preserve">from </w:t>
-      </w:r>
-      <w:r>
-        <w:rPr>
-          <w:lang w:val="en-GB"/>
-        </w:rPr>
-        <w:t xml:space="preserve">directory </w:t>
-      </w:r>
-      <w:r>
-        <w:rPr>
-          <w:rFonts w:ascii="Courier New" w:hAnsi="Courier New" w:cs="Courier New"/>
-          <w:lang w:val="en-GB"/>
-        </w:rPr>
-        <w:t>/</w:t>
-      </w:r>
-      <w:proofErr w:type="spellStart"/>
-      <w:r>
-        <w:rPr>
-          <w:rFonts w:ascii="Courier New" w:hAnsi="Courier New" w:cs="Courier New"/>
-          <w:lang w:val="en-GB"/>
-        </w:rPr>
-        <w:t>data_</w:t>
-      </w:r>
-      <w:r>
-        <w:rPr>
-          <w:rFonts w:ascii="Courier New" w:hAnsi="Courier New" w:cs="Courier New"/>
-          <w:lang w:val="en-GB"/>
-        </w:rPr>
-        <w:t>tutorial</w:t>
-      </w:r>
-      <w:proofErr w:type="spellEnd"/>
-      <w:r>
-        <w:rPr>
-          <w:lang w:val="en-GB"/>
-        </w:rPr>
-        <w:t xml:space="preserve">, </w:t>
-      </w:r>
-      <w:r>
-        <w:rPr>
-          <w:lang w:val="en-GB"/>
-        </w:rPr>
-        <w:t xml:space="preserve">in the </w:t>
-      </w:r>
-      <w:r>
-        <w:rPr>
-          <w:rFonts w:ascii="Courier New" w:hAnsi="Courier New" w:cs="Courier New"/>
-          <w:lang w:val="en-GB"/>
-        </w:rPr>
-        <w:t>$</w:t>
-      </w:r>
-      <w:proofErr w:type="spellStart"/>
-      <w:r>
-        <w:rPr>
-          <w:rFonts w:ascii="Courier New" w:hAnsi="Courier New" w:cs="Courier New"/>
-          <w:lang w:val="en-GB"/>
-        </w:rPr>
-        <w:t>rundir</w:t>
-      </w:r>
-      <w:proofErr w:type="spellEnd"/>
-      <w:r>
-        <w:rPr>
-          <w:lang w:val="en-GB"/>
-        </w:rPr>
-        <w:t xml:space="preserve"> directory as </w:t>
-      </w:r>
-      <w:proofErr w:type="spellStart"/>
-      <w:r>
-        <w:rPr>
-          <w:rFonts w:ascii="Courier New" w:hAnsi="Courier New" w:cs="Courier New"/>
-          <w:lang w:val="en-GB"/>
-        </w:rPr>
-        <w:t>namcouple</w:t>
-      </w:r>
-      <w:proofErr w:type="spellEnd"/>
-      <w:r>
-        <w:rPr>
-          <w:lang w:val="en-GB"/>
-        </w:rPr>
-        <w:t xml:space="preserve">.  This </w:t>
-      </w:r>
-      <w:proofErr w:type="spellStart"/>
-      <w:r>
-        <w:rPr>
-          <w:rFonts w:ascii="Courier New" w:hAnsi="Courier New" w:cs="Courier New"/>
-          <w:lang w:val="en-GB"/>
-        </w:rPr>
-        <w:t>namcouple</w:t>
-      </w:r>
-      <w:proofErr w:type="spellEnd"/>
-      <w:r>
-        <w:rPr>
-          <w:lang w:val="en-GB"/>
-        </w:rPr>
-        <w:t xml:space="preserve"> specifies that </w:t>
+        <w:t xml:space="preserve">specifies that </w:t>
       </w:r>
       <w:r>
         <w:rPr>
@@ -3575,6 +3769,7 @@
           <w:rFonts w:ascii="Courier New" w:hAnsi="Courier New" w:cs="Courier New"/>
           <w:lang w:val="en-GB"/>
         </w:rPr>
+        <w:lastRenderedPageBreak/>
         <w:t>my_remapping_file_bilinear.nc</w:t>
       </w:r>
       <w:r>
@@ -3709,13 +3904,64 @@
         <w:rPr>
           <w:lang w:val="en-GB"/>
         </w:rPr>
-        <w:t xml:space="preserve">in your </w:t>
-      </w:r>
-      <w:r>
-        <w:rPr>
-          <w:lang w:val="en-GB"/>
-        </w:rPr>
-        <w:t>$</w:t>
+        <w:t>in your subdirectory</w:t>
+      </w:r>
+      <w:r>
+        <w:rPr>
+          <w:lang w:val="en-GB"/>
+        </w:rPr>
+        <w:t xml:space="preserve"> </w:t>
+      </w:r>
+      <w:r>
+        <w:rPr>
+          <w:rFonts w:ascii="Courier New" w:hAnsi="Courier New" w:cs="Courier New"/>
+          <w:lang w:val="en-GB"/>
+        </w:rPr>
+        <w:t>TESTS/</w:t>
+      </w:r>
+      <w:r>
+        <w:rPr>
+          <w:rFonts w:ascii="Courier New" w:hAnsi="Courier New" w:cs="Courier New"/>
+          <w:lang w:val="en-GB"/>
+        </w:rPr>
+        <w:t>work_tutorial_communication_namcouple_Makefile_atmos_1_ocean_1</w:t>
+      </w:r>
+      <w:r>
+        <w:rPr>
+          <w:lang w:val="en-GB"/>
+        </w:rPr>
+        <w:t>.</w:t>
+      </w:r>
+      <w:r>
+        <w:rPr>
+          <w:lang w:val="en-GB"/>
+        </w:rPr>
+        <w:t xml:space="preserve"> </w:t>
+      </w:r>
+      <w:r>
+        <w:rPr>
+          <w:lang w:val="en-GB"/>
+        </w:rPr>
+        <w:t>T</w:t>
+      </w:r>
+      <w:r>
+        <w:rPr>
+          <w:lang w:val="en-GB"/>
+        </w:rPr>
+        <w:t xml:space="preserve">he file </w:t>
+      </w:r>
+      <w:r>
+        <w:rPr>
+          <w:rFonts w:ascii="Courier New" w:hAnsi="Courier New" w:cs="Courier New"/>
+          <w:lang w:val="en-GB"/>
+        </w:rPr>
+        <w:t>nout.000000</w:t>
+      </w:r>
+      <w:r>
+        <w:rPr>
+          <w:lang w:val="en-GB"/>
+        </w:rPr>
+        <w:t xml:space="preserve">, written by the master process of one model, contains the information read in the configuration file </w:t>
       </w:r>
       <w:proofErr w:type="spellStart"/>
       <w:r>
@@ -3723,12 +3969,66 @@
           <w:rFonts w:ascii="Courier New" w:hAnsi="Courier New" w:cs="Courier New"/>
           <w:lang w:val="en-GB"/>
         </w:rPr>
-        <w:t>rundir</w:t>
+        <w:t>namcouple</w:t>
       </w:r>
       <w:proofErr w:type="spellEnd"/>
       <w:r>
         <w:rPr>
-          <w:rFonts w:ascii="Courier New" w:hAnsi="Courier New" w:cs="Courier New"/>
+          <w:lang w:val="en-GB"/>
+        </w:rPr>
+        <w:t xml:space="preserve">. The OASIS3-MCT debug files </w:t>
+      </w:r>
+      <w:r>
+        <w:rPr>
+          <w:rFonts w:ascii="Courier New" w:hAnsi="Courier New" w:cs="Courier New"/>
+          <w:lang w:val="en-GB"/>
+        </w:rPr>
+        <w:t>debug.01</w:t>
+      </w:r>
+      <w:r>
+        <w:rPr>
+          <w:rFonts w:ascii="Courier New" w:hAnsi="Courier New" w:cs="Courier New"/>
+          <w:lang w:val="en-GB"/>
+        </w:rPr>
+        <w:t>.00000</w:t>
+      </w:r>
+      <w:r>
+        <w:rPr>
+          <w:rFonts w:ascii="Courier New" w:hAnsi="Courier New" w:cs="Courier New"/>
+          <w:lang w:val="en-GB"/>
+        </w:rPr>
+        <w:t>0</w:t>
+      </w:r>
+      <w:r>
+        <w:rPr>
+          <w:lang w:val="en-GB"/>
+        </w:rPr>
+        <w:t xml:space="preserve"> and </w:t>
+      </w:r>
+      <w:r>
+        <w:rPr>
+          <w:rFonts w:ascii="Courier New" w:hAnsi="Courier New" w:cs="Courier New"/>
+          <w:lang w:val="en-GB"/>
+        </w:rPr>
+        <w:t>debug.02</w:t>
+      </w:r>
+      <w:r>
+        <w:rPr>
+          <w:rFonts w:ascii="Courier New" w:hAnsi="Courier New" w:cs="Courier New"/>
+          <w:lang w:val="en-GB"/>
+        </w:rPr>
+        <w:t>.00000</w:t>
+      </w:r>
+      <w:r>
+        <w:rPr>
+          <w:rFonts w:ascii="Courier New" w:hAnsi="Courier New" w:cs="Courier New"/>
+          <w:lang w:val="en-GB"/>
+        </w:rPr>
+        <w:t>0</w:t>
+      </w:r>
+      <w:r>
+        <w:rPr>
+          <w:rFonts w:cstheme="minorHAnsi"/>
           <w:lang w:val="en-GB"/>
         </w:rPr>
         <w:t xml:space="preserve"> </w:t>
@@ -3737,8 +4037,100 @@
         <w:rPr>
           <w:lang w:val="en-GB"/>
         </w:rPr>
-        <w:t>subdirectory</w:t>
-      </w:r>
+        <w:t xml:space="preserve">are written </w:t>
+      </w:r>
+      <w:r>
+        <w:rPr>
+          <w:lang w:val="en-GB"/>
+        </w:rPr>
+        <w:t xml:space="preserve">respectively </w:t>
+      </w:r>
+      <w:r>
+        <w:rPr>
+          <w:lang w:val="en-GB"/>
+        </w:rPr>
+        <w:t xml:space="preserve">by </w:t>
+      </w:r>
+      <w:r>
+        <w:rPr>
+          <w:lang w:val="en-GB"/>
+        </w:rPr>
+        <w:t>the</w:t>
+      </w:r>
+      <w:r>
+        <w:rPr>
+          <w:lang w:val="en-GB"/>
+        </w:rPr>
+        <w:t xml:space="preserve"> </w:t>
+      </w:r>
+      <w:r>
+        <w:rPr>
+          <w:rFonts w:ascii="Courier New" w:hAnsi="Courier New" w:cs="Courier New"/>
+          <w:lang w:val="en-GB"/>
+        </w:rPr>
+        <w:t>ocean</w:t>
+      </w:r>
+      <w:r>
+        <w:rPr>
+          <w:lang w:val="en-GB"/>
+        </w:rPr>
+        <w:t xml:space="preserve"> and </w:t>
+      </w:r>
+      <w:proofErr w:type="spellStart"/>
+      <w:r>
+        <w:rPr>
+          <w:rFonts w:ascii="Courier New" w:hAnsi="Courier New" w:cs="Courier New"/>
+          <w:lang w:val="en-GB"/>
+        </w:rPr>
+        <w:t>atmos</w:t>
+      </w:r>
+      <w:proofErr w:type="spellEnd"/>
+      <w:r>
+        <w:rPr>
+          <w:lang w:val="en-GB"/>
+        </w:rPr>
+        <w:t xml:space="preserve"> </w:t>
+      </w:r>
+      <w:r>
+        <w:rPr>
+          <w:lang w:val="en-GB"/>
+        </w:rPr>
+        <w:t xml:space="preserve">process </w:t>
+      </w:r>
+      <w:r>
+        <w:rPr>
+          <w:lang w:val="en-GB"/>
+        </w:rPr>
+        <w:t>respectively</w:t>
+      </w:r>
+      <w:r>
+        <w:rPr>
+          <w:lang w:val="en-GB"/>
+        </w:rPr>
+        <w:t xml:space="preserve">. The level of debug information in these files corresponds to the value of the first number on the line below </w:t>
+      </w:r>
+      <w:r>
+        <w:rPr>
+          <w:rFonts w:ascii="Courier New" w:hAnsi="Courier New" w:cs="Courier New"/>
+          <w:lang w:val="en-GB"/>
+        </w:rPr>
+        <w:t>$NLOGPRT</w:t>
+      </w:r>
+      <w:r>
+        <w:rPr>
+          <w:lang w:val="en-GB"/>
+        </w:rPr>
+        <w:t xml:space="preserve"> in the </w:t>
+      </w:r>
+      <w:proofErr w:type="spellStart"/>
+      <w:r>
+        <w:rPr>
+          <w:rFonts w:ascii="Courier New" w:hAnsi="Courier New" w:cs="Courier New"/>
+          <w:lang w:val="en-GB"/>
+        </w:rPr>
+        <w:t>namcouple</w:t>
+      </w:r>
+      <w:proofErr w:type="spellEnd"/>
       <w:r>
         <w:rPr>
           <w:lang w:val="en-GB"/>
@@ -3751,201 +4143,20 @@
         </w:rPr>
         <w:t xml:space="preserve"> </w:t>
       </w:r>
-      <w:r>
-        <w:rPr>
-          <w:lang w:val="en-GB"/>
-        </w:rPr>
-        <w:t>T</w:t>
-      </w:r>
-      <w:r>
-        <w:rPr>
-          <w:lang w:val="en-GB"/>
-        </w:rPr>
-        <w:t xml:space="preserve">he file </w:t>
-      </w:r>
-      <w:r>
-        <w:rPr>
-          <w:rFonts w:ascii="Courier New" w:hAnsi="Courier New" w:cs="Courier New"/>
-          <w:lang w:val="en-GB"/>
-        </w:rPr>
-        <w:t>nout.000000</w:t>
-      </w:r>
-      <w:r>
-        <w:rPr>
-          <w:lang w:val="en-GB"/>
-        </w:rPr>
-        <w:t xml:space="preserve">, written by the master process of one model, contains the information read in the configuration file </w:t>
-      </w:r>
-      <w:proofErr w:type="spellStart"/>
-      <w:r>
-        <w:rPr>
-          <w:rFonts w:ascii="Courier New" w:hAnsi="Courier New" w:cs="Courier New"/>
-          <w:lang w:val="en-GB"/>
-        </w:rPr>
-        <w:t>namcouple</w:t>
-      </w:r>
-      <w:proofErr w:type="spellEnd"/>
-      <w:r>
-        <w:rPr>
-          <w:lang w:val="en-GB"/>
-        </w:rPr>
-        <w:t xml:space="preserve">. The OASIS3-MCT debug files </w:t>
-      </w:r>
-      <w:r>
-        <w:rPr>
-          <w:rFonts w:ascii="Courier New" w:hAnsi="Courier New" w:cs="Courier New"/>
-          <w:lang w:val="en-GB"/>
-        </w:rPr>
-        <w:t>debug.01</w:t>
-      </w:r>
-      <w:r>
-        <w:rPr>
-          <w:rFonts w:ascii="Courier New" w:hAnsi="Courier New" w:cs="Courier New"/>
-          <w:lang w:val="en-GB"/>
-        </w:rPr>
-        <w:t>.00000?</w:t>
-      </w:r>
-      <w:r>
-        <w:rPr>
-          <w:lang w:val="en-GB"/>
-        </w:rPr>
-        <w:t xml:space="preserve"> and </w:t>
-      </w:r>
-      <w:r>
-        <w:rPr>
-          <w:rFonts w:ascii="Courier New" w:hAnsi="Courier New" w:cs="Courier New"/>
-          <w:lang w:val="en-GB"/>
-        </w:rPr>
-        <w:t>debug.02</w:t>
-      </w:r>
-      <w:r>
-        <w:rPr>
-          <w:rFonts w:ascii="Courier New" w:hAnsi="Courier New" w:cs="Courier New"/>
-          <w:lang w:val="en-GB"/>
-        </w:rPr>
-        <w:t>.00000?</w:t>
-      </w:r>
-      <w:r>
-        <w:rPr>
-          <w:rFonts w:ascii="Courier New" w:hAnsi="Courier New" w:cs="Courier New"/>
-          <w:lang w:val="en-GB"/>
-        </w:rPr>
-        <w:t xml:space="preserve"> </w:t>
-      </w:r>
-      <w:r>
-        <w:rPr>
-          <w:lang w:val="en-GB"/>
-        </w:rPr>
-        <w:t>(</w:t>
-      </w:r>
-      <w:proofErr w:type="gramStart"/>
-      <w:r>
-        <w:rPr>
-          <w:rFonts w:cstheme="minorHAnsi"/>
-          <w:lang w:val="en-GB"/>
-        </w:rPr>
-        <w:t xml:space="preserve">where </w:t>
-      </w:r>
-      <w:r>
-        <w:rPr>
-          <w:rFonts w:ascii="Courier New" w:hAnsi="Courier New" w:cs="Courier New"/>
-          <w:lang w:val="en-GB"/>
-        </w:rPr>
-        <w:t>?</w:t>
-      </w:r>
-      <w:proofErr w:type="gramEnd"/>
-      <w:r>
-        <w:rPr>
-          <w:rFonts w:cstheme="minorHAnsi"/>
-          <w:lang w:val="en-GB"/>
-        </w:rPr>
-        <w:t xml:space="preserve"> goes from 0 to 3, one for each process) </w:t>
-      </w:r>
-      <w:r>
-        <w:rPr>
-          <w:lang w:val="en-GB"/>
-        </w:rPr>
-        <w:t xml:space="preserve">are written by </w:t>
-      </w:r>
-      <w:r>
-        <w:rPr>
-          <w:lang w:val="en-GB"/>
-        </w:rPr>
-        <w:t>each</w:t>
-      </w:r>
-      <w:r>
-        <w:rPr>
-          <w:lang w:val="en-GB"/>
-        </w:rPr>
-        <w:t xml:space="preserve"> process of </w:t>
-      </w:r>
-      <w:r>
-        <w:rPr>
-          <w:rFonts w:ascii="Courier New" w:hAnsi="Courier New" w:cs="Courier New"/>
-          <w:lang w:val="en-GB"/>
-        </w:rPr>
-        <w:t>ocean</w:t>
-      </w:r>
-      <w:r>
-        <w:rPr>
-          <w:lang w:val="en-GB"/>
-        </w:rPr>
-        <w:t xml:space="preserve"> and </w:t>
-      </w:r>
-      <w:proofErr w:type="spellStart"/>
-      <w:r>
-        <w:rPr>
-          <w:rFonts w:ascii="Courier New" w:hAnsi="Courier New" w:cs="Courier New"/>
-          <w:lang w:val="en-GB"/>
-        </w:rPr>
-        <w:t>atmos</w:t>
-      </w:r>
-      <w:proofErr w:type="spellEnd"/>
-      <w:r>
-        <w:rPr>
-          <w:lang w:val="en-GB"/>
-        </w:rPr>
-        <w:t xml:space="preserve"> respectively</w:t>
-      </w:r>
-      <w:r>
-        <w:rPr>
-          <w:lang w:val="en-GB"/>
-        </w:rPr>
-        <w:t xml:space="preserve">. The level of debug information in these files corresponds to the value of the first number on the line below </w:t>
-      </w:r>
-      <w:r>
-        <w:rPr>
-          <w:rFonts w:ascii="Courier New" w:hAnsi="Courier New" w:cs="Courier New"/>
-          <w:lang w:val="en-GB"/>
-        </w:rPr>
-        <w:t>$NLOGPRT</w:t>
-      </w:r>
-      <w:r>
-        <w:rPr>
-          <w:lang w:val="en-GB"/>
-        </w:rPr>
-        <w:t xml:space="preserve"> in the </w:t>
-      </w:r>
-      <w:proofErr w:type="spellStart"/>
-      <w:r>
-        <w:rPr>
-          <w:rFonts w:ascii="Courier New" w:hAnsi="Courier New" w:cs="Courier New"/>
-          <w:lang w:val="en-GB"/>
-        </w:rPr>
-        <w:t>namcouple</w:t>
-      </w:r>
-      <w:proofErr w:type="spellEnd"/>
-      <w:r>
-        <w:rPr>
-          <w:lang w:val="en-GB"/>
-        </w:rPr>
-        <w:t>.</w:t>
-      </w:r>
-      <w:r>
-        <w:rPr>
-          <w:lang w:val="en-GB"/>
-        </w:rPr>
-        <w:t xml:space="preserve"> If your run was successful, these debug files should all end </w:t>
+    </w:p>
+    <w:p>
+      <w:pPr>
+        <w:spacing w:before="120"/>
+        <w:jc w:val="both"/>
+        <w:rPr>
+          <w:lang w:val="en-GB"/>
+        </w:rPr>
+      </w:pPr>
+      <w:r>
+        <w:rPr>
+          <w:lang w:val="en-GB"/>
+        </w:rPr>
+        <w:t xml:space="preserve">If your run was successful, these debug files should all end </w:t>
       </w:r>
       <w:proofErr w:type="gramStart"/>
       <w:r>
@@ -4006,19 +4217,501 @@
     </w:p>
     <w:p>
       <w:pPr>
+        <w:jc w:val="both"/>
+        <w:rPr>
+          <w:rFonts w:ascii="Courier New" w:hAnsi="Courier New" w:cs="Courier New"/>
+          <w:lang w:val="en-GB"/>
+        </w:rPr>
+      </w:pPr>
+      <w:r>
+        <w:rPr>
+          <w:rFonts w:ascii="Courier New" w:hAnsi="Courier New" w:cs="Courier New"/>
+          <w:lang w:val="en-GB"/>
+        </w:rPr>
+        <w:t xml:space="preserve">-- </w:t>
+      </w:r>
+      <w:proofErr w:type="gramStart"/>
+      <w:r>
+        <w:rPr>
+          <w:rFonts w:ascii="Courier New" w:hAnsi="Courier New" w:cs="Courier New"/>
+          <w:lang w:val="en-GB"/>
+        </w:rPr>
+        <w:t>EXIT  (</w:t>
+      </w:r>
+      <w:proofErr w:type="spellStart"/>
+      <w:proofErr w:type="gramEnd"/>
+      <w:r>
+        <w:rPr>
+          <w:rFonts w:ascii="Courier New" w:hAnsi="Courier New" w:cs="Courier New"/>
+          <w:lang w:val="en-GB"/>
+        </w:rPr>
+        <w:t>oasis_terminate</w:t>
+      </w:r>
+      <w:proofErr w:type="spellEnd"/>
+      <w:r>
+        <w:rPr>
+          <w:rFonts w:ascii="Courier New" w:hAnsi="Courier New" w:cs="Courier New"/>
+          <w:lang w:val="en-GB"/>
+        </w:rPr>
+        <w:t>)</w:t>
+      </w:r>
+    </w:p>
+    <w:p>
+      <w:pPr>
         <w:spacing w:before="120"/>
         <w:jc w:val="both"/>
         <w:rPr>
-          <w:rFonts w:ascii="Courier New" w:hAnsi="Courier New" w:cs="Courier New"/>
-          <w:lang w:val="en-GB"/>
-        </w:rPr>
-      </w:pPr>
-      <w:r>
-        <w:rPr>
-          <w:rFonts w:ascii="Courier New" w:hAnsi="Courier New" w:cs="Courier New"/>
-          <w:lang w:val="en-GB"/>
-        </w:rPr>
-        <w:t xml:space="preserve"> -- </w:t>
+          <w:lang w:val="en-GB"/>
+        </w:rPr>
+      </w:pPr>
+      <w:r>
+        <w:rPr>
+          <w:lang w:val="en-GB"/>
+        </w:rPr>
+        <w:t xml:space="preserve">The </w:t>
+      </w:r>
+      <w:r>
+        <w:rPr>
+          <w:lang w:val="en-GB"/>
+        </w:rPr>
+        <w:t>tutorial coupled model</w:t>
+      </w:r>
+      <w:r>
+        <w:rPr>
+          <w:lang w:val="en-GB"/>
+        </w:rPr>
+        <w:t xml:space="preserve"> can be run on different number</w:t>
+      </w:r>
+      <w:r>
+        <w:rPr>
+          <w:lang w:val="en-GB"/>
+        </w:rPr>
+        <w:t>s</w:t>
+      </w:r>
+      <w:r>
+        <w:rPr>
+          <w:lang w:val="en-GB"/>
+        </w:rPr>
+        <w:t xml:space="preserve"> of processes for </w:t>
+      </w:r>
+      <w:proofErr w:type="spellStart"/>
+      <w:r>
+        <w:rPr>
+          <w:rFonts w:ascii="Courier New" w:hAnsi="Courier New" w:cs="Courier New"/>
+          <w:lang w:val="en-GB"/>
+        </w:rPr>
+        <w:t>atmos</w:t>
+      </w:r>
+      <w:proofErr w:type="spellEnd"/>
+      <w:r>
+        <w:rPr>
+          <w:lang w:val="en-GB"/>
+        </w:rPr>
+        <w:t xml:space="preserve"> and </w:t>
+      </w:r>
+      <w:r>
+        <w:rPr>
+          <w:rFonts w:ascii="Courier New" w:hAnsi="Courier New" w:cs="Courier New"/>
+          <w:lang w:val="en-GB"/>
+        </w:rPr>
+        <w:t>ocean</w:t>
+      </w:r>
+      <w:r>
+        <w:rPr>
+          <w:lang w:val="en-GB"/>
+        </w:rPr>
+        <w:t xml:space="preserve"> by changing </w:t>
+      </w:r>
+      <w:r>
+        <w:rPr>
+          <w:rFonts w:ascii="Courier New" w:eastAsia="Times New Roman" w:hAnsi="Courier New" w:cs="Courier New"/>
+          <w:lang w:val="en-GB"/>
+        </w:rPr>
+        <w:t>USER_NPEXE1</w:t>
+      </w:r>
+      <w:r>
+        <w:rPr>
+          <w:rFonts w:ascii="Calibri" w:eastAsia="Calibri" w:hAnsi="Calibri" w:cs="Calibri"/>
+          <w:lang w:val="en-US"/>
+        </w:rPr>
+        <w:t xml:space="preserve"> and </w:t>
+      </w:r>
+      <w:r>
+        <w:rPr>
+          <w:rFonts w:ascii="Courier New" w:eastAsia="Times New Roman" w:hAnsi="Courier New" w:cs="Courier New"/>
+          <w:lang w:val="en-GB"/>
+        </w:rPr>
+        <w:t>USER_NPEXE2</w:t>
+      </w:r>
+      <w:r>
+        <w:rPr>
+          <w:lang w:val="en-GB"/>
+        </w:rPr>
+        <w:t xml:space="preserve"> in the parameter file. For example, if one puts </w:t>
+      </w:r>
+      <w:r>
+        <w:rPr>
+          <w:rFonts w:ascii="Courier New" w:eastAsia="Times New Roman" w:hAnsi="Courier New" w:cs="Courier New"/>
+          <w:lang w:val="en-GB"/>
+        </w:rPr>
+        <w:t>USER_NPEXE1</w:t>
+      </w:r>
+      <w:r>
+        <w:rPr>
+          <w:rFonts w:ascii="Courier New" w:eastAsia="Times New Roman" w:hAnsi="Courier New" w:cs="Courier New"/>
+          <w:lang w:val="en-GB"/>
+        </w:rPr>
+        <w:t>=4</w:t>
+      </w:r>
+      <w:r>
+        <w:rPr>
+          <w:rFonts w:ascii="Calibri" w:eastAsia="Calibri" w:hAnsi="Calibri" w:cs="Calibri"/>
+          <w:lang w:val="en-US"/>
+        </w:rPr>
+        <w:t xml:space="preserve"> and </w:t>
+      </w:r>
+      <w:r>
+        <w:rPr>
+          <w:rFonts w:ascii="Courier New" w:eastAsia="Times New Roman" w:hAnsi="Courier New" w:cs="Courier New"/>
+          <w:lang w:val="en-GB"/>
+        </w:rPr>
+        <w:t>USER_NPEXE2</w:t>
+      </w:r>
+      <w:r>
+        <w:rPr>
+          <w:rFonts w:ascii="Courier New" w:eastAsia="Times New Roman" w:hAnsi="Courier New" w:cs="Courier New"/>
+          <w:lang w:val="en-GB"/>
+        </w:rPr>
+        <w:t>=</w:t>
+      </w:r>
+      <w:proofErr w:type="gramStart"/>
+      <w:r>
+        <w:rPr>
+          <w:rFonts w:ascii="Courier New" w:eastAsia="Times New Roman" w:hAnsi="Courier New" w:cs="Courier New"/>
+          <w:lang w:val="en-GB"/>
+        </w:rPr>
+        <w:t>4,</w:t>
+      </w:r>
+      <w:r>
+        <w:rPr>
+          <w:lang w:val="en-GB"/>
+        </w:rPr>
+        <w:t>each</w:t>
+      </w:r>
+      <w:proofErr w:type="gramEnd"/>
+      <w:r>
+        <w:rPr>
+          <w:lang w:val="en-GB"/>
+        </w:rPr>
+        <w:t xml:space="preserve"> model will run on 4 processes</w:t>
+      </w:r>
+      <w:r>
+        <w:rPr>
+          <w:lang w:val="en-GB"/>
+        </w:rPr>
+        <w:t>. You can experiment this by typing</w:t>
+      </w:r>
+      <w:r>
+        <w:rPr>
+          <w:lang w:val="en-GB"/>
+        </w:rPr>
+        <w:t xml:space="preserve"> </w:t>
+      </w:r>
+      <w:r>
+        <w:rPr>
+          <w:lang w:val="en-GB"/>
+        </w:rPr>
+        <w:t>“./</w:t>
+      </w:r>
+      <w:r>
+        <w:rPr>
+          <w:rFonts w:ascii="Courier New" w:hAnsi="Courier New" w:cs="Courier New"/>
+          <w:lang w:val="en-GB"/>
+        </w:rPr>
+        <w:t>oasis_test_</w:t>
+      </w:r>
+      <w:r>
+        <w:rPr>
+          <w:rFonts w:ascii="Courier New" w:hAnsi="Courier New" w:cs="Courier New"/>
+          <w:lang w:val="en-GB"/>
+        </w:rPr>
+        <w:t>run</w:t>
+      </w:r>
+      <w:r>
+        <w:rPr>
+          <w:rFonts w:ascii="Courier New" w:hAnsi="Courier New" w:cs="Courier New"/>
+          <w:lang w:val="en-GB"/>
+        </w:rPr>
+        <w:t>.sh</w:t>
+      </w:r>
+      <w:r>
+        <w:rPr>
+          <w:rFonts w:ascii="Courier New" w:hAnsi="Courier New" w:cs="Courier New"/>
+          <w:lang w:val="en-GB"/>
+        </w:rPr>
+        <w:t xml:space="preserve"> </w:t>
+      </w:r>
+      <w:r>
+        <w:rPr>
+          <w:rFonts w:ascii="Courier New" w:hAnsi="Courier New" w:cs="Courier New"/>
+          <w:lang w:val="en-GB"/>
+        </w:rPr>
+        <w:t>param_tutorial_communication_test0</w:t>
+      </w:r>
+      <w:r>
+        <w:rPr>
+          <w:rFonts w:ascii="Courier New" w:hAnsi="Courier New" w:cs="Courier New"/>
+          <w:lang w:val="en-GB"/>
+        </w:rPr>
+        <w:t>2</w:t>
+      </w:r>
+      <w:r>
+        <w:rPr>
+          <w:rFonts w:ascii="Courier New" w:hAnsi="Courier New" w:cs="Courier New"/>
+          <w:lang w:val="en-GB"/>
+        </w:rPr>
+        <w:t>”</w:t>
+      </w:r>
+      <w:r>
+        <w:rPr>
+          <w:rFonts w:ascii="Courier New" w:hAnsi="Courier New" w:cs="Courier New"/>
+          <w:lang w:val="en-GB"/>
+        </w:rPr>
+        <w:t xml:space="preserve"> </w:t>
+      </w:r>
+      <w:r>
+        <w:rPr>
+          <w:lang w:val="en-GB"/>
+        </w:rPr>
+        <w:t xml:space="preserve">and the results of the run will be in directory </w:t>
+      </w:r>
+    </w:p>
+    <w:p>
+      <w:pPr>
+        <w:spacing w:before="120"/>
+        <w:jc w:val="both"/>
+        <w:rPr>
+          <w:rFonts w:ascii="Courier New" w:hAnsi="Courier New" w:cs="Courier New"/>
+          <w:lang w:val="en-GB"/>
+        </w:rPr>
+      </w:pPr>
+      <w:r>
+        <w:rPr>
+          <w:rFonts w:ascii="Courier New" w:hAnsi="Courier New" w:cs="Courier New"/>
+          <w:lang w:val="en-GB"/>
+        </w:rPr>
+        <w:t>TESTS/</w:t>
+      </w:r>
+      <w:r>
+        <w:rPr>
+          <w:rFonts w:ascii="Courier New" w:hAnsi="Courier New" w:cs="Courier New"/>
+          <w:lang w:val="en-GB"/>
+        </w:rPr>
+        <w:t>work_tutorial_communication_namcouple_Makefile_atmos_</w:t>
+      </w:r>
+      <w:r>
+        <w:rPr>
+          <w:rFonts w:ascii="Courier New" w:hAnsi="Courier New" w:cs="Courier New"/>
+          <w:lang w:val="en-GB"/>
+        </w:rPr>
+        <w:t>4</w:t>
+      </w:r>
+      <w:r>
+        <w:rPr>
+          <w:rFonts w:ascii="Courier New" w:hAnsi="Courier New" w:cs="Courier New"/>
+          <w:lang w:val="en-GB"/>
+        </w:rPr>
+        <w:t>_ocean_</w:t>
+      </w:r>
+      <w:r>
+        <w:rPr>
+          <w:rFonts w:ascii="Courier New" w:hAnsi="Courier New" w:cs="Courier New"/>
+          <w:lang w:val="en-GB"/>
+        </w:rPr>
+        <w:t>4</w:t>
+      </w:r>
+    </w:p>
+    <w:p>
+      <w:pPr>
+        <w:pStyle w:val="NormalWeb"/>
+        <w:spacing w:after="0" w:afterAutospacing="0"/>
+        <w:rPr>
+          <w:rFonts w:asciiTheme="minorHAnsi" w:eastAsiaTheme="minorHAnsi" w:hAnsiTheme="minorHAnsi" w:cstheme="minorBidi"/>
+          <w:lang w:val="en-GB"/>
+        </w:rPr>
+      </w:pPr>
+      <w:r>
+        <w:rPr>
+          <w:rFonts w:ascii="Calibri" w:hAnsi="Calibri" w:cs="Calibri"/>
+          <w:lang w:val="en-US"/>
+        </w:rPr>
+        <w:t>In that case</w:t>
+      </w:r>
+      <w:r>
+        <w:rPr>
+          <w:rFonts w:ascii="Calibri" w:hAnsi="Calibri" w:cs="Calibri"/>
+          <w:lang w:val="en-US"/>
+        </w:rPr>
+        <w:t>,</w:t>
+      </w:r>
+      <w:r>
+        <w:rPr>
+          <w:rFonts w:ascii="Calibri" w:hAnsi="Calibri" w:cs="Calibri"/>
+          <w:lang w:val="en-US"/>
+        </w:rPr>
+        <w:t xml:space="preserve"> OASIS3-MCT debug files</w:t>
+      </w:r>
+      <w:r>
+        <w:rPr>
+          <w:rFonts w:ascii="Calibri" w:hAnsi="Calibri" w:cs="Calibri"/>
+          <w:lang w:val="en-US"/>
+        </w:rPr>
+        <w:t xml:space="preserve"> will be</w:t>
+      </w:r>
+      <w:r>
+        <w:rPr>
+          <w:rFonts w:ascii="Calibri" w:hAnsi="Calibri" w:cs="Calibri"/>
+          <w:lang w:val="en-US"/>
+        </w:rPr>
+        <w:t xml:space="preserve"> </w:t>
+      </w:r>
+      <w:r>
+        <w:rPr>
+          <w:rFonts w:ascii="CourierNewPSMT" w:hAnsi="CourierNewPSMT"/>
+          <w:lang w:val="en-US"/>
+        </w:rPr>
+        <w:t xml:space="preserve">debug.01.00000? </w:t>
+      </w:r>
+      <w:r>
+        <w:rPr>
+          <w:rFonts w:ascii="Calibri" w:hAnsi="Calibri" w:cs="Calibri"/>
+          <w:lang w:val="en-US"/>
+        </w:rPr>
+        <w:t xml:space="preserve">and </w:t>
+      </w:r>
+      <w:r>
+        <w:rPr>
+          <w:rFonts w:ascii="CourierNewPSMT" w:hAnsi="CourierNewPSMT"/>
+          <w:lang w:val="en-US"/>
+        </w:rPr>
+        <w:t xml:space="preserve">debug.02.00000? </w:t>
+      </w:r>
+      <w:proofErr w:type="gramStart"/>
+      <w:r>
+        <w:rPr>
+          <w:rFonts w:ascii="Calibri" w:hAnsi="Calibri" w:cs="Calibri"/>
+          <w:lang w:val="en-US"/>
+        </w:rPr>
+        <w:t xml:space="preserve">where </w:t>
+      </w:r>
+      <w:r>
+        <w:rPr>
+          <w:rFonts w:ascii="CourierNewPSMT" w:hAnsi="CourierNewPSMT"/>
+          <w:lang w:val="en-US"/>
+        </w:rPr>
+        <w:t>?</w:t>
+      </w:r>
+      <w:proofErr w:type="gramEnd"/>
+      <w:r>
+        <w:rPr>
+          <w:rFonts w:ascii="CourierNewPSMT" w:hAnsi="CourierNewPSMT"/>
+          <w:lang w:val="en-US"/>
+        </w:rPr>
+        <w:t xml:space="preserve"> </w:t>
+      </w:r>
+      <w:r>
+        <w:rPr>
+          <w:rFonts w:ascii="Calibri" w:hAnsi="Calibri" w:cs="Calibri"/>
+          <w:lang w:val="en-US"/>
+        </w:rPr>
+        <w:t>goes from 0 to 3, one for each process</w:t>
+      </w:r>
+      <w:r>
+        <w:rPr>
+          <w:rFonts w:ascii="Calibri" w:hAnsi="Calibri" w:cs="Calibri"/>
+          <w:lang w:val="en-US"/>
+        </w:rPr>
+        <w:t xml:space="preserve">. The files </w:t>
+      </w:r>
+      <w:r>
+        <w:rPr>
+          <w:rFonts w:ascii="Courier New" w:hAnsi="Courier New" w:cs="Courier New"/>
+          <w:lang w:val="en-GB"/>
+        </w:rPr>
+        <w:t>debug.01.00000</w:t>
+      </w:r>
+      <w:r>
+        <w:rPr>
+          <w:rFonts w:ascii="Courier New" w:hAnsi="Courier New" w:cs="Courier New"/>
+          <w:lang w:val="en-GB"/>
+        </w:rPr>
+        <w:t>0</w:t>
+      </w:r>
+      <w:r>
+        <w:rPr>
+          <w:lang w:val="en-GB"/>
+        </w:rPr>
+        <w:t xml:space="preserve"> and </w:t>
+      </w:r>
+      <w:r>
+        <w:rPr>
+          <w:rFonts w:ascii="Courier New" w:hAnsi="Courier New" w:cs="Courier New"/>
+          <w:lang w:val="en-GB"/>
+        </w:rPr>
+        <w:t>debug.02.00000</w:t>
+      </w:r>
+      <w:r>
+        <w:rPr>
+          <w:rFonts w:ascii="Courier New" w:hAnsi="Courier New" w:cs="Courier New"/>
+          <w:lang w:val="en-GB"/>
+        </w:rPr>
+        <w:t>0</w:t>
+      </w:r>
+      <w:r>
+        <w:rPr>
+          <w:rFonts w:cstheme="minorHAnsi"/>
+          <w:lang w:val="en-GB"/>
+        </w:rPr>
+        <w:t xml:space="preserve"> </w:t>
+      </w:r>
+      <w:r>
+        <w:rPr>
+          <w:rFonts w:asciiTheme="minorHAnsi" w:eastAsiaTheme="minorHAnsi" w:hAnsiTheme="minorHAnsi" w:cstheme="minorBidi"/>
+          <w:lang w:val="en-GB"/>
+        </w:rPr>
+        <w:t xml:space="preserve">should end as above but the other debug files will simply end </w:t>
+      </w:r>
+      <w:proofErr w:type="gramStart"/>
+      <w:r>
+        <w:rPr>
+          <w:rFonts w:asciiTheme="minorHAnsi" w:eastAsiaTheme="minorHAnsi" w:hAnsiTheme="minorHAnsi" w:cstheme="minorBidi"/>
+          <w:lang w:val="en-GB"/>
+        </w:rPr>
+        <w:t>with :</w:t>
+      </w:r>
+      <w:proofErr w:type="gramEnd"/>
+      <w:r>
+        <w:rPr>
+          <w:rFonts w:asciiTheme="minorHAnsi" w:eastAsiaTheme="minorHAnsi" w:hAnsiTheme="minorHAnsi" w:cstheme="minorBidi"/>
+          <w:lang w:val="en-GB"/>
+        </w:rPr>
+        <w:t xml:space="preserve"> </w:t>
+      </w:r>
+    </w:p>
+    <w:p>
+      <w:pPr>
+        <w:jc w:val="both"/>
+        <w:rPr>
+          <w:rFonts w:ascii="Courier New" w:hAnsi="Courier New" w:cs="Courier New"/>
+          <w:lang w:val="en-GB"/>
+        </w:rPr>
+      </w:pPr>
+      <w:r>
+        <w:rPr>
+          <w:rFonts w:ascii="Courier New" w:hAnsi="Courier New" w:cs="Courier New"/>
+          <w:lang w:val="en-GB"/>
+        </w:rPr>
+        <w:t xml:space="preserve">-- </w:t>
       </w:r>
       <w:proofErr w:type="gramStart"/>
       <w:r>
@@ -4060,55 +4753,96 @@
         <w:spacing w:before="120"/>
         <w:jc w:val="both"/>
         <w:rPr>
-          <w:lang w:val="en-GB"/>
-        </w:rPr>
-      </w:pPr>
-      <w:r>
-        <w:rPr>
-          <w:lang w:val="en-GB"/>
-        </w:rPr>
-        <w:t xml:space="preserve">We hope that you have successfully instrumented the tutorial toy models and run them in coupled mode. </w:t>
-      </w:r>
-      <w:r>
-        <w:rPr>
-          <w:lang w:val="en-GB"/>
-        </w:rPr>
-        <w:t xml:space="preserve">If you have not, please note that a version of the toy model codes instrumented with OASIS3-MCT API calls is available in the directory, see </w:t>
-      </w:r>
-      <w:proofErr w:type="gramStart"/>
-      <w:r>
-        <w:rPr>
-          <w:rFonts w:ascii="Courier New" w:hAnsi="Courier New" w:cs="Courier New"/>
-          <w:lang w:val="en-GB"/>
-        </w:rPr>
-        <w:t>atmos.F</w:t>
-      </w:r>
-      <w:proofErr w:type="gramEnd"/>
-      <w:r>
-        <w:rPr>
-          <w:rFonts w:ascii="Courier New" w:hAnsi="Courier New" w:cs="Courier New"/>
-          <w:lang w:val="en-GB"/>
-        </w:rPr>
-        <w:t>90_</w:t>
-      </w:r>
-      <w:r>
-        <w:rPr>
-          <w:lang w:val="en-GB"/>
-        </w:rPr>
-        <w:t xml:space="preserve">oa and </w:t>
-      </w:r>
-      <w:r>
-        <w:rPr>
-          <w:rFonts w:ascii="Courier New" w:hAnsi="Courier New" w:cs="Courier New"/>
-          <w:lang w:val="en-GB"/>
-        </w:rPr>
-        <w:t>ocean.F90_oa.</w:t>
-      </w:r>
-      <w:r>
-        <w:rPr>
+          <w:rFonts w:cstheme="minorHAnsi"/>
+          <w:lang w:val="en-GB"/>
+        </w:rPr>
+      </w:pPr>
+      <w:r>
+        <w:rPr>
+          <w:lang w:val="en-GB"/>
+        </w:rPr>
+        <w:t xml:space="preserve">If you need </w:t>
+      </w:r>
+      <w:r>
+        <w:rPr>
+          <w:lang w:val="en-GB"/>
+        </w:rPr>
+        <w:t xml:space="preserve">further </w:t>
+      </w:r>
+      <w:r>
+        <w:rPr>
+          <w:lang w:val="en-GB"/>
+        </w:rPr>
+        <w:t xml:space="preserve">help, do not hesitate to </w:t>
+      </w:r>
+      <w:r>
+        <w:rPr>
+          <w:lang w:val="en-GB"/>
+        </w:rPr>
+        <w:t xml:space="preserve">consult the OER material available at </w:t>
+      </w:r>
+      <w:r>
+        <w:rPr>
+          <w:rFonts w:cstheme="minorHAnsi"/>
+          <w:lang w:val="en-GB"/>
+        </w:rPr>
+        <w:t>https://www.oercommons.org/courseware/lesson/85340</w:t>
+      </w:r>
+      <w:r>
+        <w:rPr>
+          <w:rFonts w:cstheme="minorHAnsi"/>
           <w:lang w:val="en-GB"/>
         </w:rPr>
         <w:t xml:space="preserve"> </w:t>
+      </w:r>
+      <w:r>
+        <w:rPr>
+          <w:rFonts w:cstheme="minorHAnsi"/>
+          <w:lang w:val="en-GB"/>
+        </w:rPr>
+        <w:t>and/or to follow the S</w:t>
+      </w:r>
+      <w:r>
+        <w:rPr>
+          <w:rFonts w:cstheme="minorHAnsi"/>
+          <w:lang w:val="en-GB"/>
+        </w:rPr>
+        <w:t>POC</w:t>
+      </w:r>
+      <w:r>
+        <w:rPr>
+          <w:rFonts w:cstheme="minorHAnsi"/>
+          <w:lang w:val="en-GB"/>
+        </w:rPr>
+        <w:t xml:space="preserve"> on “Code Coupling with OASIS3-MCT” (see </w:t>
+      </w:r>
+      <w:r>
+        <w:rPr>
+          <w:rFonts w:cstheme="minorHAnsi"/>
+          <w:lang w:val="en-GB"/>
+        </w:rPr>
+        <w:t>https://cerfacs.fr/online-training/</w:t>
+      </w:r>
+      <w:r>
+        <w:rPr>
+          <w:rFonts w:cstheme="minorHAnsi"/>
+          <w:lang w:val="en-GB"/>
+        </w:rPr>
+        <w:t>)</w:t>
+      </w:r>
+      <w:r>
+        <w:rPr>
+          <w:rFonts w:cstheme="minorHAnsi"/>
+          <w:lang w:val="en-GB"/>
+        </w:rPr>
+        <w:t>.</w:t>
+      </w:r>
+      <w:r>
+        <w:rPr>
+          <w:rFonts w:cstheme="minorHAnsi"/>
+          <w:lang w:val="en-GB"/>
+        </w:rPr>
+        <w:t xml:space="preserve"> We are also available at oasishelp@cerfacs.fr to answer questions you may have.</w:t>
       </w:r>
     </w:p>
     <w:p>
@@ -4122,90 +4856,26 @@
       </w:pPr>
       <w:r>
         <w:rPr>
-          <w:lang w:val="en-GB"/>
-        </w:rPr>
-        <w:t xml:space="preserve">If you need </w:t>
-      </w:r>
-      <w:r>
-        <w:rPr>
-          <w:lang w:val="en-GB"/>
-        </w:rPr>
-        <w:t xml:space="preserve">further </w:t>
-      </w:r>
-      <w:r>
-        <w:rPr>
-          <w:lang w:val="en-GB"/>
-        </w:rPr>
-        <w:t xml:space="preserve">help, do not hesitate to </w:t>
-      </w:r>
-      <w:r>
-        <w:rPr>
-          <w:lang w:val="en-GB"/>
-        </w:rPr>
-        <w:t xml:space="preserve">consult the OER material available at </w:t>
-      </w:r>
-      <w:r>
-        <w:rPr>
           <w:rFonts w:cstheme="minorHAnsi"/>
           <w:lang w:val="en-GB"/>
         </w:rPr>
-        <w:t>https://www.oercommons.org/courseware/lesson/85340</w:t>
-      </w:r>
+        <w:t>Have fun with OASIS3-</w:t>
+      </w:r>
+      <w:proofErr w:type="gramStart"/>
       <w:r>
         <w:rPr>
           <w:rFonts w:cstheme="minorHAnsi"/>
           <w:lang w:val="en-GB"/>
         </w:rPr>
+        <w:t>MCT !</w:t>
+      </w:r>
+      <w:proofErr w:type="gramEnd"/>
+      <w:r>
+        <w:rPr>
+          <w:rFonts w:cstheme="minorHAnsi"/>
+          <w:lang w:val="en-GB"/>
+        </w:rPr>
         <w:t xml:space="preserve"> </w:t>
-      </w:r>
-      <w:r>
-        <w:rPr>
-          <w:rFonts w:cstheme="minorHAnsi"/>
-          <w:lang w:val="en-GB"/>
-        </w:rPr>
-        <w:t>and/or to follow the S</w:t>
-      </w:r>
-      <w:r>
-        <w:rPr>
-          <w:rFonts w:cstheme="minorHAnsi"/>
-          <w:lang w:val="en-GB"/>
-        </w:rPr>
-        <w:t>POC</w:t>
-      </w:r>
-      <w:r>
-        <w:rPr>
-          <w:rFonts w:cstheme="minorHAnsi"/>
-          <w:lang w:val="en-GB"/>
-        </w:rPr>
-        <w:t xml:space="preserve"> on “Code Coupling with OASIS3-MCT” (see </w:t>
-      </w:r>
-      <w:r>
-        <w:rPr>
-          <w:rFonts w:cstheme="minorHAnsi"/>
-          <w:lang w:val="en-GB"/>
-        </w:rPr>
-        <w:t>https://cerfacs.fr/online-training/</w:t>
-      </w:r>
-      <w:r>
-        <w:rPr>
-          <w:rFonts w:cstheme="minorHAnsi"/>
-          <w:lang w:val="en-GB"/>
-        </w:rPr>
-        <w:t>)</w:t>
-      </w:r>
-      <w:r>
-        <w:rPr>
-          <w:rFonts w:cstheme="minorHAnsi"/>
-          <w:lang w:val="en-GB"/>
-        </w:rPr>
-        <w:t>.</w:t>
-      </w:r>
-      <w:r>
-        <w:rPr>
-          <w:rFonts w:cstheme="minorHAnsi"/>
-          <w:lang w:val="en-GB"/>
-        </w:rPr>
-        <w:t xml:space="preserve"> We are also available at oasishelp@cerfacs.fr to answer questions you may have.</w:t>
       </w:r>
     </w:p>
     <w:p>
@@ -4221,23 +4891,7 @@
           <w:rFonts w:cstheme="minorHAnsi"/>
           <w:lang w:val="en-GB"/>
         </w:rPr>
-        <w:t>Have fun with OASIS3-</w:t>
-      </w:r>
-      <w:proofErr w:type="gramStart"/>
-      <w:r>
-        <w:rPr>
-          <w:rFonts w:cstheme="minorHAnsi"/>
-          <w:lang w:val="en-GB"/>
-        </w:rPr>
-        <w:t>MCT !</w:t>
-      </w:r>
-      <w:proofErr w:type="gramEnd"/>
-      <w:r>
-        <w:rPr>
-          <w:rFonts w:cstheme="minorHAnsi"/>
-          <w:lang w:val="en-GB"/>
-        </w:rPr>
-        <w:t xml:space="preserve"> </w:t>
+        <w:t xml:space="preserve">  The OASIS team</w:t>
       </w:r>
     </w:p>
     <w:sectPr>
@@ -4251,7 +4905,7 @@
 </file>
 
 <file path=word/numbering.xml><?xml version="1.0" encoding="utf-8"?>
-<w:numbering xmlns:wpc="http://schemas.microsoft.com/office/word/2010/wordprocessingCanvas" xmlns:cx="http://schemas.microsoft.com/office/drawing/2014/chartex" xmlns:cx1="http://schemas.microsoft.com/office/drawing/2015/9/8/chartex" xmlns:cx2="http://schemas.microsoft.com/office/drawing/2015/10/21/chartex" xmlns:cx3="http://schemas.microsoft.com/office/drawing/2016/5/9/chartex" xmlns:cx4="http://schemas.microsoft.com/office/drawing/2016/5/10/chartex" xmlns:cx5="http://schemas.microsoft.com/office/drawing/2016/5/11/chartex" xmlns:cx6="http://schemas.microsoft.com/office/drawing/2016/5/12/chartex" xmlns:cx7="http://schemas.microsoft.com/office/drawing/2016/5/13/chartex" xmlns:cx8="http://schemas.microsoft.com/office/drawing/2016/5/14/chartex" xmlns:mc="http://schemas.openxmlformats.org/markup-compatibility/2006" xmlns:aink="http://schemas.microsoft.com/office/drawing/2016/ink" xmlns:am3d="http://schemas.microsoft.com/office/drawing/2017/model3d" xmlns:o="urn:schemas-microsoft-com:office:office" xmlns:r="http://schemas.openxmlformats.org/officeDocument/2006/relationships" xmlns:m="http://schemas.openxmlformats.org/officeDocument/2006/math" xmlns:v="urn:schemas-microsoft-com:vml" xmlns:wp14="http://schemas.microsoft.com/office/word/2010/wordprocessingDrawing" xmlns:wp="http://schemas.openxmlformats.org/drawingml/2006/wordprocessingDrawing" xmlns:w10="urn:schemas-microsoft-com:office:word" xmlns:w="http://schemas.openxmlformats.org/wordprocessingml/2006/main" xmlns:w14="http://schemas.microsoft.com/office/word/2010/wordml" xmlns:w15="http://schemas.microsoft.com/office/word/2012/wordml" xmlns:w16cex="http://schemas.microsoft.com/office/word/2018/wordml/cex" xmlns:w16cid="http://schemas.microsoft.com/office/word/2016/wordml/cid" xmlns:w16="http://schemas.microsoft.com/office/word/2018/wordml" xmlns:w16sdtdh="http://schemas.microsoft.com/office/word/2020/wordml/sdtdatahash" xmlns:w16se="http://schemas.microsoft.com/office/word/2015/wordml/symex" xmlns:wpg="http://schemas.microsoft.com/office/word/2010/wordprocessingGroup" xmlns:wpi="http://schemas.microsoft.com/office/word/2010/wordprocessingInk" xmlns:wne="http://schemas.microsoft.com/office/word/2006/wordml" xmlns:wps="http://schemas.microsoft.com/office/word/2010/wordprocessingShape" mc:Ignorable="w14 w15 w16se w16cid w16 w16cex w16sdtdh wp14">
+<w:numbering xmlns:wpc="http://schemas.microsoft.com/office/word/2010/wordprocessingCanvas" xmlns:cx="http://schemas.microsoft.com/office/drawing/2014/chartex" xmlns:cx1="http://schemas.microsoft.com/office/drawing/2015/9/8/chartex" xmlns:cx2="http://schemas.microsoft.com/office/drawing/2015/10/21/chartex" xmlns:cx3="http://schemas.microsoft.com/office/drawing/2016/5/9/chartex" xmlns:cx4="http://schemas.microsoft.com/office/drawing/2016/5/10/chartex" xmlns:cx5="http://schemas.microsoft.com/office/drawing/2016/5/11/chartex" xmlns:cx6="http://schemas.microsoft.com/office/drawing/2016/5/12/chartex" xmlns:cx7="http://schemas.microsoft.com/office/drawing/2016/5/13/chartex" xmlns:cx8="http://schemas.microsoft.com/office/drawing/2016/5/14/chartex" xmlns:mc="http://schemas.openxmlformats.org/markup-compatibility/2006" xmlns:aink="http://schemas.microsoft.com/office/drawing/2016/ink" xmlns:am3d="http://schemas.microsoft.com/office/drawing/2017/model3d" xmlns:o="urn:schemas-microsoft-com:office:office" xmlns:oel="http://schemas.microsoft.com/office/2019/extlst" xmlns:r="http://schemas.openxmlformats.org/officeDocument/2006/relationships" xmlns:m="http://schemas.openxmlformats.org/officeDocument/2006/math" xmlns:v="urn:schemas-microsoft-com:vml" xmlns:wp14="http://schemas.microsoft.com/office/word/2010/wordprocessingDrawing" xmlns:wp="http://schemas.openxmlformats.org/drawingml/2006/wordprocessingDrawing" xmlns:w10="urn:schemas-microsoft-com:office:word" xmlns:w="http://schemas.openxmlformats.org/wordprocessingml/2006/main" xmlns:w14="http://schemas.microsoft.com/office/word/2010/wordml" xmlns:w15="http://schemas.microsoft.com/office/word/2012/wordml" xmlns:w16cex="http://schemas.microsoft.com/office/word/2018/wordml/cex" xmlns:w16cid="http://schemas.microsoft.com/office/word/2016/wordml/cid" xmlns:w16="http://schemas.microsoft.com/office/word/2018/wordml" xmlns:w16sdtdh="http://schemas.microsoft.com/office/word/2020/wordml/sdtdatahash" xmlns:w16se="http://schemas.microsoft.com/office/word/2015/wordml/symex" xmlns:wpg="http://schemas.microsoft.com/office/word/2010/wordprocessingGroup" xmlns:wpi="http://schemas.microsoft.com/office/word/2010/wordprocessingInk" xmlns:wne="http://schemas.microsoft.com/office/word/2006/wordml" xmlns:wps="http://schemas.microsoft.com/office/word/2010/wordprocessingShape" mc:Ignorable="w14 w15 w16se w16cid w16 w16cex w16sdtdh wp14">
   <w:abstractNum w:abstractNumId="0" w15:restartNumberingAfterBreak="0">
     <w:nsid w:val="00000001"/>
     <w:multiLevelType w:val="singleLevel"/>
@@ -4358,6 +5012,119 @@
     </w:lvl>
   </w:abstractNum>
   <w:abstractNum w:abstractNumId="5" w15:restartNumberingAfterBreak="0">
+    <w:nsid w:val="088A4BB0"/>
+    <w:multiLevelType w:val="hybridMultilevel"/>
+    <w:tmpl w:val="E3FCFDCA"/>
+    <w:lvl w:ilvl="0" w:tplc="08090001">
+      <w:start w:val="1"/>
+      <w:numFmt w:val="bullet"/>
+      <w:lvlText w:val=""/>
+      <w:lvlJc w:val="left"/>
+      <w:pPr>
+        <w:ind w:left="720" w:hanging="360"/>
+      </w:pPr>
+      <w:rPr>
+        <w:rFonts w:ascii="Symbol" w:hAnsi="Symbol" w:hint="default"/>
+      </w:rPr>
+    </w:lvl>
+    <w:lvl w:ilvl="1" w:tplc="08090003" w:tentative="1">
+      <w:start w:val="1"/>
+      <w:numFmt w:val="bullet"/>
+      <w:lvlText w:val="o"/>
+      <w:lvlJc w:val="left"/>
+      <w:pPr>
+        <w:ind w:left="1440" w:hanging="360"/>
+      </w:pPr>
+      <w:rPr>
+        <w:rFonts w:ascii="Courier New" w:hAnsi="Courier New" w:cs="Courier New" w:hint="default"/>
+      </w:rPr>
+    </w:lvl>
+    <w:lvl w:ilvl="2" w:tplc="08090005" w:tentative="1">
+      <w:start w:val="1"/>
+      <w:numFmt w:val="bullet"/>
+      <w:lvlText w:val=""/>
+      <w:lvlJc w:val="left"/>
+      <w:pPr>
+        <w:ind w:left="2160" w:hanging="360"/>
+      </w:pPr>
+      <w:rPr>
+        <w:rFonts w:ascii="Wingdings" w:hAnsi="Wingdings" w:hint="default"/>
+      </w:rPr>
+    </w:lvl>
+    <w:lvl w:ilvl="3" w:tplc="08090001" w:tentative="1">
+      <w:start w:val="1"/>
+      <w:numFmt w:val="bullet"/>
+      <w:lvlText w:val=""/>
+      <w:lvlJc w:val="left"/>
+      <w:pPr>
+        <w:ind w:left="2880" w:hanging="360"/>
+      </w:pPr>
+      <w:rPr>
+        <w:rFonts w:ascii="Symbol" w:hAnsi="Symbol" w:hint="default"/>
+      </w:rPr>
+    </w:lvl>
+    <w:lvl w:ilvl="4" w:tplc="08090003" w:tentative="1">
+      <w:start w:val="1"/>
+      <w:numFmt w:val="bullet"/>
+      <w:lvlText w:val="o"/>
+      <w:lvlJc w:val="left"/>
+      <w:pPr>
+        <w:ind w:left="3600" w:hanging="360"/>
+      </w:pPr>
+      <w:rPr>
+        <w:rFonts w:ascii="Courier New" w:hAnsi="Courier New" w:cs="Courier New" w:hint="default"/>
+      </w:rPr>
+    </w:lvl>
+    <w:lvl w:ilvl="5" w:tplc="08090005" w:tentative="1">
+      <w:start w:val="1"/>
+      <w:numFmt w:val="bullet"/>
+      <w:lvlText w:val=""/>
+      <w:lvlJc w:val="left"/>
+      <w:pPr>
+        <w:ind w:left="4320" w:hanging="360"/>
+      </w:pPr>
+      <w:rPr>
+        <w:rFonts w:ascii="Wingdings" w:hAnsi="Wingdings" w:hint="default"/>
+      </w:rPr>
+    </w:lvl>
+    <w:lvl w:ilvl="6" w:tplc="08090001" w:tentative="1">
+      <w:start w:val="1"/>
+      <w:numFmt w:val="bullet"/>
+      <w:lvlText w:val=""/>
+      <w:lvlJc w:val="left"/>
+      <w:pPr>
+        <w:ind w:left="5040" w:hanging="360"/>
+      </w:pPr>
+      <w:rPr>
+        <w:rFonts w:ascii="Symbol" w:hAnsi="Symbol" w:hint="default"/>
+      </w:rPr>
+    </w:lvl>
+    <w:lvl w:ilvl="7" w:tplc="08090003" w:tentative="1">
+      <w:start w:val="1"/>
+      <w:numFmt w:val="bullet"/>
+      <w:lvlText w:val="o"/>
+      <w:lvlJc w:val="left"/>
+      <w:pPr>
+        <w:ind w:left="5760" w:hanging="360"/>
+      </w:pPr>
+      <w:rPr>
+        <w:rFonts w:ascii="Courier New" w:hAnsi="Courier New" w:cs="Courier New" w:hint="default"/>
+      </w:rPr>
+    </w:lvl>
+    <w:lvl w:ilvl="8" w:tplc="08090005" w:tentative="1">
+      <w:start w:val="1"/>
+      <w:numFmt w:val="bullet"/>
+      <w:lvlText w:val=""/>
+      <w:lvlJc w:val="left"/>
+      <w:pPr>
+        <w:ind w:left="6480" w:hanging="360"/>
+      </w:pPr>
+      <w:rPr>
+        <w:rFonts w:ascii="Wingdings" w:hAnsi="Wingdings" w:hint="default"/>
+      </w:rPr>
+    </w:lvl>
+  </w:abstractNum>
+  <w:abstractNum w:abstractNumId="6" w15:restartNumberingAfterBreak="0">
     <w:nsid w:val="0DF065AA"/>
     <w:multiLevelType w:val="multilevel"/>
     <w:tmpl w:val="D24ADD26"/>
@@ -4506,7 +5273,7 @@
       </w:rPr>
     </w:lvl>
   </w:abstractNum>
-  <w:abstractNum w:abstractNumId="6" w15:restartNumberingAfterBreak="0">
+  <w:abstractNum w:abstractNumId="7" w15:restartNumberingAfterBreak="0">
     <w:nsid w:val="111D3645"/>
     <w:multiLevelType w:val="hybridMultilevel"/>
     <w:tmpl w:val="9B20C756"/>
@@ -4595,7 +5362,7 @@
       </w:pPr>
     </w:lvl>
   </w:abstractNum>
-  <w:abstractNum w:abstractNumId="7" w15:restartNumberingAfterBreak="0">
+  <w:abstractNum w:abstractNumId="8" w15:restartNumberingAfterBreak="0">
     <w:nsid w:val="15F33A6C"/>
     <w:multiLevelType w:val="hybridMultilevel"/>
     <w:tmpl w:val="E34217EA"/>
@@ -4708,7 +5475,7 @@
       </w:rPr>
     </w:lvl>
   </w:abstractNum>
-  <w:abstractNum w:abstractNumId="8" w15:restartNumberingAfterBreak="0">
+  <w:abstractNum w:abstractNumId="9" w15:restartNumberingAfterBreak="0">
     <w:nsid w:val="1656227A"/>
     <w:multiLevelType w:val="hybridMultilevel"/>
     <w:tmpl w:val="CBB20674"/>
@@ -4821,7 +5588,7 @@
       </w:rPr>
     </w:lvl>
   </w:abstractNum>
-  <w:abstractNum w:abstractNumId="9" w15:restartNumberingAfterBreak="0">
+  <w:abstractNum w:abstractNumId="10" w15:restartNumberingAfterBreak="0">
     <w:nsid w:val="16684530"/>
     <w:multiLevelType w:val="multilevel"/>
     <w:tmpl w:val="1B82D26A"/>
@@ -4970,7 +5737,7 @@
       </w:rPr>
     </w:lvl>
   </w:abstractNum>
-  <w:abstractNum w:abstractNumId="10" w15:restartNumberingAfterBreak="0">
+  <w:abstractNum w:abstractNumId="11" w15:restartNumberingAfterBreak="0">
     <w:nsid w:val="1A765829"/>
     <w:multiLevelType w:val="hybridMultilevel"/>
     <w:tmpl w:val="BF7434EC"/>
@@ -5083,7 +5850,7 @@
       </w:rPr>
     </w:lvl>
   </w:abstractNum>
-  <w:abstractNum w:abstractNumId="11" w15:restartNumberingAfterBreak="0">
+  <w:abstractNum w:abstractNumId="12" w15:restartNumberingAfterBreak="0">
     <w:nsid w:val="1DBE3A32"/>
     <w:multiLevelType w:val="multilevel"/>
     <w:tmpl w:val="9F18E2FC"/>
@@ -5232,7 +5999,7 @@
       </w:rPr>
     </w:lvl>
   </w:abstractNum>
-  <w:abstractNum w:abstractNumId="12" w15:restartNumberingAfterBreak="0">
+  <w:abstractNum w:abstractNumId="13" w15:restartNumberingAfterBreak="0">
     <w:nsid w:val="2CAA31AC"/>
     <w:multiLevelType w:val="hybridMultilevel"/>
     <w:tmpl w:val="97787636"/>
@@ -5345,7 +6112,7 @@
       </w:rPr>
     </w:lvl>
   </w:abstractNum>
-  <w:abstractNum w:abstractNumId="13" w15:restartNumberingAfterBreak="0">
+  <w:abstractNum w:abstractNumId="14" w15:restartNumberingAfterBreak="0">
     <w:nsid w:val="340318E1"/>
     <w:multiLevelType w:val="multilevel"/>
     <w:tmpl w:val="2722BE4A"/>
@@ -5494,7 +6261,7 @@
       </w:rPr>
     </w:lvl>
   </w:abstractNum>
-  <w:abstractNum w:abstractNumId="14" w15:restartNumberingAfterBreak="0">
+  <w:abstractNum w:abstractNumId="15" w15:restartNumberingAfterBreak="0">
     <w:nsid w:val="36AD38CC"/>
     <w:multiLevelType w:val="hybridMultilevel"/>
     <w:tmpl w:val="6B588C98"/>
@@ -5585,7 +6352,7 @@
       </w:pPr>
     </w:lvl>
   </w:abstractNum>
-  <w:abstractNum w:abstractNumId="15" w15:restartNumberingAfterBreak="0">
+  <w:abstractNum w:abstractNumId="16" w15:restartNumberingAfterBreak="0">
     <w:nsid w:val="3CEB3554"/>
     <w:multiLevelType w:val="hybridMultilevel"/>
     <w:tmpl w:val="E196ED1E"/>
@@ -5698,7 +6465,7 @@
       </w:rPr>
     </w:lvl>
   </w:abstractNum>
-  <w:abstractNum w:abstractNumId="16" w15:restartNumberingAfterBreak="0">
+  <w:abstractNum w:abstractNumId="17" w15:restartNumberingAfterBreak="0">
     <w:nsid w:val="40497C7F"/>
     <w:multiLevelType w:val="hybridMultilevel"/>
     <w:tmpl w:val="C98A34DC"/>
@@ -5811,7 +6578,7 @@
       </w:rPr>
     </w:lvl>
   </w:abstractNum>
-  <w:abstractNum w:abstractNumId="17" w15:restartNumberingAfterBreak="0">
+  <w:abstractNum w:abstractNumId="18" w15:restartNumberingAfterBreak="0">
     <w:nsid w:val="464F198D"/>
     <w:multiLevelType w:val="hybridMultilevel"/>
     <w:tmpl w:val="D3027DD4"/>
@@ -5924,7 +6691,7 @@
       </w:rPr>
     </w:lvl>
   </w:abstractNum>
-  <w:abstractNum w:abstractNumId="18" w15:restartNumberingAfterBreak="0">
+  <w:abstractNum w:abstractNumId="19" w15:restartNumberingAfterBreak="0">
     <w:nsid w:val="47776925"/>
     <w:multiLevelType w:val="hybridMultilevel"/>
     <w:tmpl w:val="E85C9D88"/>
@@ -6037,7 +6804,7 @@
       </w:rPr>
     </w:lvl>
   </w:abstractNum>
-  <w:abstractNum w:abstractNumId="19" w15:restartNumberingAfterBreak="0">
+  <w:abstractNum w:abstractNumId="20" w15:restartNumberingAfterBreak="0">
     <w:nsid w:val="49D35DED"/>
     <w:multiLevelType w:val="hybridMultilevel"/>
     <w:tmpl w:val="3320CC8A"/>
@@ -6150,7 +6917,7 @@
       </w:rPr>
     </w:lvl>
   </w:abstractNum>
-  <w:abstractNum w:abstractNumId="20" w15:restartNumberingAfterBreak="0">
+  <w:abstractNum w:abstractNumId="21" w15:restartNumberingAfterBreak="0">
     <w:nsid w:val="639F242C"/>
     <w:multiLevelType w:val="hybridMultilevel"/>
     <w:tmpl w:val="E36AE81C"/>
@@ -6263,7 +7030,7 @@
       </w:rPr>
     </w:lvl>
   </w:abstractNum>
-  <w:abstractNum w:abstractNumId="21" w15:restartNumberingAfterBreak="0">
+  <w:abstractNum w:abstractNumId="22" w15:restartNumberingAfterBreak="0">
     <w:nsid w:val="679638F3"/>
     <w:multiLevelType w:val="hybridMultilevel"/>
     <w:tmpl w:val="03CAA362"/>
@@ -6376,7 +7143,7 @@
       </w:rPr>
     </w:lvl>
   </w:abstractNum>
-  <w:abstractNum w:abstractNumId="22" w15:restartNumberingAfterBreak="0">
+  <w:abstractNum w:abstractNumId="23" w15:restartNumberingAfterBreak="0">
     <w:nsid w:val="6A935487"/>
     <w:multiLevelType w:val="multilevel"/>
     <w:tmpl w:val="27D8CDE4"/>
@@ -6525,7 +7292,7 @@
       </w:rPr>
     </w:lvl>
   </w:abstractNum>
-  <w:abstractNum w:abstractNumId="23" w15:restartNumberingAfterBreak="0">
+  <w:abstractNum w:abstractNumId="24" w15:restartNumberingAfterBreak="0">
     <w:nsid w:val="6F763E7F"/>
     <w:multiLevelType w:val="multilevel"/>
     <w:tmpl w:val="871471F6"/>
@@ -6674,7 +7441,7 @@
       </w:rPr>
     </w:lvl>
   </w:abstractNum>
-  <w:abstractNum w:abstractNumId="24" w15:restartNumberingAfterBreak="0">
+  <w:abstractNum w:abstractNumId="25" w15:restartNumberingAfterBreak="0">
     <w:nsid w:val="76C94639"/>
     <w:multiLevelType w:val="hybridMultilevel"/>
     <w:tmpl w:val="8B4C642E"/>
@@ -6787,80 +7554,83 @@
       </w:rPr>
     </w:lvl>
   </w:abstractNum>
-  <w:num w:numId="1">
+  <w:num w:numId="1" w16cid:durableId="1659458312">
+    <w:abstractNumId w:val="15"/>
+  </w:num>
+  <w:num w:numId="2" w16cid:durableId="1092051839">
+    <w:abstractNumId w:val="7"/>
+  </w:num>
+  <w:num w:numId="3" w16cid:durableId="169415194">
+    <w:abstractNumId w:val="16"/>
+  </w:num>
+  <w:num w:numId="4" w16cid:durableId="1199852283">
+    <w:abstractNumId w:val="17"/>
+  </w:num>
+  <w:num w:numId="5" w16cid:durableId="1105156329">
+    <w:abstractNumId w:val="21"/>
+  </w:num>
+  <w:num w:numId="6" w16cid:durableId="1962148388">
+    <w:abstractNumId w:val="9"/>
+  </w:num>
+  <w:num w:numId="7" w16cid:durableId="1892499278">
+    <w:abstractNumId w:val="10"/>
+  </w:num>
+  <w:num w:numId="8" w16cid:durableId="2072653052">
+    <w:abstractNumId w:val="23"/>
+  </w:num>
+  <w:num w:numId="9" w16cid:durableId="1915358194">
+    <w:abstractNumId w:val="22"/>
+  </w:num>
+  <w:num w:numId="10" w16cid:durableId="1171143790">
+    <w:abstractNumId w:val="6"/>
+  </w:num>
+  <w:num w:numId="11" w16cid:durableId="1140344535">
+    <w:abstractNumId w:val="13"/>
+  </w:num>
+  <w:num w:numId="12" w16cid:durableId="1719429227">
+    <w:abstractNumId w:val="19"/>
+  </w:num>
+  <w:num w:numId="13" w16cid:durableId="1408258972">
+    <w:abstractNumId w:val="12"/>
+  </w:num>
+  <w:num w:numId="14" w16cid:durableId="761490888">
+    <w:abstractNumId w:val="20"/>
+  </w:num>
+  <w:num w:numId="15" w16cid:durableId="23142732">
+    <w:abstractNumId w:val="25"/>
+  </w:num>
+  <w:num w:numId="16" w16cid:durableId="528375362">
+    <w:abstractNumId w:val="24"/>
+  </w:num>
+  <w:num w:numId="17" w16cid:durableId="426001961">
     <w:abstractNumId w:val="14"/>
   </w:num>
-  <w:num w:numId="2">
-    <w:abstractNumId w:val="6"/>
-  </w:num>
-  <w:num w:numId="3">
-    <w:abstractNumId w:val="15"/>
-  </w:num>
-  <w:num w:numId="4">
-    <w:abstractNumId w:val="16"/>
-  </w:num>
-  <w:num w:numId="5">
-    <w:abstractNumId w:val="20"/>
-  </w:num>
-  <w:num w:numId="6">
+  <w:num w:numId="18" w16cid:durableId="1025787878">
     <w:abstractNumId w:val="8"/>
   </w:num>
-  <w:num w:numId="7">
-    <w:abstractNumId w:val="9"/>
-  </w:num>
-  <w:num w:numId="8">
-    <w:abstractNumId w:val="22"/>
-  </w:num>
-  <w:num w:numId="9">
-    <w:abstractNumId w:val="21"/>
-  </w:num>
-  <w:num w:numId="10">
-    <w:abstractNumId w:val="5"/>
-  </w:num>
-  <w:num w:numId="11">
-    <w:abstractNumId w:val="12"/>
-  </w:num>
-  <w:num w:numId="12">
+  <w:num w:numId="19" w16cid:durableId="719864718">
     <w:abstractNumId w:val="18"/>
   </w:num>
-  <w:num w:numId="13">
+  <w:num w:numId="20" w16cid:durableId="1056659714">
     <w:abstractNumId w:val="11"/>
   </w:num>
-  <w:num w:numId="14">
-    <w:abstractNumId w:val="19"/>
-  </w:num>
-  <w:num w:numId="15">
-    <w:abstractNumId w:val="24"/>
-  </w:num>
-  <w:num w:numId="16">
-    <w:abstractNumId w:val="23"/>
-  </w:num>
-  <w:num w:numId="17">
-    <w:abstractNumId w:val="13"/>
-  </w:num>
-  <w:num w:numId="18">
-    <w:abstractNumId w:val="7"/>
-  </w:num>
-  <w:num w:numId="19">
-    <w:abstractNumId w:val="17"/>
-  </w:num>
-  <w:num w:numId="20">
-    <w:abstractNumId w:val="10"/>
-  </w:num>
-  <w:num w:numId="21">
+  <w:num w:numId="21" w16cid:durableId="882404869">
     <w:abstractNumId w:val="0"/>
   </w:num>
-  <w:num w:numId="22">
+  <w:num w:numId="22" w16cid:durableId="114643358">
     <w:abstractNumId w:val="1"/>
   </w:num>
-  <w:num w:numId="23">
+  <w:num w:numId="23" w16cid:durableId="2090151665">
     <w:abstractNumId w:val="4"/>
   </w:num>
-  <w:num w:numId="24">
+  <w:num w:numId="24" w16cid:durableId="168525137">
     <w:abstractNumId w:val="2"/>
   </w:num>
-  <w:num w:numId="25">
+  <w:num w:numId="25" w16cid:durableId="928731603">
     <w:abstractNumId w:val="3"/>
+  </w:num>
+  <w:num w:numId="26" w16cid:durableId="814447303">
+    <w:abstractNumId w:val="5"/>
   </w:num>
 </w:numbering>
 </file>

</xml_diff>

<commit_message>
Modified the sentence produced by debug files
Former-commit-id: ce82fcda621e52378e4db2b39133362fb6c5f024
</commit_message>
<xml_diff>
--- a/examples/tutorial_communication/tutorial_communication.docx
+++ b/examples/tutorial_communication/tutorial_communication.docx
@@ -2439,13 +2439,7 @@
         <w:rPr>
           <w:lang w:val="en-GB"/>
         </w:rPr>
-        <w:t xml:space="preserve"> </w:t>
-      </w:r>
-      <w:r>
-        <w:rPr>
-          <w:lang w:val="en-GB"/>
-        </w:rPr>
-        <w:t>two environment variables</w:t>
+        <w:t xml:space="preserve"> two environment variables</w:t>
       </w:r>
       <w:r>
         <w:rPr>
@@ -2644,19 +2638,7 @@
         <w:rPr>
           <w:lang w:val="en-GB"/>
         </w:rPr>
-        <w:t xml:space="preserve"> </w:t>
-      </w:r>
-      <w:r>
-        <w:rPr>
-          <w:lang w:val="en-GB"/>
-        </w:rPr>
-        <w:t xml:space="preserve">OASIS3-MCT itself and </w:t>
-      </w:r>
-      <w:r>
-        <w:rPr>
-          <w:lang w:val="en-GB"/>
-        </w:rPr>
-        <w:t xml:space="preserve">executables </w:t>
+        <w:t xml:space="preserve"> OASIS3-MCT itself and executables </w:t>
       </w:r>
       <w:proofErr w:type="spellStart"/>
       <w:r>
@@ -2905,14 +2887,7 @@
           <w:rFonts w:asciiTheme="minorHAnsi" w:eastAsiaTheme="minorHAnsi" w:hAnsiTheme="minorHAnsi" w:cstheme="minorBidi"/>
           <w:lang w:val="en-GB"/>
         </w:rPr>
-        <w:t xml:space="preserve"> can</w:t>
-      </w:r>
-      <w:r>
-        <w:rPr>
-          <w:rFonts w:asciiTheme="minorHAnsi" w:eastAsiaTheme="minorHAnsi" w:hAnsiTheme="minorHAnsi" w:cstheme="minorBidi"/>
-          <w:lang w:val="en-GB"/>
-        </w:rPr>
-        <w:t xml:space="preserve"> be used to run </w:t>
+        <w:t xml:space="preserve"> can be used to run </w:t>
       </w:r>
       <w:r>
         <w:rPr>
@@ -3682,14 +3657,7 @@
           <w:rFonts w:ascii="Courier New" w:hAnsi="Courier New" w:cs="Courier New"/>
           <w:lang w:val="en-GB"/>
         </w:rPr>
-        <w:t xml:space="preserve"> $</w:t>
-      </w:r>
-      <w:r>
-        <w:rPr>
-          <w:rFonts w:ascii="Courier New" w:hAnsi="Courier New" w:cs="Courier New"/>
-          <w:lang w:val="en-GB"/>
-        </w:rPr>
-        <w:t>USER_</w:t>
+        <w:t xml:space="preserve"> $USER_</w:t>
       </w:r>
       <w:r>
         <w:rPr>
@@ -4169,34 +4137,18 @@
     </w:p>
     <w:p>
       <w:pPr>
-        <w:tabs>
-          <w:tab w:val="left" w:pos="560"/>
-          <w:tab w:val="left" w:pos="1120"/>
-          <w:tab w:val="left" w:pos="1680"/>
-          <w:tab w:val="left" w:pos="2240"/>
-          <w:tab w:val="left" w:pos="2800"/>
-          <w:tab w:val="left" w:pos="3360"/>
-          <w:tab w:val="left" w:pos="3920"/>
-          <w:tab w:val="left" w:pos="4480"/>
-          <w:tab w:val="left" w:pos="5040"/>
-          <w:tab w:val="left" w:pos="5600"/>
-          <w:tab w:val="left" w:pos="6160"/>
-          <w:tab w:val="left" w:pos="6720"/>
-        </w:tabs>
-        <w:autoSpaceDE w:val="0"/>
-        <w:autoSpaceDN w:val="0"/>
-        <w:adjustRightInd w:val="0"/>
-        <w:rPr>
-          <w:rFonts w:ascii="Courier New" w:hAnsi="Courier New" w:cs="Courier New"/>
-          <w:lang w:val="en-GB"/>
-        </w:rPr>
-      </w:pPr>
-      <w:r>
-        <w:rPr>
-          <w:rFonts w:ascii="Courier New" w:hAnsi="Courier New" w:cs="Courier New"/>
-          <w:lang w:val="en-GB"/>
-        </w:rPr>
-        <w:t>(</w:t>
+        <w:jc w:val="both"/>
+        <w:rPr>
+          <w:rFonts w:ascii="Courier New" w:hAnsi="Courier New" w:cs="Courier New"/>
+          <w:lang w:val="en-GB"/>
+        </w:rPr>
+      </w:pPr>
+      <w:r>
+        <w:rPr>
+          <w:rFonts w:ascii="Courier New" w:hAnsi="Courier New" w:cs="Courier New"/>
+          <w:lang w:val="en-GB"/>
+        </w:rPr>
+        <w:t>-- EXIT  (</w:t>
       </w:r>
       <w:proofErr w:type="spellStart"/>
       <w:r>
@@ -4212,52 +4164,11 @@
           <w:rFonts w:ascii="Courier New" w:hAnsi="Courier New" w:cs="Courier New"/>
           <w:lang w:val="en-GB"/>
         </w:rPr>
-        <w:t>) SUCCESSFUL RUN</w:t>
+        <w:t>)</w:t>
       </w:r>
     </w:p>
     <w:p>
       <w:pPr>
-        <w:jc w:val="both"/>
-        <w:rPr>
-          <w:rFonts w:ascii="Courier New" w:hAnsi="Courier New" w:cs="Courier New"/>
-          <w:lang w:val="en-GB"/>
-        </w:rPr>
-      </w:pPr>
-      <w:r>
-        <w:rPr>
-          <w:rFonts w:ascii="Courier New" w:hAnsi="Courier New" w:cs="Courier New"/>
-          <w:lang w:val="en-GB"/>
-        </w:rPr>
-        <w:t xml:space="preserve">-- </w:t>
-      </w:r>
-      <w:proofErr w:type="gramStart"/>
-      <w:r>
-        <w:rPr>
-          <w:rFonts w:ascii="Courier New" w:hAnsi="Courier New" w:cs="Courier New"/>
-          <w:lang w:val="en-GB"/>
-        </w:rPr>
-        <w:t>EXIT  (</w:t>
-      </w:r>
-      <w:proofErr w:type="spellStart"/>
-      <w:proofErr w:type="gramEnd"/>
-      <w:r>
-        <w:rPr>
-          <w:rFonts w:ascii="Courier New" w:hAnsi="Courier New" w:cs="Courier New"/>
-          <w:lang w:val="en-GB"/>
-        </w:rPr>
-        <w:t>oasis_terminate</w:t>
-      </w:r>
-      <w:proofErr w:type="spellEnd"/>
-      <w:r>
-        <w:rPr>
-          <w:rFonts w:ascii="Courier New" w:hAnsi="Courier New" w:cs="Courier New"/>
-          <w:lang w:val="en-GB"/>
-        </w:rPr>
-        <w:t>)</w:t>
-      </w:r>
-    </w:p>
-    <w:p>
-      <w:pPr>
         <w:spacing w:before="120"/>
         <w:jc w:val="both"/>
         <w:rPr>
@@ -4268,19 +4179,7 @@
         <w:rPr>
           <w:lang w:val="en-GB"/>
         </w:rPr>
-        <w:t xml:space="preserve">The </w:t>
-      </w:r>
-      <w:r>
-        <w:rPr>
-          <w:lang w:val="en-GB"/>
-        </w:rPr>
-        <w:t>tutorial coupled model</w:t>
-      </w:r>
-      <w:r>
-        <w:rPr>
-          <w:lang w:val="en-GB"/>
-        </w:rPr>
-        <w:t xml:space="preserve"> can be run on different number</w:t>
+        <w:t>The tutorial coupled model can be run on different number</w:t>
       </w:r>
       <w:r>
         <w:rPr>
@@ -4415,44 +4314,38 @@
         <w:rPr>
           <w:lang w:val="en-GB"/>
         </w:rPr>
+        <w:t xml:space="preserve"> “./</w:t>
+      </w:r>
+      <w:r>
+        <w:rPr>
+          <w:rFonts w:ascii="Courier New" w:hAnsi="Courier New" w:cs="Courier New"/>
+          <w:lang w:val="en-GB"/>
+        </w:rPr>
+        <w:t>oasis_test_</w:t>
+      </w:r>
+      <w:r>
+        <w:rPr>
+          <w:rFonts w:ascii="Courier New" w:hAnsi="Courier New" w:cs="Courier New"/>
+          <w:lang w:val="en-GB"/>
+        </w:rPr>
+        <w:t>run</w:t>
+      </w:r>
+      <w:r>
+        <w:rPr>
+          <w:rFonts w:ascii="Courier New" w:hAnsi="Courier New" w:cs="Courier New"/>
+          <w:lang w:val="en-GB"/>
+        </w:rPr>
+        <w:t>.sh</w:t>
+      </w:r>
+      <w:r>
+        <w:rPr>
+          <w:rFonts w:ascii="Courier New" w:hAnsi="Courier New" w:cs="Courier New"/>
+          <w:lang w:val="en-GB"/>
+        </w:rPr>
         <w:t xml:space="preserve"> </w:t>
       </w:r>
       <w:r>
         <w:rPr>
-          <w:lang w:val="en-GB"/>
-        </w:rPr>
-        <w:t>“./</w:t>
-      </w:r>
-      <w:r>
-        <w:rPr>
-          <w:rFonts w:ascii="Courier New" w:hAnsi="Courier New" w:cs="Courier New"/>
-          <w:lang w:val="en-GB"/>
-        </w:rPr>
-        <w:t>oasis_test_</w:t>
-      </w:r>
-      <w:r>
-        <w:rPr>
-          <w:rFonts w:ascii="Courier New" w:hAnsi="Courier New" w:cs="Courier New"/>
-          <w:lang w:val="en-GB"/>
-        </w:rPr>
-        <w:t>run</w:t>
-      </w:r>
-      <w:r>
-        <w:rPr>
-          <w:rFonts w:ascii="Courier New" w:hAnsi="Courier New" w:cs="Courier New"/>
-          <w:lang w:val="en-GB"/>
-        </w:rPr>
-        <w:t>.sh</w:t>
-      </w:r>
-      <w:r>
-        <w:rPr>
-          <w:rFonts w:ascii="Courier New" w:hAnsi="Courier New" w:cs="Courier New"/>
-          <w:lang w:val="en-GB"/>
-        </w:rPr>
-        <w:t xml:space="preserve"> </w:t>
-      </w:r>
-      <w:r>
-        <w:rPr>
           <w:rFonts w:ascii="Courier New" w:hAnsi="Courier New" w:cs="Courier New"/>
           <w:lang w:val="en-GB"/>
         </w:rPr>
@@ -4463,21 +4356,7 @@
           <w:rFonts w:ascii="Courier New" w:hAnsi="Courier New" w:cs="Courier New"/>
           <w:lang w:val="en-GB"/>
         </w:rPr>
-        <w:t>2</w:t>
-      </w:r>
-      <w:r>
-        <w:rPr>
-          <w:rFonts w:ascii="Courier New" w:hAnsi="Courier New" w:cs="Courier New"/>
-          <w:lang w:val="en-GB"/>
-        </w:rPr>
-        <w:t>”</w:t>
-      </w:r>
-      <w:r>
-        <w:rPr>
-          <w:rFonts w:ascii="Courier New" w:hAnsi="Courier New" w:cs="Courier New"/>
-          <w:lang w:val="en-GB"/>
-        </w:rPr>
-        <w:t xml:space="preserve"> </w:t>
+        <w:t xml:space="preserve">2” </w:t>
       </w:r>
       <w:r>
         <w:rPr>

</xml_diff>